<commit_message>
add new some files
</commit_message>
<xml_diff>
--- a/CV/SAPABAP_Resume.docx
+++ b/CV/SAPABAP_Resume.docx
@@ -5,6 +5,7 @@
     <w:p>
       <w:pPr>
         <w:ind w:left="-709"/>
+        <w:jc w:val="both"/>
         <w:rPr>
           <w:rFonts w:ascii="Times New Roman" w:hAnsi="Times New Roman" w:cs="Times New Roman"/>
         </w:rPr>
@@ -15,6 +16,7 @@
         <w:spacing w:before="100" w:beforeAutospacing="1" w:after="100" w:afterAutospacing="1" w:line="240" w:lineRule="auto"/>
         <w:ind w:left="-794"/>
         <w:contextualSpacing/>
+        <w:jc w:val="both"/>
         <w:rPr>
           <w:rFonts w:ascii="Times New Roman" w:hAnsi="Times New Roman" w:cs="Times New Roman"/>
           <w:b/>
@@ -47,42 +49,36 @@
     <w:p>
       <w:pPr>
         <w:pBdr>
-          <w:bottom w:val="single" w:sz="4" w:space="1" w:color="auto"/>
+          <w:bottom w:val="single" w:sz="4" w:space="0" w:color="auto"/>
         </w:pBdr>
         <w:spacing w:before="100" w:beforeAutospacing="1" w:after="100" w:afterAutospacing="1" w:line="240" w:lineRule="auto"/>
-        <w:ind w:left="-794"/>
+        <w:ind w:left="-794" w:right="-964"/>
         <w:contextualSpacing/>
-        <w:rPr>
-          <w:rFonts w:ascii="Times New Roman" w:hAnsi="Times New Roman" w:cs="Times New Roman"/>
-          <w:sz w:val="24"/>
-          <w:szCs w:val="24"/>
-        </w:rPr>
-      </w:pPr>
-      <w:r>
-        <w:rPr>
-          <w:rFonts w:ascii="Times New Roman" w:hAnsi="Times New Roman" w:cs="Times New Roman"/>
-          <w:sz w:val="24"/>
-          <w:szCs w:val="24"/>
-        </w:rPr>
-        <w:t>SAP ABAP Freshe</w:t>
-      </w:r>
-      <w:r>
-        <w:rPr>
-          <w:rFonts w:ascii="Times New Roman" w:hAnsi="Times New Roman" w:cs="Times New Roman"/>
-          <w:sz w:val="24"/>
-          <w:szCs w:val="24"/>
-        </w:rPr>
-        <w:t>r</w:t>
+        <w:jc w:val="both"/>
+        <w:rPr>
+          <w:rFonts w:ascii="Times New Roman" w:hAnsi="Times New Roman" w:cs="Times New Roman"/>
+          <w:sz w:val="28"/>
+          <w:szCs w:val="28"/>
+        </w:rPr>
+      </w:pPr>
+      <w:r>
+        <w:rPr>
+          <w:rFonts w:ascii="Times New Roman" w:hAnsi="Times New Roman" w:cs="Times New Roman"/>
+          <w:sz w:val="28"/>
+          <w:szCs w:val="28"/>
+        </w:rPr>
+        <w:t>SAP ABAP Fresher</w:t>
       </w:r>
     </w:p>
     <w:p>
       <w:pPr>
         <w:pBdr>
-          <w:bottom w:val="single" w:sz="4" w:space="1" w:color="auto"/>
+          <w:bottom w:val="single" w:sz="4" w:space="0" w:color="auto"/>
         </w:pBdr>
-        <w:spacing w:before="100" w:beforeAutospacing="1" w:after="100" w:afterAutospacing="1" w:line="0" w:lineRule="atLeast"/>
-        <w:ind w:left="-794"/>
+        <w:spacing w:before="100" w:beforeAutospacing="1" w:after="0" w:line="0" w:lineRule="atLeast"/>
+        <w:ind w:left="-794" w:right="-964"/>
         <w:contextualSpacing/>
+        <w:jc w:val="both"/>
         <w:rPr>
           <w:rFonts w:ascii="Times New Roman" w:hAnsi="Times New Roman" w:cs="Times New Roman"/>
           <w:sz w:val="24"/>
@@ -99,20 +95,47 @@
           <w:tab w:val="left" w:pos="6095"/>
           <w:tab w:val="left" w:pos="7189"/>
         </w:tabs>
-        <w:spacing w:before="212" w:line="0" w:lineRule="atLeast"/>
+        <w:spacing w:before="0" w:line="0" w:lineRule="atLeast"/>
         <w:ind w:left="-794" w:right="-113" w:firstLine="16"/>
+        <w:jc w:val="both"/>
+        <w:rPr>
+          <w:rFonts w:ascii="Times New Roman" w:hAnsi="Times New Roman" w:cs="Times New Roman"/>
+          <w:spacing w:val="80"/>
+          <w:position w:val="2"/>
+          <w:sz w:val="20"/>
+        </w:rPr>
+      </w:pPr>
+    </w:p>
+    <w:p>
+      <w:pPr>
+        <w:pStyle w:val="BodyText"/>
+        <w:tabs>
+          <w:tab w:val="left" w:pos="2013"/>
+          <w:tab w:val="left" w:pos="4319"/>
+          <w:tab w:val="left" w:pos="6095"/>
+          <w:tab w:val="left" w:pos="7189"/>
+        </w:tabs>
+        <w:spacing w:before="0" w:line="0" w:lineRule="atLeast"/>
+        <w:ind w:left="-794" w:right="-113" w:firstLine="16"/>
+        <w:jc w:val="both"/>
+        <w:rPr>
+          <w:sz w:val="26"/>
+          <w:szCs w:val="26"/>
+        </w:rPr>
       </w:pPr>
       <w:r>
         <w:rPr>
           <w:rFonts w:ascii="Times New Roman" w:hAnsi="Times New Roman" w:cs="Times New Roman"/>
           <w:noProof/>
+          <w:sz w:val="26"/>
+          <w:szCs w:val="26"/>
         </w:rPr>
         <w:drawing>
           <wp:inline distT="0" distB="0" distL="0" distR="0" wp14:anchorId="4BA64A53" wp14:editId="457E2699">
             <wp:extent cx="119125" cy="93067"/>
             <wp:effectExtent l="0" t="0" r="0" b="0"/>
             <wp:docPr id="1" name="Image 1">
-              <a:hlinkClick xmlns:a="http://schemas.openxmlformats.org/drawingml/2006/main" r:id="rId5"/>
+              <a:hlinkClick xmlns:a="http://schemas.openxmlformats.org/drawingml/2006/main" r:id="rId8"/>
             </wp:docPr>
             <wp:cNvGraphicFramePr>
               <a:graphicFrameLocks xmlns:a="http://schemas.openxmlformats.org/drawingml/2006/main"/>
@@ -122,12 +145,12 @@
                 <pic:pic xmlns:pic="http://schemas.openxmlformats.org/drawingml/2006/picture">
                   <pic:nvPicPr>
                     <pic:cNvPr id="1" name="Image 1">
-                      <a:hlinkClick r:id="rId5"/>
+                      <a:hlinkClick r:id="rId8"/>
                     </pic:cNvPr>
                     <pic:cNvPicPr/>
                   </pic:nvPicPr>
                   <pic:blipFill>
-                    <a:blip r:embed="rId6" cstate="print"/>
+                    <a:blip r:embed="rId9" cstate="print"/>
                     <a:stretch>
                       <a:fillRect/>
                     </a:stretch>
@@ -152,28 +175,44 @@
           <w:rFonts w:ascii="Times New Roman" w:hAnsi="Times New Roman" w:cs="Times New Roman"/>
           <w:spacing w:val="80"/>
           <w:position w:val="2"/>
-          <w:sz w:val="20"/>
+          <w:sz w:val="26"/>
+          <w:szCs w:val="26"/>
         </w:rPr>
         <w:t xml:space="preserve"> </w:t>
       </w:r>
-      <w:hyperlink r:id="rId7" w:history="1">
+      <w:hyperlink r:id="rId10" w:history="1">
         <w:r>
           <w:rPr>
             <w:rStyle w:val="Hyperlink"/>
             <w:rFonts w:ascii="Times New Roman" w:hAnsi="Times New Roman" w:cs="Times New Roman"/>
             <w:position w:val="2"/>
+            <w:sz w:val="26"/>
+            <w:szCs w:val="26"/>
           </w:rPr>
           <w:t>shubham.sapconsultant08@gmail.com</w:t>
         </w:r>
       </w:hyperlink>
       <w:r>
-        <w:t xml:space="preserve">    </w:t>
+        <w:rPr>
+          <w:sz w:val="26"/>
+          <w:szCs w:val="26"/>
+        </w:rPr>
+        <w:t xml:space="preserve"> </w:t>
+      </w:r>
+      <w:r>
+        <w:rPr>
+          <w:sz w:val="26"/>
+          <w:szCs w:val="26"/>
+        </w:rPr>
+        <w:t xml:space="preserve"> </w:t>
       </w:r>
       <w:r>
         <w:rPr>
           <w:rFonts w:ascii="Times New Roman" w:hAnsi="Times New Roman" w:cs="Times New Roman"/>
           <w:noProof/>
           <w:position w:val="-2"/>
+          <w:sz w:val="26"/>
+          <w:szCs w:val="26"/>
         </w:rPr>
         <w:drawing>
           <wp:inline distT="0" distB="0" distL="0" distR="0" wp14:anchorId="139B8A43" wp14:editId="5113D52D">
@@ -191,7 +230,7 @@
                     <pic:cNvPicPr/>
                   </pic:nvPicPr>
                   <pic:blipFill>
-                    <a:blip r:embed="rId8" cstate="print"/>
+                    <a:blip r:embed="rId11" cstate="print"/>
                     <a:stretch>
                       <a:fillRect/>
                     </a:stretch>
@@ -216,6 +255,8 @@
           <w:rFonts w:ascii="Times New Roman" w:hAnsi="Times New Roman" w:cs="Times New Roman"/>
           <w:spacing w:val="40"/>
           <w:position w:val="2"/>
+          <w:sz w:val="26"/>
+          <w:szCs w:val="26"/>
         </w:rPr>
         <w:t xml:space="preserve"> </w:t>
       </w:r>
@@ -223,6 +264,8 @@
         <w:rPr>
           <w:rFonts w:ascii="Times New Roman" w:hAnsi="Times New Roman" w:cs="Times New Roman"/>
           <w:position w:val="2"/>
+          <w:sz w:val="26"/>
+          <w:szCs w:val="26"/>
         </w:rPr>
         <w:t>8530871617</w:t>
       </w:r>
@@ -230,21 +273,43 @@
         <w:rPr>
           <w:rFonts w:ascii="Times New Roman" w:hAnsi="Times New Roman" w:cs="Times New Roman"/>
           <w:position w:val="2"/>
-        </w:rPr>
-        <w:t xml:space="preserve">    </w:t>
+          <w:sz w:val="26"/>
+          <w:szCs w:val="26"/>
+        </w:rPr>
+        <w:t xml:space="preserve"> </w:t>
+      </w:r>
+      <w:r>
+        <w:rPr>
+          <w:rFonts w:ascii="Times New Roman" w:hAnsi="Times New Roman" w:cs="Times New Roman"/>
+          <w:position w:val="2"/>
+          <w:sz w:val="26"/>
+          <w:szCs w:val="26"/>
+        </w:rPr>
+        <w:t xml:space="preserve"> </w:t>
+      </w:r>
+      <w:r>
+        <w:rPr>
+          <w:rFonts w:ascii="Times New Roman" w:hAnsi="Times New Roman" w:cs="Times New Roman"/>
+          <w:position w:val="2"/>
+          <w:sz w:val="26"/>
+          <w:szCs w:val="26"/>
+        </w:rPr>
+        <w:t xml:space="preserve"> </w:t>
       </w:r>
       <w:r>
         <w:rPr>
           <w:rFonts w:ascii="Times New Roman" w:hAnsi="Times New Roman" w:cs="Times New Roman"/>
           <w:noProof/>
           <w:position w:val="-3"/>
+          <w:sz w:val="26"/>
+          <w:szCs w:val="26"/>
         </w:rPr>
         <w:drawing>
           <wp:inline distT="0" distB="0" distL="0" distR="0" wp14:anchorId="00E5F8F7" wp14:editId="118CD880">
             <wp:extent cx="139600" cy="139600"/>
             <wp:effectExtent l="0" t="0" r="0" b="0"/>
             <wp:docPr id="4" name="Image 4">
-              <a:hlinkClick xmlns:a="http://schemas.openxmlformats.org/drawingml/2006/main" r:id="rId9"/>
+              <a:hlinkClick xmlns:a="http://schemas.openxmlformats.org/drawingml/2006/main" r:id="rId12"/>
             </wp:docPr>
             <wp:cNvGraphicFramePr>
               <a:graphicFrameLocks xmlns:a="http://schemas.openxmlformats.org/drawingml/2006/main"/>
@@ -254,12 +319,12 @@
                 <pic:pic xmlns:pic="http://schemas.openxmlformats.org/drawingml/2006/picture">
                   <pic:nvPicPr>
                     <pic:cNvPr id="4" name="Image 4">
-                      <a:hlinkClick r:id="rId9"/>
+                      <a:hlinkClick r:id="rId12"/>
                     </pic:cNvPr>
                     <pic:cNvPicPr/>
                   </pic:nvPicPr>
                   <pic:blipFill>
-                    <a:blip r:embed="rId10" cstate="print"/>
+                    <a:blip r:embed="rId13" cstate="print"/>
                     <a:stretch>
                       <a:fillRect/>
                     </a:stretch>
@@ -284,14 +349,18 @@
           <w:rFonts w:ascii="Times New Roman" w:hAnsi="Times New Roman" w:cs="Times New Roman"/>
           <w:spacing w:val="30"/>
           <w:position w:val="2"/>
+          <w:sz w:val="26"/>
+          <w:szCs w:val="26"/>
         </w:rPr>
         <w:t xml:space="preserve"> </w:t>
       </w:r>
-      <w:hyperlink r:id="rId11">
+      <w:hyperlink r:id="rId14">
         <w:r>
           <w:rPr>
             <w:rFonts w:ascii="Times New Roman" w:hAnsi="Times New Roman" w:cs="Times New Roman"/>
             <w:position w:val="2"/>
+            <w:sz w:val="26"/>
+            <w:szCs w:val="26"/>
           </w:rPr>
           <w:t>surl.li/jpntjr</w:t>
         </w:r>
@@ -300,21 +369,25 @@
         <w:rPr>
           <w:rFonts w:ascii="Times New Roman" w:hAnsi="Times New Roman" w:cs="Times New Roman"/>
           <w:position w:val="2"/>
-        </w:rPr>
-        <w:t xml:space="preserve">    </w:t>
+          <w:sz w:val="26"/>
+          <w:szCs w:val="26"/>
+        </w:rPr>
+        <w:t xml:space="preserve">  </w:t>
       </w:r>
       <w:r>
         <w:rPr>
           <w:rFonts w:ascii="Times New Roman" w:hAnsi="Times New Roman" w:cs="Times New Roman"/>
           <w:noProof/>
           <w:position w:val="-4"/>
+          <w:sz w:val="26"/>
+          <w:szCs w:val="26"/>
         </w:rPr>
         <w:drawing>
           <wp:inline distT="0" distB="0" distL="0" distR="0" wp14:anchorId="635A65E4" wp14:editId="1E03B46F">
             <wp:extent cx="139600" cy="136628"/>
             <wp:effectExtent l="0" t="0" r="0" b="0"/>
             <wp:docPr id="5" name="Image 5">
-              <a:hlinkClick xmlns:a="http://schemas.openxmlformats.org/drawingml/2006/main" r:id="rId12"/>
+              <a:hlinkClick xmlns:a="http://schemas.openxmlformats.org/drawingml/2006/main" r:id="rId15"/>
             </wp:docPr>
             <wp:cNvGraphicFramePr>
               <a:graphicFrameLocks xmlns:a="http://schemas.openxmlformats.org/drawingml/2006/main"/>
@@ -324,12 +397,12 @@
                 <pic:pic xmlns:pic="http://schemas.openxmlformats.org/drawingml/2006/picture">
                   <pic:nvPicPr>
                     <pic:cNvPr id="5" name="Image 5">
-                      <a:hlinkClick r:id="rId12"/>
+                      <a:hlinkClick r:id="rId15"/>
                     </pic:cNvPr>
                     <pic:cNvPicPr/>
                   </pic:nvPicPr>
                   <pic:blipFill>
-                    <a:blip r:embed="rId13" cstate="print"/>
+                    <a:blip r:embed="rId16" cstate="print"/>
                     <a:stretch>
                       <a:fillRect/>
                     </a:stretch>
@@ -353,31 +426,44 @@
         <w:rPr>
           <w:rFonts w:ascii="Times New Roman" w:hAnsi="Times New Roman" w:cs="Times New Roman"/>
           <w:position w:val="2"/>
+          <w:sz w:val="26"/>
+          <w:szCs w:val="26"/>
         </w:rPr>
         <w:t xml:space="preserve"> </w:t>
       </w:r>
-      <w:hyperlink r:id="rId14">
+      <w:r>
+        <w:rPr>
+          <w:rFonts w:ascii="Times New Roman" w:hAnsi="Times New Roman" w:cs="Times New Roman"/>
+          <w:position w:val="2"/>
+          <w:sz w:val="26"/>
+          <w:szCs w:val="26"/>
+        </w:rPr>
+        <w:t xml:space="preserve"> </w:t>
+      </w:r>
+      <w:hyperlink r:id="rId17">
         <w:r>
           <w:rPr>
             <w:rFonts w:ascii="Times New Roman" w:hAnsi="Times New Roman" w:cs="Times New Roman"/>
+            <w:sz w:val="26"/>
+            <w:szCs w:val="26"/>
           </w:rPr>
-          <w:t>surl.li</w:t>
+          <w:t>surl.li/</w:t>
         </w:r>
+        <w:proofErr w:type="spellStart"/>
         <w:r>
           <w:rPr>
             <w:rFonts w:ascii="Times New Roman" w:hAnsi="Times New Roman" w:cs="Times New Roman"/>
+            <w:sz w:val="26"/>
+            <w:szCs w:val="26"/>
           </w:rPr>
-          <w:t>/</w:t>
+          <w:t>myxnxv</w:t>
         </w:r>
+        <w:proofErr w:type="spellEnd"/>
         <w:r>
           <w:rPr>
             <w:rFonts w:ascii="Times New Roman" w:hAnsi="Times New Roman" w:cs="Times New Roman"/>
-          </w:rPr>
-          <w:t>myxnxv</w:t>
-        </w:r>
-        <w:r>
-          <w:rPr>
-            <w:rFonts w:ascii="Times New Roman" w:hAnsi="Times New Roman" w:cs="Times New Roman"/>
+            <w:sz w:val="26"/>
+            <w:szCs w:val="26"/>
           </w:rPr>
           <w:t xml:space="preserve"> </w:t>
         </w:r>
@@ -385,6 +471,8 @@
           <w:rPr>
             <w:rFonts w:ascii="Times New Roman" w:hAnsi="Times New Roman" w:cs="Times New Roman"/>
             <w:spacing w:val="40"/>
+            <w:sz w:val="26"/>
+            <w:szCs w:val="26"/>
           </w:rPr>
           <w:t xml:space="preserve"> </w:t>
         </w:r>
@@ -392,7 +480,99 @@
     </w:p>
     <w:p>
       <w:pPr>
+        <w:pStyle w:val="BodyText"/>
+        <w:tabs>
+          <w:tab w:val="left" w:pos="2013"/>
+          <w:tab w:val="left" w:pos="4319"/>
+          <w:tab w:val="left" w:pos="6095"/>
+          <w:tab w:val="left" w:pos="7189"/>
+        </w:tabs>
+        <w:spacing w:before="0" w:line="0" w:lineRule="atLeast"/>
+        <w:ind w:left="-794" w:right="-113" w:firstLine="16"/>
+        <w:jc w:val="both"/>
+      </w:pPr>
+    </w:p>
+    <w:p>
+      <w:pPr>
+        <w:spacing w:after="0"/>
+        <w:ind w:left="-794" w:right="-794"/>
+        <w:jc w:val="both"/>
+        <w:rPr>
+          <w:rFonts w:ascii="Times New Roman" w:hAnsi="Times New Roman" w:cs="Times New Roman"/>
+          <w:b/>
+          <w:bCs/>
+          <w:sz w:val="30"/>
+          <w:szCs w:val="30"/>
+        </w:rPr>
+      </w:pPr>
+      <w:r>
+        <w:rPr>
+          <w:rFonts w:ascii="Times New Roman" w:hAnsi="Times New Roman" w:cs="Times New Roman"/>
+          <w:b/>
+          <w:bCs/>
+          <w:sz w:val="30"/>
+          <w:szCs w:val="30"/>
+        </w:rPr>
+        <w:t>CAREER OBJECTIVE</w:t>
+      </w:r>
+    </w:p>
+    <w:p>
+      <w:pPr>
+        <w:spacing w:after="0"/>
+        <w:ind w:left="-794" w:right="-794"/>
+        <w:jc w:val="both"/>
+        <w:rPr>
+          <w:rFonts w:ascii="Times New Roman" w:hAnsi="Times New Roman" w:cs="Times New Roman"/>
+          <w:sz w:val="28"/>
+          <w:szCs w:val="28"/>
+        </w:rPr>
+      </w:pPr>
+      <w:r>
+        <w:rPr>
+          <w:rFonts w:ascii="Times New Roman" w:hAnsi="Times New Roman" w:cs="Times New Roman"/>
+          <w:sz w:val="28"/>
+          <w:szCs w:val="28"/>
+        </w:rPr>
+        <w:t xml:space="preserve">Aspiring SAP ABAP Developer with a strong foundation in ABAP programming and a keen interest </w:t>
+      </w:r>
+      <w:r>
+        <w:rPr>
+          <w:rFonts w:ascii="Times New Roman" w:hAnsi="Times New Roman" w:cs="Times New Roman"/>
+          <w:sz w:val="28"/>
+          <w:szCs w:val="28"/>
+        </w:rPr>
+        <w:t xml:space="preserve">  </w:t>
+      </w:r>
+      <w:r>
+        <w:rPr>
+          <w:rFonts w:ascii="Times New Roman" w:hAnsi="Times New Roman" w:cs="Times New Roman"/>
+          <w:sz w:val="28"/>
+          <w:szCs w:val="28"/>
+        </w:rPr>
+        <w:t>in SAP</w:t>
+      </w:r>
+      <w:r>
+        <w:rPr>
+          <w:rFonts w:ascii="Times New Roman" w:hAnsi="Times New Roman" w:cs="Times New Roman"/>
+          <w:sz w:val="28"/>
+          <w:szCs w:val="28"/>
+        </w:rPr>
+        <w:t xml:space="preserve"> </w:t>
+      </w:r>
+      <w:r>
+        <w:rPr>
+          <w:rFonts w:ascii="Times New Roman" w:hAnsi="Times New Roman" w:cs="Times New Roman"/>
+          <w:sz w:val="28"/>
+          <w:szCs w:val="28"/>
+        </w:rPr>
+        <w:t>application development with SAP tools. Seeking an opportunity to enhance my technical skills, contribute to business solutions, and build a successful career in the SAP ecosystem.</w:t>
+      </w:r>
+    </w:p>
+    <w:p>
+      <w:pPr>
+        <w:spacing w:after="0"/>
         <w:ind w:left="-794"/>
+        <w:jc w:val="both"/>
         <w:rPr>
           <w:rFonts w:ascii="Times New Roman" w:hAnsi="Times New Roman" w:cs="Times New Roman"/>
           <w:sz w:val="24"/>
@@ -404,12 +584,13 @@
       <w:pPr>
         <w:spacing w:after="0"/>
         <w:ind w:left="-794" w:right="-794"/>
+        <w:jc w:val="both"/>
         <w:rPr>
           <w:rFonts w:ascii="Times New Roman" w:hAnsi="Times New Roman" w:cs="Times New Roman"/>
           <w:b/>
           <w:bCs/>
-          <w:sz w:val="28"/>
-          <w:szCs w:val="28"/>
+          <w:sz w:val="30"/>
+          <w:szCs w:val="30"/>
         </w:rPr>
       </w:pPr>
       <w:r>
@@ -417,87 +598,167 @@
           <w:rFonts w:ascii="Times New Roman" w:hAnsi="Times New Roman" w:cs="Times New Roman"/>
           <w:b/>
           <w:bCs/>
-          <w:sz w:val="28"/>
-          <w:szCs w:val="28"/>
-        </w:rPr>
-        <w:t>CAREER OBJECTIVE</w:t>
+          <w:sz w:val="30"/>
+          <w:szCs w:val="30"/>
+        </w:rPr>
+        <w:t>EDUCATION</w:t>
+      </w:r>
+    </w:p>
+    <w:p>
+      <w:pPr>
+        <w:spacing w:after="0"/>
+        <w:ind w:left="-794" w:right="-1304"/>
+        <w:jc w:val="both"/>
+        <w:rPr>
+          <w:rFonts w:ascii="Times New Roman" w:hAnsi="Times New Roman" w:cs="Times New Roman"/>
+          <w:sz w:val="28"/>
+          <w:szCs w:val="28"/>
+        </w:rPr>
+      </w:pPr>
+      <w:r>
+        <w:rPr>
+          <w:rFonts w:ascii="Times New Roman" w:hAnsi="Times New Roman" w:cs="Times New Roman"/>
+          <w:sz w:val="28"/>
+          <w:szCs w:val="28"/>
+        </w:rPr>
+        <w:t xml:space="preserve"> </w:t>
+      </w:r>
+      <w:r>
+        <w:rPr>
+          <w:rFonts w:ascii="Times New Roman" w:hAnsi="Times New Roman" w:cs="Times New Roman"/>
+          <w:sz w:val="28"/>
+          <w:szCs w:val="28"/>
+        </w:rPr>
+        <w:t>Bachelor Of Computer A</w:t>
+      </w:r>
+      <w:r>
+        <w:rPr>
+          <w:rFonts w:ascii="Times New Roman" w:hAnsi="Times New Roman" w:cs="Times New Roman"/>
+          <w:sz w:val="28"/>
+          <w:szCs w:val="28"/>
+        </w:rPr>
+        <w:t>pplication | 8.7 CGPA</w:t>
+      </w:r>
+      <w:r>
+        <w:rPr>
+          <w:rFonts w:ascii="Times New Roman" w:hAnsi="Times New Roman" w:cs="Times New Roman"/>
+          <w:sz w:val="28"/>
+          <w:szCs w:val="28"/>
+        </w:rPr>
+        <w:t xml:space="preserve">     </w:t>
+      </w:r>
+      <w:r>
+        <w:rPr>
+          <w:rFonts w:ascii="Times New Roman" w:hAnsi="Times New Roman" w:cs="Times New Roman"/>
+          <w:sz w:val="28"/>
+          <w:szCs w:val="28"/>
+        </w:rPr>
+        <w:tab/>
+      </w:r>
+      <w:r>
+        <w:rPr>
+          <w:rFonts w:ascii="Times New Roman" w:hAnsi="Times New Roman" w:cs="Times New Roman"/>
+          <w:sz w:val="28"/>
+          <w:szCs w:val="28"/>
+        </w:rPr>
+        <w:tab/>
+      </w:r>
+      <w:r>
+        <w:rPr>
+          <w:rFonts w:ascii="Times New Roman" w:hAnsi="Times New Roman" w:cs="Times New Roman"/>
+          <w:sz w:val="28"/>
+          <w:szCs w:val="28"/>
+        </w:rPr>
+        <w:tab/>
+      </w:r>
+      <w:r>
+        <w:rPr>
+          <w:rFonts w:ascii="Times New Roman" w:hAnsi="Times New Roman" w:cs="Times New Roman"/>
+          <w:sz w:val="28"/>
+          <w:szCs w:val="28"/>
+        </w:rPr>
+        <w:tab/>
+      </w:r>
+      <w:r>
+        <w:rPr>
+          <w:rFonts w:ascii="Times New Roman" w:hAnsi="Times New Roman" w:cs="Times New Roman"/>
+          <w:sz w:val="28"/>
+          <w:szCs w:val="28"/>
+        </w:rPr>
+        <w:tab/>
+      </w:r>
+      <w:r>
+        <w:rPr>
+          <w:rFonts w:ascii="Times New Roman" w:hAnsi="Times New Roman" w:cs="Times New Roman"/>
+          <w:sz w:val="28"/>
+          <w:szCs w:val="28"/>
+        </w:rPr>
+        <w:t xml:space="preserve">        </w:t>
+      </w:r>
+      <w:r>
+        <w:rPr>
+          <w:rFonts w:ascii="Times New Roman" w:hAnsi="Times New Roman" w:cs="Times New Roman"/>
+          <w:sz w:val="28"/>
+          <w:szCs w:val="28"/>
+        </w:rPr>
+        <w:t xml:space="preserve">     </w:t>
+      </w:r>
+      <w:r>
+        <w:rPr>
+          <w:rFonts w:ascii="Times New Roman" w:hAnsi="Times New Roman" w:cs="Times New Roman"/>
+          <w:sz w:val="28"/>
+          <w:szCs w:val="28"/>
+        </w:rPr>
+        <w:t>2022 - 2025</w:t>
       </w:r>
     </w:p>
     <w:p>
       <w:pPr>
         <w:spacing w:after="0"/>
         <w:ind w:left="-794" w:right="-794"/>
-        <w:rPr>
-          <w:rFonts w:ascii="Times New Roman" w:hAnsi="Times New Roman" w:cs="Times New Roman"/>
-          <w:sz w:val="24"/>
-          <w:szCs w:val="24"/>
-        </w:rPr>
-      </w:pPr>
-      <w:r>
-        <w:rPr>
-          <w:rFonts w:ascii="Times New Roman" w:hAnsi="Times New Roman" w:cs="Times New Roman"/>
-          <w:sz w:val="24"/>
-          <w:szCs w:val="24"/>
-        </w:rPr>
-        <w:t xml:space="preserve">Aspiring SAP ABAP Developer with a strong foundation in ABAP programming and a keen interest </w:t>
-      </w:r>
-      <w:r>
-        <w:rPr>
-          <w:rFonts w:ascii="Times New Roman" w:hAnsi="Times New Roman" w:cs="Times New Roman"/>
-          <w:sz w:val="24"/>
-          <w:szCs w:val="24"/>
-        </w:rPr>
-        <w:t xml:space="preserve">  </w:t>
-      </w:r>
-      <w:r>
-        <w:rPr>
-          <w:rFonts w:ascii="Times New Roman" w:hAnsi="Times New Roman" w:cs="Times New Roman"/>
-          <w:sz w:val="24"/>
-          <w:szCs w:val="24"/>
-        </w:rPr>
-        <w:t xml:space="preserve">in SAP </w:t>
-      </w:r>
-      <w:r>
-        <w:rPr>
-          <w:rFonts w:ascii="Times New Roman" w:hAnsi="Times New Roman" w:cs="Times New Roman"/>
-          <w:sz w:val="24"/>
-          <w:szCs w:val="24"/>
-        </w:rPr>
-        <w:t xml:space="preserve">  </w:t>
-      </w:r>
-      <w:r>
-        <w:rPr>
-          <w:rFonts w:ascii="Times New Roman" w:hAnsi="Times New Roman" w:cs="Times New Roman"/>
-          <w:sz w:val="24"/>
-          <w:szCs w:val="24"/>
-        </w:rPr>
-        <w:t>application development</w:t>
-      </w:r>
-      <w:r>
-        <w:rPr>
-          <w:rFonts w:ascii="Times New Roman" w:hAnsi="Times New Roman" w:cs="Times New Roman"/>
-          <w:sz w:val="24"/>
-          <w:szCs w:val="24"/>
-        </w:rPr>
-        <w:t xml:space="preserve"> with SAP tools</w:t>
-      </w:r>
-      <w:r>
-        <w:rPr>
-          <w:rFonts w:ascii="Times New Roman" w:hAnsi="Times New Roman" w:cs="Times New Roman"/>
-          <w:sz w:val="24"/>
-          <w:szCs w:val="24"/>
-        </w:rPr>
-        <w:t>. Seeking an opportunity to enhance my technical skills, contribute to business solutions, and build a successful career in the SAP ecosystem.</w:t>
-      </w:r>
+        <w:jc w:val="both"/>
+        <w:rPr>
+          <w:rFonts w:ascii="Times New Roman" w:hAnsi="Times New Roman" w:cs="Times New Roman"/>
+          <w:sz w:val="28"/>
+          <w:szCs w:val="28"/>
+        </w:rPr>
+      </w:pPr>
+      <w:r>
+        <w:rPr>
+          <w:rFonts w:ascii="Times New Roman" w:hAnsi="Times New Roman" w:cs="Times New Roman"/>
+          <w:sz w:val="28"/>
+          <w:szCs w:val="28"/>
+        </w:rPr>
+        <w:t xml:space="preserve"> </w:t>
+      </w:r>
+      <w:r>
+        <w:rPr>
+          <w:rFonts w:ascii="Times New Roman" w:hAnsi="Times New Roman" w:cs="Times New Roman"/>
+          <w:sz w:val="28"/>
+          <w:szCs w:val="28"/>
+        </w:rPr>
+        <w:t>Ch. Shivaji University, Kolhapur</w:t>
+      </w:r>
+    </w:p>
+    <w:p>
+      <w:pPr>
+        <w:spacing w:after="0"/>
+        <w:ind w:left="-794" w:right="-794"/>
+        <w:jc w:val="both"/>
+        <w:rPr>
+          <w:rFonts w:ascii="Times New Roman" w:hAnsi="Times New Roman" w:cs="Times New Roman"/>
+          <w:sz w:val="28"/>
+          <w:szCs w:val="28"/>
+        </w:rPr>
+      </w:pPr>
     </w:p>
     <w:p>
       <w:pPr>
         <w:spacing w:after="0"/>
         <w:ind w:left="-794"/>
-        <w:rPr>
-          <w:rFonts w:ascii="Times New Roman" w:hAnsi="Times New Roman" w:cs="Times New Roman"/>
-          <w:sz w:val="24"/>
-          <w:szCs w:val="24"/>
+        <w:jc w:val="both"/>
+        <w:rPr>
+          <w:rFonts w:ascii="Times New Roman" w:hAnsi="Times New Roman" w:cs="Times New Roman"/>
         </w:rPr>
       </w:pPr>
     </w:p>
@@ -505,12 +766,13 @@
       <w:pPr>
         <w:spacing w:after="0"/>
         <w:ind w:left="-794" w:right="-794"/>
+        <w:jc w:val="both"/>
         <w:rPr>
           <w:rFonts w:ascii="Times New Roman" w:hAnsi="Times New Roman" w:cs="Times New Roman"/>
           <w:b/>
           <w:bCs/>
-          <w:sz w:val="28"/>
-          <w:szCs w:val="28"/>
+          <w:sz w:val="30"/>
+          <w:szCs w:val="30"/>
         </w:rPr>
       </w:pPr>
       <w:r>
@@ -518,247 +780,86 @@
           <w:rFonts w:ascii="Times New Roman" w:hAnsi="Times New Roman" w:cs="Times New Roman"/>
           <w:b/>
           <w:bCs/>
-          <w:sz w:val="28"/>
-          <w:szCs w:val="28"/>
-        </w:rPr>
-        <w:t>EDUCATION</w:t>
+          <w:sz w:val="30"/>
+          <w:szCs w:val="30"/>
+        </w:rPr>
+        <w:t>COURSE &amp; CERTIFICATIONS</w:t>
       </w:r>
     </w:p>
     <w:p>
       <w:pPr>
         <w:spacing w:after="0"/>
-        <w:ind w:left="-794" w:right="-794"/>
-        <w:rPr>
-          <w:rFonts w:ascii="Times New Roman" w:hAnsi="Times New Roman" w:cs="Times New Roman"/>
-          <w:sz w:val="24"/>
-          <w:szCs w:val="24"/>
-        </w:rPr>
-      </w:pPr>
-      <w:r>
-        <w:rPr>
-          <w:rFonts w:ascii="Times New Roman" w:hAnsi="Times New Roman" w:cs="Times New Roman"/>
-          <w:sz w:val="24"/>
-          <w:szCs w:val="24"/>
-        </w:rPr>
-        <w:t xml:space="preserve"> </w:t>
-      </w:r>
-      <w:r>
-        <w:rPr>
-          <w:rFonts w:ascii="Times New Roman" w:hAnsi="Times New Roman" w:cs="Times New Roman"/>
-          <w:sz w:val="24"/>
-          <w:szCs w:val="24"/>
-        </w:rPr>
-        <w:t>Bachelor Of Computer A</w:t>
-      </w:r>
-      <w:r>
-        <w:rPr>
-          <w:rFonts w:ascii="Times New Roman" w:hAnsi="Times New Roman" w:cs="Times New Roman"/>
-          <w:sz w:val="24"/>
-          <w:szCs w:val="24"/>
-        </w:rPr>
-        <w:t>pplication | 8.7 CGPA</w:t>
-      </w:r>
-      <w:r>
-        <w:rPr>
-          <w:rFonts w:ascii="Times New Roman" w:hAnsi="Times New Roman" w:cs="Times New Roman"/>
-          <w:sz w:val="24"/>
-          <w:szCs w:val="24"/>
+        <w:ind w:left="-794" w:right="-1304"/>
+        <w:jc w:val="both"/>
+        <w:rPr>
+          <w:rFonts w:ascii="Times New Roman" w:hAnsi="Times New Roman" w:cs="Times New Roman"/>
+          <w:sz w:val="28"/>
+          <w:szCs w:val="28"/>
+        </w:rPr>
+      </w:pPr>
+      <w:r>
+        <w:rPr>
+          <w:rFonts w:ascii="Times New Roman" w:hAnsi="Times New Roman" w:cs="Times New Roman"/>
+          <w:sz w:val="28"/>
+          <w:szCs w:val="28"/>
+        </w:rPr>
+        <w:t xml:space="preserve"> SAP ABAP Certification | </w:t>
+      </w:r>
+      <w:r>
+        <w:rPr>
+          <w:rFonts w:ascii="Times New Roman" w:hAnsi="Times New Roman" w:cs="Times New Roman"/>
+          <w:sz w:val="28"/>
+          <w:szCs w:val="28"/>
+        </w:rPr>
+        <w:t>Pacematic Corporate Training Center</w:t>
+      </w:r>
+      <w:r>
+        <w:rPr>
+          <w:rFonts w:ascii="Times New Roman" w:hAnsi="Times New Roman" w:cs="Times New Roman"/>
+          <w:sz w:val="28"/>
+          <w:szCs w:val="28"/>
+        </w:rPr>
+        <w:t xml:space="preserve">, Pune </w:t>
+      </w:r>
+      <w:r>
+        <w:rPr>
+          <w:rFonts w:ascii="Times New Roman" w:hAnsi="Times New Roman" w:cs="Times New Roman"/>
+          <w:sz w:val="28"/>
+          <w:szCs w:val="28"/>
+        </w:rPr>
+        <w:tab/>
+      </w:r>
+      <w:r>
+        <w:rPr>
+          <w:rFonts w:ascii="Times New Roman" w:hAnsi="Times New Roman" w:cs="Times New Roman"/>
+          <w:sz w:val="28"/>
+          <w:szCs w:val="28"/>
+        </w:rPr>
+        <w:tab/>
+      </w:r>
+      <w:r>
+        <w:rPr>
+          <w:rFonts w:ascii="Times New Roman" w:hAnsi="Times New Roman" w:cs="Times New Roman"/>
+          <w:sz w:val="28"/>
+          <w:szCs w:val="28"/>
         </w:rPr>
         <w:t xml:space="preserve">     </w:t>
       </w:r>
       <w:r>
         <w:rPr>
           <w:rFonts w:ascii="Times New Roman" w:hAnsi="Times New Roman" w:cs="Times New Roman"/>
-          <w:sz w:val="24"/>
-          <w:szCs w:val="24"/>
-        </w:rPr>
-        <w:tab/>
-      </w:r>
-      <w:r>
-        <w:rPr>
-          <w:rFonts w:ascii="Times New Roman" w:hAnsi="Times New Roman" w:cs="Times New Roman"/>
-          <w:sz w:val="24"/>
-          <w:szCs w:val="24"/>
-        </w:rPr>
-        <w:tab/>
-      </w:r>
-      <w:r>
-        <w:rPr>
-          <w:rFonts w:ascii="Times New Roman" w:hAnsi="Times New Roman" w:cs="Times New Roman"/>
-          <w:sz w:val="24"/>
-          <w:szCs w:val="24"/>
-        </w:rPr>
-        <w:tab/>
-      </w:r>
-      <w:r>
-        <w:rPr>
-          <w:rFonts w:ascii="Times New Roman" w:hAnsi="Times New Roman" w:cs="Times New Roman"/>
-          <w:sz w:val="24"/>
-          <w:szCs w:val="24"/>
-        </w:rPr>
-        <w:tab/>
-      </w:r>
-      <w:r>
-        <w:rPr>
-          <w:rFonts w:ascii="Times New Roman" w:hAnsi="Times New Roman" w:cs="Times New Roman"/>
-          <w:sz w:val="24"/>
-          <w:szCs w:val="24"/>
-        </w:rPr>
-        <w:tab/>
-        <w:t xml:space="preserve">           </w:t>
-      </w:r>
-      <w:r>
-        <w:rPr>
-          <w:rFonts w:ascii="Times New Roman" w:hAnsi="Times New Roman" w:cs="Times New Roman"/>
-          <w:sz w:val="24"/>
-          <w:szCs w:val="24"/>
-        </w:rPr>
-        <w:t xml:space="preserve">             </w:t>
-      </w:r>
-      <w:r>
-        <w:rPr>
-          <w:rFonts w:ascii="Times New Roman" w:hAnsi="Times New Roman" w:cs="Times New Roman"/>
-          <w:sz w:val="24"/>
-          <w:szCs w:val="24"/>
-        </w:rPr>
-        <w:t>2022 - 2025</w:t>
-      </w:r>
-    </w:p>
-    <w:p>
-      <w:pPr>
-        <w:spacing w:after="0"/>
-        <w:ind w:left="-794"/>
-        <w:rPr>
-          <w:rFonts w:ascii="Times New Roman" w:hAnsi="Times New Roman" w:cs="Times New Roman"/>
-        </w:rPr>
-      </w:pPr>
-      <w:r>
-        <w:rPr>
-          <w:rFonts w:ascii="Times New Roman" w:hAnsi="Times New Roman" w:cs="Times New Roman"/>
-        </w:rPr>
-        <w:t xml:space="preserve"> </w:t>
-      </w:r>
-      <w:r>
-        <w:rPr>
-          <w:rFonts w:ascii="Times New Roman" w:hAnsi="Times New Roman" w:cs="Times New Roman"/>
-        </w:rPr>
-        <w:t>Ch. Shivaji University, Kolhapur</w:t>
-      </w:r>
-    </w:p>
-    <w:p>
-      <w:pPr>
-        <w:spacing w:after="0"/>
-        <w:ind w:left="-794"/>
-        <w:rPr>
-          <w:rFonts w:ascii="Times New Roman" w:hAnsi="Times New Roman" w:cs="Times New Roman"/>
-        </w:rPr>
-      </w:pPr>
-    </w:p>
-    <w:p>
-      <w:pPr>
-        <w:spacing w:after="0"/>
-        <w:ind w:left="-794"/>
-        <w:rPr>
-          <w:rFonts w:ascii="Times New Roman" w:hAnsi="Times New Roman" w:cs="Times New Roman"/>
-          <w:b/>
-          <w:bCs/>
-          <w:sz w:val="28"/>
-          <w:szCs w:val="28"/>
-        </w:rPr>
-      </w:pPr>
-      <w:r>
-        <w:rPr>
-          <w:rFonts w:ascii="Times New Roman" w:hAnsi="Times New Roman" w:cs="Times New Roman"/>
-          <w:b/>
-          <w:bCs/>
-          <w:sz w:val="28"/>
-          <w:szCs w:val="28"/>
-        </w:rPr>
-        <w:t>COURSE &amp; CERTIFICATIONS</w:t>
-      </w:r>
-    </w:p>
-    <w:p>
-      <w:pPr>
-        <w:spacing w:after="0"/>
-        <w:ind w:left="-794" w:right="-794"/>
-        <w:rPr>
-          <w:rFonts w:ascii="Times New Roman" w:hAnsi="Times New Roman" w:cs="Times New Roman"/>
-        </w:rPr>
-      </w:pPr>
-      <w:r>
-        <w:rPr>
-          <w:rFonts w:ascii="Times New Roman" w:hAnsi="Times New Roman" w:cs="Times New Roman"/>
-        </w:rPr>
-        <w:t xml:space="preserve"> SAP ABAP Certification | CleanCode Institute, Pune </w:t>
-      </w:r>
-      <w:r>
-        <w:rPr>
-          <w:rFonts w:ascii="Times New Roman" w:hAnsi="Times New Roman" w:cs="Times New Roman"/>
-        </w:rPr>
-        <w:tab/>
-      </w:r>
-      <w:r>
-        <w:rPr>
-          <w:rFonts w:ascii="Times New Roman" w:hAnsi="Times New Roman" w:cs="Times New Roman"/>
-        </w:rPr>
-        <w:tab/>
-      </w:r>
-      <w:r>
-        <w:rPr>
-          <w:rFonts w:ascii="Times New Roman" w:hAnsi="Times New Roman" w:cs="Times New Roman"/>
-        </w:rPr>
-        <w:tab/>
-      </w:r>
-      <w:r>
-        <w:rPr>
-          <w:rFonts w:ascii="Times New Roman" w:hAnsi="Times New Roman" w:cs="Times New Roman"/>
-        </w:rPr>
-        <w:tab/>
-      </w:r>
-      <w:r>
-        <w:rPr>
-          <w:rFonts w:ascii="Times New Roman" w:hAnsi="Times New Roman" w:cs="Times New Roman"/>
-        </w:rPr>
-        <w:tab/>
-      </w:r>
-      <w:r>
-        <w:rPr>
-          <w:rFonts w:ascii="Times New Roman" w:hAnsi="Times New Roman" w:cs="Times New Roman"/>
-        </w:rPr>
-        <w:tab/>
-        <w:t xml:space="preserve">                          2026</w:t>
-      </w:r>
-    </w:p>
-    <w:p>
-      <w:pPr>
-        <w:spacing w:after="0"/>
-        <w:ind w:left="-794" w:right="-794"/>
-        <w:rPr>
-          <w:rFonts w:ascii="Times New Roman" w:hAnsi="Times New Roman" w:cs="Times New Roman"/>
-        </w:rPr>
-      </w:pPr>
-    </w:p>
-    <w:p>
-      <w:pPr>
-        <w:spacing w:after="0"/>
-        <w:ind w:left="-794"/>
-        <w:rPr>
-          <w:rFonts w:ascii="Times New Roman" w:hAnsi="Times New Roman" w:cs="Times New Roman"/>
-          <w:b/>
-          <w:bCs/>
-          <w:sz w:val="28"/>
-          <w:szCs w:val="28"/>
-        </w:rPr>
-      </w:pPr>
-      <w:r>
-        <w:rPr>
-          <w:rFonts w:ascii="Times New Roman" w:hAnsi="Times New Roman" w:cs="Times New Roman"/>
-          <w:b/>
-          <w:bCs/>
-          <w:sz w:val="28"/>
-          <w:szCs w:val="28"/>
-        </w:rPr>
-        <w:t>TECHNICAL SKILLS</w:t>
+          <w:sz w:val="28"/>
+          <w:szCs w:val="28"/>
+        </w:rPr>
+        <w:t xml:space="preserve">May </w:t>
+      </w:r>
+      <w:r>
+        <w:rPr>
+          <w:rFonts w:ascii="Times New Roman" w:hAnsi="Times New Roman" w:cs="Times New Roman"/>
+          <w:sz w:val="28"/>
+          <w:szCs w:val="28"/>
+        </w:rPr>
+        <w:t>2026</w:t>
       </w:r>
     </w:p>
     <w:p>
@@ -766,64 +867,751 @@
         <w:pStyle w:val="ListParagraph"/>
         <w:numPr>
           <w:ilvl w:val="0"/>
-          <w:numId w:val="7"/>
+          <w:numId w:val="21"/>
+        </w:numPr>
+        <w:spacing w:after="0"/>
+        <w:ind w:right="-1304"/>
+        <w:jc w:val="both"/>
+        <w:rPr>
+          <w:rFonts w:ascii="Times New Roman" w:hAnsi="Times New Roman" w:cs="Times New Roman"/>
+          <w:sz w:val="28"/>
+          <w:szCs w:val="28"/>
+        </w:rPr>
+      </w:pPr>
+      <w:r>
+        <w:rPr>
+          <w:rFonts w:ascii="Times New Roman" w:hAnsi="Times New Roman" w:cs="Times New Roman"/>
+          <w:sz w:val="28"/>
+          <w:szCs w:val="28"/>
+        </w:rPr>
+        <w:t>Hands-on practice</w:t>
+      </w:r>
+      <w:r>
+        <w:rPr>
+          <w:rFonts w:ascii="Times New Roman" w:hAnsi="Times New Roman" w:cs="Times New Roman"/>
+          <w:sz w:val="28"/>
+          <w:szCs w:val="28"/>
+        </w:rPr>
+        <w:t xml:space="preserve"> of SAP concepts</w:t>
+      </w:r>
+      <w:r>
+        <w:rPr>
+          <w:rFonts w:ascii="Times New Roman" w:hAnsi="Times New Roman" w:cs="Times New Roman"/>
+          <w:sz w:val="28"/>
+          <w:szCs w:val="28"/>
+        </w:rPr>
+        <w:t xml:space="preserve"> </w:t>
+      </w:r>
+    </w:p>
+    <w:p>
+      <w:pPr>
+        <w:pStyle w:val="ListParagraph"/>
+        <w:numPr>
+          <w:ilvl w:val="0"/>
+          <w:numId w:val="21"/>
+        </w:numPr>
+        <w:spacing w:after="0"/>
+        <w:ind w:right="-1304"/>
+        <w:jc w:val="both"/>
+        <w:rPr>
+          <w:rFonts w:ascii="Times New Roman" w:hAnsi="Times New Roman" w:cs="Times New Roman"/>
+          <w:sz w:val="28"/>
+          <w:szCs w:val="28"/>
+        </w:rPr>
+      </w:pPr>
+      <w:r>
+        <w:rPr>
+          <w:rFonts w:ascii="Times New Roman" w:hAnsi="Times New Roman" w:cs="Times New Roman"/>
+          <w:sz w:val="28"/>
+          <w:szCs w:val="28"/>
+        </w:rPr>
+        <w:t>Developed ABAP projects independently</w:t>
+      </w:r>
+    </w:p>
+    <w:p>
+      <w:pPr>
+        <w:spacing w:after="0"/>
+        <w:ind w:left="-794" w:right="-1304"/>
+        <w:jc w:val="both"/>
+        <w:rPr>
+          <w:rFonts w:ascii="Times New Roman" w:hAnsi="Times New Roman" w:cs="Times New Roman"/>
+          <w:sz w:val="28"/>
+          <w:szCs w:val="28"/>
+        </w:rPr>
+      </w:pPr>
+    </w:p>
+    <w:p>
+      <w:pPr>
+        <w:spacing w:after="0"/>
+        <w:ind w:left="-794" w:right="-794"/>
+        <w:jc w:val="both"/>
+        <w:rPr>
+          <w:rFonts w:ascii="Times New Roman" w:hAnsi="Times New Roman" w:cs="Times New Roman"/>
+        </w:rPr>
+      </w:pPr>
+    </w:p>
+    <w:p>
+      <w:pPr>
+        <w:spacing w:after="0"/>
+        <w:ind w:left="-794" w:right="-794"/>
+        <w:jc w:val="both"/>
+        <w:rPr>
+          <w:rFonts w:ascii="Times New Roman" w:hAnsi="Times New Roman" w:cs="Times New Roman"/>
+          <w:b/>
+          <w:bCs/>
+          <w:sz w:val="30"/>
+          <w:szCs w:val="30"/>
+        </w:rPr>
+      </w:pPr>
+      <w:r>
+        <w:rPr>
+          <w:rFonts w:ascii="Times New Roman" w:hAnsi="Times New Roman" w:cs="Times New Roman"/>
+          <w:b/>
+          <w:bCs/>
+          <w:sz w:val="30"/>
+          <w:szCs w:val="30"/>
+        </w:rPr>
+        <w:t>TECHNICAL SKILLS</w:t>
+      </w:r>
+    </w:p>
+    <w:p>
+      <w:pPr>
+        <w:pStyle w:val="ListParagraph"/>
+        <w:numPr>
+          <w:ilvl w:val="0"/>
+          <w:numId w:val="19"/>
+        </w:numPr>
+        <w:ind w:right="-1531"/>
+        <w:jc w:val="both"/>
+        <w:rPr>
+          <w:rFonts w:ascii="Times New Roman" w:hAnsi="Times New Roman" w:cs="Times New Roman"/>
+          <w:sz w:val="28"/>
+          <w:szCs w:val="28"/>
+        </w:rPr>
+      </w:pPr>
+      <w:r>
+        <w:rPr>
+          <w:rFonts w:ascii="Times New Roman" w:hAnsi="Times New Roman" w:cs="Times New Roman"/>
+          <w:sz w:val="28"/>
+          <w:szCs w:val="28"/>
+        </w:rPr>
+        <w:t xml:space="preserve">Core ABAP Programming </w:t>
+      </w:r>
+    </w:p>
+    <w:p>
+      <w:pPr>
+        <w:pStyle w:val="ListParagraph"/>
+        <w:numPr>
+          <w:ilvl w:val="0"/>
+          <w:numId w:val="19"/>
+        </w:numPr>
+        <w:ind w:right="-1531"/>
+        <w:jc w:val="both"/>
+        <w:rPr>
+          <w:rFonts w:ascii="Times New Roman" w:hAnsi="Times New Roman" w:cs="Times New Roman"/>
+          <w:sz w:val="28"/>
+          <w:szCs w:val="28"/>
+        </w:rPr>
+      </w:pPr>
+      <w:r>
+        <w:rPr>
+          <w:rFonts w:ascii="Times New Roman" w:hAnsi="Times New Roman" w:cs="Times New Roman"/>
+          <w:sz w:val="28"/>
+          <w:szCs w:val="28"/>
+        </w:rPr>
+        <w:t>Data Dictionary</w:t>
+      </w:r>
+    </w:p>
+    <w:p>
+      <w:pPr>
+        <w:pStyle w:val="ListParagraph"/>
+        <w:numPr>
+          <w:ilvl w:val="0"/>
+          <w:numId w:val="19"/>
+        </w:numPr>
+        <w:ind w:right="-1531"/>
+        <w:jc w:val="both"/>
+        <w:rPr>
+          <w:rFonts w:ascii="Times New Roman" w:hAnsi="Times New Roman" w:cs="Times New Roman"/>
+          <w:sz w:val="28"/>
+          <w:szCs w:val="28"/>
+        </w:rPr>
+      </w:pPr>
+      <w:r>
+        <w:rPr>
+          <w:rFonts w:ascii="Times New Roman" w:hAnsi="Times New Roman" w:cs="Times New Roman"/>
+          <w:sz w:val="28"/>
+          <w:szCs w:val="28"/>
+        </w:rPr>
+        <w:t xml:space="preserve">Internal Tables and Open SQL </w:t>
+      </w:r>
+    </w:p>
+    <w:p>
+      <w:pPr>
+        <w:pStyle w:val="ListParagraph"/>
+        <w:numPr>
+          <w:ilvl w:val="0"/>
+          <w:numId w:val="19"/>
+        </w:numPr>
+        <w:ind w:right="-1531"/>
+        <w:jc w:val="both"/>
+        <w:rPr>
+          <w:rFonts w:ascii="Times New Roman" w:hAnsi="Times New Roman" w:cs="Times New Roman"/>
+          <w:sz w:val="28"/>
+          <w:szCs w:val="28"/>
+        </w:rPr>
+      </w:pPr>
+      <w:r>
+        <w:rPr>
+          <w:rFonts w:ascii="Times New Roman" w:hAnsi="Times New Roman" w:cs="Times New Roman"/>
+          <w:sz w:val="28"/>
+          <w:szCs w:val="28"/>
+        </w:rPr>
+        <w:t xml:space="preserve">Classical Reports and ALV Reports </w:t>
+      </w:r>
+    </w:p>
+    <w:p>
+      <w:pPr>
+        <w:pStyle w:val="ListParagraph"/>
+        <w:numPr>
+          <w:ilvl w:val="0"/>
+          <w:numId w:val="19"/>
+        </w:numPr>
+        <w:ind w:right="-1531"/>
+        <w:jc w:val="both"/>
+        <w:rPr>
+          <w:rFonts w:ascii="Times New Roman" w:hAnsi="Times New Roman" w:cs="Times New Roman"/>
+          <w:sz w:val="28"/>
+          <w:szCs w:val="28"/>
+        </w:rPr>
+      </w:pPr>
+      <w:r>
+        <w:rPr>
+          <w:rFonts w:ascii="Times New Roman" w:hAnsi="Times New Roman" w:cs="Times New Roman"/>
+          <w:sz w:val="28"/>
+          <w:szCs w:val="28"/>
+        </w:rPr>
+        <w:t xml:space="preserve">SmartForms </w:t>
+      </w:r>
+    </w:p>
+    <w:p>
+      <w:pPr>
+        <w:pStyle w:val="ListParagraph"/>
+        <w:numPr>
+          <w:ilvl w:val="0"/>
+          <w:numId w:val="19"/>
+        </w:numPr>
+        <w:ind w:right="-1531"/>
+        <w:jc w:val="both"/>
+        <w:rPr>
+          <w:rFonts w:ascii="Times New Roman" w:hAnsi="Times New Roman" w:cs="Times New Roman"/>
+          <w:sz w:val="28"/>
+          <w:szCs w:val="28"/>
+        </w:rPr>
+      </w:pPr>
+      <w:r>
+        <w:rPr>
+          <w:rFonts w:ascii="Times New Roman" w:hAnsi="Times New Roman" w:cs="Times New Roman"/>
+          <w:sz w:val="28"/>
+          <w:szCs w:val="28"/>
+        </w:rPr>
+        <w:t xml:space="preserve">Module Pool Programming </w:t>
+      </w:r>
+    </w:p>
+    <w:p>
+      <w:pPr>
+        <w:pStyle w:val="ListParagraph"/>
+        <w:numPr>
+          <w:ilvl w:val="0"/>
+          <w:numId w:val="19"/>
+        </w:numPr>
+        <w:ind w:right="-1531"/>
+        <w:jc w:val="both"/>
+        <w:rPr>
+          <w:rFonts w:ascii="Times New Roman" w:hAnsi="Times New Roman" w:cs="Times New Roman"/>
+          <w:sz w:val="28"/>
+          <w:szCs w:val="28"/>
+        </w:rPr>
+      </w:pPr>
+      <w:r>
+        <w:rPr>
+          <w:rFonts w:ascii="Times New Roman" w:hAnsi="Times New Roman" w:cs="Times New Roman"/>
+          <w:sz w:val="28"/>
+          <w:szCs w:val="28"/>
+        </w:rPr>
+        <w:t xml:space="preserve">OOP ABAP </w:t>
+      </w:r>
+    </w:p>
+    <w:p>
+      <w:pPr>
+        <w:pStyle w:val="ListParagraph"/>
+        <w:numPr>
+          <w:ilvl w:val="0"/>
+          <w:numId w:val="19"/>
+        </w:numPr>
+        <w:ind w:right="-1531"/>
+        <w:jc w:val="both"/>
+        <w:rPr>
+          <w:rFonts w:ascii="Times New Roman" w:hAnsi="Times New Roman" w:cs="Times New Roman"/>
+          <w:sz w:val="28"/>
+          <w:szCs w:val="28"/>
+        </w:rPr>
+      </w:pPr>
+      <w:r>
+        <w:rPr>
+          <w:rFonts w:ascii="Times New Roman" w:hAnsi="Times New Roman" w:cs="Times New Roman"/>
+          <w:sz w:val="28"/>
+          <w:szCs w:val="28"/>
+        </w:rPr>
+        <w:t xml:space="preserve">Function Modules </w:t>
+      </w:r>
+    </w:p>
+    <w:p>
+      <w:pPr>
+        <w:pStyle w:val="ListParagraph"/>
+        <w:numPr>
+          <w:ilvl w:val="0"/>
+          <w:numId w:val="19"/>
+        </w:numPr>
+        <w:ind w:right="-1531"/>
+        <w:jc w:val="both"/>
+        <w:rPr>
+          <w:rFonts w:ascii="Times New Roman" w:hAnsi="Times New Roman" w:cs="Times New Roman"/>
+          <w:sz w:val="28"/>
+          <w:szCs w:val="28"/>
+        </w:rPr>
+      </w:pPr>
+      <w:r>
+        <w:rPr>
+          <w:rFonts w:ascii="Times New Roman" w:hAnsi="Times New Roman" w:cs="Times New Roman"/>
+          <w:sz w:val="28"/>
+          <w:szCs w:val="28"/>
+        </w:rPr>
+        <w:t>Enhancements</w:t>
+      </w:r>
+    </w:p>
+    <w:p>
+      <w:pPr>
+        <w:pStyle w:val="ListParagraph"/>
+        <w:numPr>
+          <w:ilvl w:val="0"/>
+          <w:numId w:val="19"/>
+        </w:numPr>
+        <w:spacing w:after="0"/>
+        <w:ind w:right="-1531"/>
+        <w:jc w:val="both"/>
+        <w:rPr>
+          <w:rFonts w:ascii="Times New Roman" w:hAnsi="Times New Roman" w:cs="Times New Roman"/>
+          <w:sz w:val="28"/>
+          <w:szCs w:val="28"/>
+        </w:rPr>
+      </w:pPr>
+      <w:r>
+        <w:rPr>
+          <w:rFonts w:ascii="Times New Roman" w:hAnsi="Times New Roman" w:cs="Times New Roman"/>
+          <w:sz w:val="28"/>
+          <w:szCs w:val="28"/>
+        </w:rPr>
+        <w:t>Debugging and Performance Tuning</w:t>
+      </w:r>
+    </w:p>
+    <w:p>
+      <w:pPr>
+        <w:pStyle w:val="ListParagraph"/>
+        <w:numPr>
+          <w:ilvl w:val="0"/>
+          <w:numId w:val="19"/>
+        </w:numPr>
+        <w:spacing w:after="0"/>
+        <w:ind w:right="-1531"/>
+        <w:jc w:val="both"/>
+        <w:rPr>
+          <w:rFonts w:ascii="Times New Roman" w:hAnsi="Times New Roman" w:cs="Times New Roman"/>
+          <w:sz w:val="28"/>
+          <w:szCs w:val="28"/>
+        </w:rPr>
+      </w:pPr>
+      <w:r>
+        <w:rPr>
+          <w:rFonts w:ascii="Times New Roman" w:hAnsi="Times New Roman" w:cs="Times New Roman"/>
+          <w:sz w:val="28"/>
+          <w:szCs w:val="28"/>
+        </w:rPr>
+        <w:t>Modularization Techniques</w:t>
+      </w:r>
+    </w:p>
+    <w:p>
+      <w:pPr>
+        <w:pStyle w:val="ListParagraph"/>
+        <w:numPr>
+          <w:ilvl w:val="0"/>
+          <w:numId w:val="19"/>
+        </w:numPr>
+        <w:spacing w:after="0"/>
+        <w:ind w:right="-1531"/>
+        <w:jc w:val="both"/>
+        <w:rPr>
+          <w:rFonts w:ascii="Times New Roman" w:hAnsi="Times New Roman" w:cs="Times New Roman"/>
+          <w:sz w:val="28"/>
+          <w:szCs w:val="28"/>
+        </w:rPr>
+      </w:pPr>
+      <w:r>
+        <w:rPr>
+          <w:rFonts w:ascii="Times New Roman" w:hAnsi="Times New Roman" w:cs="Times New Roman"/>
+          <w:sz w:val="28"/>
+          <w:szCs w:val="28"/>
+        </w:rPr>
+        <w:t>BAPI</w:t>
+      </w:r>
+    </w:p>
+    <w:p>
+      <w:pPr>
+        <w:pStyle w:val="ListParagraph"/>
+        <w:spacing w:after="0"/>
+        <w:ind w:left="1080" w:right="-1531"/>
+        <w:jc w:val="both"/>
+        <w:rPr>
+          <w:rFonts w:ascii="Times New Roman" w:hAnsi="Times New Roman" w:cs="Times New Roman"/>
+          <w:sz w:val="28"/>
+          <w:szCs w:val="28"/>
+        </w:rPr>
+      </w:pPr>
+    </w:p>
+    <w:p>
+      <w:pPr>
+        <w:pStyle w:val="ListParagraph"/>
+        <w:spacing w:after="0"/>
+        <w:ind w:left="586" w:right="-794"/>
+        <w:jc w:val="both"/>
+        <w:rPr>
+          <w:rFonts w:ascii="Times New Roman" w:hAnsi="Times New Roman" w:cs="Times New Roman"/>
+          <w:sz w:val="26"/>
+          <w:szCs w:val="26"/>
+        </w:rPr>
+      </w:pPr>
+    </w:p>
+    <w:p>
+      <w:pPr>
+        <w:spacing w:after="0"/>
+        <w:ind w:left="-794" w:right="-794"/>
+        <w:jc w:val="both"/>
+        <w:rPr>
+          <w:rFonts w:ascii="Times New Roman" w:hAnsi="Times New Roman" w:cs="Times New Roman"/>
+          <w:b/>
+          <w:bCs/>
+          <w:sz w:val="30"/>
+          <w:szCs w:val="30"/>
+        </w:rPr>
+      </w:pPr>
+      <w:r>
+        <w:rPr>
+          <w:rFonts w:ascii="Times New Roman" w:hAnsi="Times New Roman" w:cs="Times New Roman"/>
+          <w:b/>
+          <w:bCs/>
+          <w:sz w:val="30"/>
+          <w:szCs w:val="30"/>
+        </w:rPr>
+        <w:t>SOFT SKILLS</w:t>
+      </w:r>
+    </w:p>
+    <w:p>
+      <w:pPr>
+        <w:pStyle w:val="ListParagraph"/>
+        <w:numPr>
+          <w:ilvl w:val="0"/>
+          <w:numId w:val="18"/>
+        </w:numPr>
+        <w:spacing w:after="0"/>
+        <w:ind w:right="-1531"/>
+        <w:jc w:val="both"/>
+        <w:rPr>
+          <w:rFonts w:ascii="Times New Roman" w:hAnsi="Times New Roman" w:cs="Times New Roman"/>
+          <w:sz w:val="28"/>
+          <w:szCs w:val="28"/>
+        </w:rPr>
+      </w:pPr>
+      <w:r>
+        <w:rPr>
+          <w:rFonts w:ascii="Times New Roman" w:hAnsi="Times New Roman" w:cs="Times New Roman"/>
+          <w:sz w:val="28"/>
+          <w:szCs w:val="28"/>
+        </w:rPr>
+        <w:t xml:space="preserve">Communication Skills </w:t>
+      </w:r>
+      <w:r>
+        <w:rPr>
+          <w:rFonts w:ascii="Times New Roman" w:hAnsi="Times New Roman" w:cs="Times New Roman"/>
+          <w:sz w:val="28"/>
+          <w:szCs w:val="28"/>
+        </w:rPr>
+        <w:t xml:space="preserve">         </w:t>
+      </w:r>
+    </w:p>
+    <w:p>
+      <w:pPr>
+        <w:pStyle w:val="ListParagraph"/>
+        <w:numPr>
+          <w:ilvl w:val="0"/>
+          <w:numId w:val="18"/>
+        </w:numPr>
+        <w:spacing w:after="0"/>
+        <w:ind w:right="-1531"/>
+        <w:jc w:val="both"/>
+        <w:rPr>
+          <w:rFonts w:ascii="Times New Roman" w:hAnsi="Times New Roman" w:cs="Times New Roman"/>
+          <w:sz w:val="28"/>
+          <w:szCs w:val="28"/>
+        </w:rPr>
+      </w:pPr>
+      <w:r>
+        <w:rPr>
+          <w:rFonts w:ascii="Times New Roman" w:hAnsi="Times New Roman" w:cs="Times New Roman"/>
+          <w:sz w:val="28"/>
+          <w:szCs w:val="28"/>
+        </w:rPr>
+        <w:t xml:space="preserve">Problem-Solving        </w:t>
+      </w:r>
+    </w:p>
+    <w:p>
+      <w:pPr>
+        <w:spacing w:after="0"/>
+        <w:ind w:right="-1531"/>
+        <w:jc w:val="both"/>
+        <w:rPr>
+          <w:rFonts w:ascii="Times New Roman" w:hAnsi="Times New Roman" w:cs="Times New Roman"/>
+          <w:sz w:val="28"/>
+          <w:szCs w:val="28"/>
+        </w:rPr>
+      </w:pPr>
+    </w:p>
+    <w:p>
+      <w:pPr>
+        <w:spacing w:after="0"/>
+        <w:ind w:right="-1531"/>
+        <w:jc w:val="both"/>
+        <w:rPr>
+          <w:rFonts w:ascii="Times New Roman" w:hAnsi="Times New Roman" w:cs="Times New Roman"/>
+          <w:sz w:val="28"/>
+          <w:szCs w:val="28"/>
+        </w:rPr>
+      </w:pPr>
+    </w:p>
+    <w:p>
+      <w:pPr>
+        <w:pStyle w:val="ListParagraph"/>
+        <w:spacing w:after="0"/>
+        <w:ind w:left="586"/>
+        <w:jc w:val="both"/>
+        <w:rPr>
+          <w:rFonts w:ascii="Times New Roman" w:hAnsi="Times New Roman" w:cs="Times New Roman"/>
+          <w:spacing w:val="-2"/>
+        </w:rPr>
+      </w:pPr>
+    </w:p>
+    <w:p>
+      <w:pPr>
+        <w:spacing w:after="0"/>
+        <w:ind w:left="-794" w:right="-794"/>
+        <w:jc w:val="both"/>
+        <w:rPr>
+          <w:rFonts w:ascii="Times New Roman" w:hAnsi="Times New Roman" w:cs="Times New Roman"/>
+          <w:b/>
+          <w:bCs/>
+          <w:sz w:val="30"/>
+          <w:szCs w:val="30"/>
+        </w:rPr>
+      </w:pPr>
+      <w:r>
+        <w:rPr>
+          <w:rFonts w:ascii="Times New Roman" w:hAnsi="Times New Roman" w:cs="Times New Roman"/>
+          <w:b/>
+          <w:bCs/>
+          <w:sz w:val="30"/>
+          <w:szCs w:val="30"/>
+        </w:rPr>
+        <w:t>PROJECT</w:t>
+      </w:r>
+    </w:p>
+    <w:p>
+      <w:pPr>
+        <w:spacing w:after="0"/>
+        <w:ind w:left="-794" w:right="-794"/>
+        <w:jc w:val="both"/>
+        <w:rPr>
+          <w:rFonts w:ascii="Times New Roman" w:hAnsi="Times New Roman" w:cs="Times New Roman"/>
+          <w:b/>
+          <w:bCs/>
+          <w:sz w:val="30"/>
+          <w:szCs w:val="30"/>
+        </w:rPr>
+      </w:pPr>
+      <w:r>
+        <w:rPr>
+          <w:rFonts w:ascii="Times New Roman" w:hAnsi="Times New Roman" w:cs="Times New Roman"/>
+          <w:b/>
+          <w:bCs/>
+          <w:sz w:val="30"/>
+          <w:szCs w:val="30"/>
+        </w:rPr>
+        <w:t xml:space="preserve">     Inventory Management System | SAP ABAP</w:t>
+      </w:r>
+    </w:p>
+    <w:p>
+      <w:pPr>
+        <w:pStyle w:val="ListParagraph"/>
+        <w:numPr>
+          <w:ilvl w:val="0"/>
+          <w:numId w:val="17"/>
+        </w:numPr>
+        <w:spacing w:after="0"/>
+        <w:ind w:right="-1531"/>
+        <w:jc w:val="both"/>
+        <w:rPr>
+          <w:rFonts w:ascii="Times New Roman" w:hAnsi="Times New Roman" w:cs="Times New Roman"/>
+          <w:sz w:val="28"/>
+          <w:szCs w:val="28"/>
+        </w:rPr>
+      </w:pPr>
+      <w:r>
+        <w:rPr>
+          <w:rFonts w:ascii="Times New Roman" w:hAnsi="Times New Roman" w:cs="Times New Roman"/>
+          <w:sz w:val="28"/>
+          <w:szCs w:val="28"/>
+        </w:rPr>
+        <w:t xml:space="preserve">Developed an SAP ABAP-based Inventory Management System for managing </w:t>
+      </w:r>
+    </w:p>
+    <w:p>
+      <w:pPr>
+        <w:pStyle w:val="ListParagraph"/>
+        <w:spacing w:after="0"/>
+        <w:ind w:right="-1531"/>
+        <w:jc w:val="both"/>
+        <w:rPr>
+          <w:rFonts w:ascii="Times New Roman" w:hAnsi="Times New Roman" w:cs="Times New Roman"/>
+          <w:sz w:val="28"/>
+          <w:szCs w:val="28"/>
+        </w:rPr>
+      </w:pPr>
+      <w:r>
+        <w:rPr>
+          <w:rFonts w:ascii="Times New Roman" w:hAnsi="Times New Roman" w:cs="Times New Roman"/>
+          <w:sz w:val="28"/>
+          <w:szCs w:val="28"/>
+        </w:rPr>
+        <w:t xml:space="preserve">material master records and inventory transactions. </w:t>
+      </w:r>
+    </w:p>
+    <w:p>
+      <w:pPr>
+        <w:pStyle w:val="ListParagraph"/>
+        <w:numPr>
+          <w:ilvl w:val="0"/>
+          <w:numId w:val="17"/>
+        </w:numPr>
+        <w:spacing w:after="0"/>
+        <w:ind w:right="-1531"/>
+        <w:jc w:val="both"/>
+        <w:rPr>
+          <w:rFonts w:ascii="Times New Roman" w:hAnsi="Times New Roman" w:cs="Times New Roman"/>
+          <w:sz w:val="28"/>
+          <w:szCs w:val="28"/>
+        </w:rPr>
+      </w:pPr>
+      <w:r>
+        <w:rPr>
+          <w:rFonts w:ascii="Times New Roman" w:hAnsi="Times New Roman" w:cs="Times New Roman"/>
+          <w:sz w:val="28"/>
+          <w:szCs w:val="28"/>
+        </w:rPr>
+        <w:t xml:space="preserve">Implemented CRUD operations, stock inward/outward processing, data validations, </w:t>
+      </w:r>
+    </w:p>
+    <w:p>
+      <w:pPr>
+        <w:pStyle w:val="ListParagraph"/>
+        <w:spacing w:after="0"/>
+        <w:ind w:right="-1531"/>
+        <w:jc w:val="both"/>
+        <w:rPr>
+          <w:rFonts w:ascii="Times New Roman" w:hAnsi="Times New Roman" w:cs="Times New Roman"/>
+          <w:sz w:val="28"/>
+          <w:szCs w:val="28"/>
+        </w:rPr>
+      </w:pPr>
+      <w:r>
+        <w:rPr>
+          <w:rFonts w:ascii="Times New Roman" w:hAnsi="Times New Roman" w:cs="Times New Roman"/>
+          <w:sz w:val="28"/>
+          <w:szCs w:val="28"/>
+        </w:rPr>
+        <w:t xml:space="preserve">and database integration. </w:t>
+      </w:r>
+    </w:p>
+    <w:p>
+      <w:pPr>
+        <w:pStyle w:val="ListParagraph"/>
+        <w:numPr>
+          <w:ilvl w:val="0"/>
+          <w:numId w:val="17"/>
         </w:numPr>
         <w:spacing w:after="0"/>
         <w:ind w:right="-794"/>
-        <w:rPr>
-          <w:rFonts w:ascii="Times New Roman" w:hAnsi="Times New Roman" w:cs="Times New Roman"/>
-          <w:sz w:val="24"/>
-          <w:szCs w:val="24"/>
-        </w:rPr>
-      </w:pPr>
-      <w:r>
-        <w:rPr>
-          <w:rFonts w:ascii="Times New Roman" w:hAnsi="Times New Roman" w:cs="Times New Roman"/>
-          <w:sz w:val="24"/>
-          <w:szCs w:val="24"/>
-        </w:rPr>
-        <w:t xml:space="preserve">ABAP   </w:t>
-      </w:r>
-      <w:r>
-        <w:rPr>
-          <w:rFonts w:ascii="Times New Roman" w:hAnsi="Times New Roman" w:cs="Times New Roman"/>
-          <w:sz w:val="24"/>
-          <w:szCs w:val="24"/>
-        </w:rPr>
-        <w:tab/>
-      </w:r>
-      <w:r>
-        <w:rPr>
-          <w:rFonts w:ascii="Times New Roman" w:hAnsi="Times New Roman" w:cs="Times New Roman"/>
-          <w:sz w:val="24"/>
-          <w:szCs w:val="24"/>
-        </w:rPr>
-        <w:tab/>
-      </w:r>
-      <w:r>
-        <w:rPr>
-          <w:rFonts w:ascii="Times New Roman" w:hAnsi="Times New Roman" w:cs="Times New Roman"/>
-          <w:sz w:val="24"/>
-          <w:szCs w:val="24"/>
-        </w:rPr>
-        <w:tab/>
-      </w:r>
-      <w:r>
-        <w:rPr>
-          <w:rFonts w:ascii="Times New Roman" w:hAnsi="Times New Roman" w:cs="Times New Roman"/>
-          <w:sz w:val="24"/>
-          <w:szCs w:val="24"/>
-        </w:rPr>
-        <w:tab/>
-      </w:r>
-      <w:r>
-        <w:rPr>
-          <w:rFonts w:ascii="Times New Roman" w:hAnsi="Times New Roman" w:cs="Times New Roman"/>
-          <w:sz w:val="24"/>
-          <w:szCs w:val="24"/>
-        </w:rPr>
-        <w:tab/>
-        <w:t xml:space="preserve">-   SmartForms      </w:t>
+        <w:jc w:val="both"/>
+        <w:rPr>
+          <w:rFonts w:ascii="Times New Roman" w:hAnsi="Times New Roman" w:cs="Times New Roman"/>
+          <w:b/>
+          <w:bCs/>
+          <w:sz w:val="30"/>
+          <w:szCs w:val="30"/>
+        </w:rPr>
+      </w:pPr>
+      <w:r>
+        <w:rPr>
+          <w:rFonts w:ascii="Times New Roman" w:hAnsi="Times New Roman" w:cs="Times New Roman"/>
+          <w:sz w:val="28"/>
+          <w:szCs w:val="28"/>
+        </w:rPr>
+        <w:t>Generated ALV reports for inventory tracking and improved stock management efficiency.</w:t>
+      </w:r>
+    </w:p>
+    <w:p>
+      <w:pPr>
+        <w:spacing w:after="0"/>
+        <w:ind w:left="-794" w:right="-794"/>
+        <w:jc w:val="both"/>
+        <w:rPr>
+          <w:rFonts w:ascii="Times New Roman" w:hAnsi="Times New Roman" w:cs="Times New Roman"/>
+          <w:b/>
+          <w:bCs/>
+          <w:sz w:val="30"/>
+          <w:szCs w:val="30"/>
+        </w:rPr>
+      </w:pPr>
+    </w:p>
+    <w:p>
+      <w:pPr>
+        <w:spacing w:after="0"/>
+        <w:ind w:left="-794" w:right="-794"/>
+        <w:jc w:val="both"/>
+        <w:rPr>
+          <w:rFonts w:ascii="Times New Roman" w:hAnsi="Times New Roman" w:cs="Times New Roman"/>
+          <w:b/>
+          <w:bCs/>
+          <w:sz w:val="30"/>
+          <w:szCs w:val="30"/>
+        </w:rPr>
+      </w:pPr>
+      <w:r>
+        <w:rPr>
+          <w:rFonts w:ascii="Times New Roman" w:hAnsi="Times New Roman" w:cs="Times New Roman"/>
+          <w:b/>
+          <w:bCs/>
+          <w:sz w:val="30"/>
+          <w:szCs w:val="30"/>
+        </w:rPr>
+        <w:t xml:space="preserve">Vendor Invoice Management System | SAP ABAP </w:t>
       </w:r>
     </w:p>
     <w:p>
@@ -831,64 +1619,44 @@
         <w:pStyle w:val="ListParagraph"/>
         <w:numPr>
           <w:ilvl w:val="0"/>
-          <w:numId w:val="7"/>
+          <w:numId w:val="16"/>
         </w:numPr>
         <w:spacing w:after="0"/>
-        <w:ind w:right="-794"/>
-        <w:rPr>
-          <w:rFonts w:ascii="Times New Roman" w:hAnsi="Times New Roman" w:cs="Times New Roman"/>
-          <w:sz w:val="24"/>
-          <w:szCs w:val="24"/>
-        </w:rPr>
-      </w:pPr>
-      <w:r>
-        <w:rPr>
-          <w:rFonts w:ascii="Times New Roman" w:hAnsi="Times New Roman" w:cs="Times New Roman"/>
-          <w:sz w:val="24"/>
-          <w:szCs w:val="24"/>
-        </w:rPr>
-        <w:t xml:space="preserve">SQL      </w:t>
-      </w:r>
-      <w:r>
-        <w:rPr>
-          <w:rFonts w:ascii="Times New Roman" w:hAnsi="Times New Roman" w:cs="Times New Roman"/>
-          <w:sz w:val="24"/>
-          <w:szCs w:val="24"/>
-        </w:rPr>
-        <w:tab/>
-      </w:r>
-      <w:r>
-        <w:rPr>
-          <w:rFonts w:ascii="Times New Roman" w:hAnsi="Times New Roman" w:cs="Times New Roman"/>
-          <w:sz w:val="24"/>
-          <w:szCs w:val="24"/>
-        </w:rPr>
-        <w:tab/>
-      </w:r>
-      <w:r>
-        <w:rPr>
-          <w:rFonts w:ascii="Times New Roman" w:hAnsi="Times New Roman" w:cs="Times New Roman"/>
-          <w:sz w:val="24"/>
-          <w:szCs w:val="24"/>
-        </w:rPr>
-        <w:tab/>
-      </w:r>
-      <w:r>
-        <w:rPr>
-          <w:rFonts w:ascii="Times New Roman" w:hAnsi="Times New Roman" w:cs="Times New Roman"/>
-          <w:sz w:val="24"/>
-          <w:szCs w:val="24"/>
-        </w:rPr>
-        <w:tab/>
-      </w:r>
-      <w:r>
-        <w:rPr>
-          <w:rFonts w:ascii="Times New Roman" w:hAnsi="Times New Roman" w:cs="Times New Roman"/>
-          <w:sz w:val="24"/>
-          <w:szCs w:val="24"/>
-        </w:rPr>
-        <w:tab/>
-        <w:t>-   Enhancement</w:t>
+        <w:ind w:right="-1531"/>
+        <w:jc w:val="both"/>
+        <w:rPr>
+          <w:rFonts w:ascii="Times New Roman" w:hAnsi="Times New Roman" w:cs="Times New Roman"/>
+          <w:sz w:val="26"/>
+          <w:szCs w:val="26"/>
+        </w:rPr>
+      </w:pPr>
+      <w:r>
+        <w:rPr>
+          <w:rFonts w:ascii="Times New Roman" w:hAnsi="Times New Roman" w:cs="Times New Roman"/>
+          <w:sz w:val="26"/>
+          <w:szCs w:val="26"/>
+        </w:rPr>
+        <w:t xml:space="preserve">Developed a Module Pool-based Vendor Invoice Management System in SAP ABAP </w:t>
+      </w:r>
+    </w:p>
+    <w:p>
+      <w:pPr>
+        <w:spacing w:after="0"/>
+        <w:ind w:right="-1531" w:firstLine="720"/>
+        <w:jc w:val="both"/>
+        <w:rPr>
+          <w:rFonts w:ascii="Times New Roman" w:hAnsi="Times New Roman" w:cs="Times New Roman"/>
+          <w:sz w:val="26"/>
+          <w:szCs w:val="26"/>
+        </w:rPr>
+      </w:pPr>
+      <w:r>
+        <w:rPr>
+          <w:rFonts w:ascii="Times New Roman" w:hAnsi="Times New Roman" w:cs="Times New Roman"/>
+          <w:sz w:val="26"/>
+          <w:szCs w:val="26"/>
+        </w:rPr>
+        <w:t xml:space="preserve">to manage vendor invoice creation, modification, approval, and tracking processes. </w:t>
       </w:r>
     </w:p>
     <w:p>
@@ -896,10 +1664,272 @@
         <w:pStyle w:val="ListParagraph"/>
         <w:numPr>
           <w:ilvl w:val="0"/>
-          <w:numId w:val="7"/>
+          <w:numId w:val="16"/>
         </w:numPr>
         <w:spacing w:after="0"/>
-        <w:ind w:right="-794"/>
+        <w:ind w:right="-1531"/>
+        <w:jc w:val="both"/>
+        <w:rPr>
+          <w:rFonts w:ascii="Times New Roman" w:hAnsi="Times New Roman" w:cs="Times New Roman"/>
+          <w:sz w:val="26"/>
+          <w:szCs w:val="26"/>
+        </w:rPr>
+      </w:pPr>
+      <w:r>
+        <w:rPr>
+          <w:rFonts w:ascii="Times New Roman" w:hAnsi="Times New Roman" w:cs="Times New Roman"/>
+          <w:sz w:val="26"/>
+          <w:szCs w:val="26"/>
+        </w:rPr>
+        <w:t xml:space="preserve">Implemented invoice data validation, CRUD operations, Open SQL database </w:t>
+      </w:r>
+      <w:r>
+        <w:rPr>
+          <w:rFonts w:ascii="Times New Roman" w:hAnsi="Times New Roman" w:cs="Times New Roman"/>
+          <w:sz w:val="26"/>
+          <w:szCs w:val="26"/>
+        </w:rPr>
+        <w:t xml:space="preserve">integration, </w:t>
+      </w:r>
+      <w:r>
+        <w:rPr>
+          <w:rFonts w:ascii="Times New Roman" w:hAnsi="Times New Roman" w:cs="Times New Roman"/>
+          <w:sz w:val="26"/>
+          <w:szCs w:val="26"/>
+        </w:rPr>
+        <w:t xml:space="preserve">  </w:t>
+      </w:r>
+    </w:p>
+    <w:p>
+      <w:pPr>
+        <w:spacing w:after="0"/>
+        <w:ind w:right="-1531" w:firstLine="720"/>
+        <w:jc w:val="both"/>
+        <w:rPr>
+          <w:rFonts w:ascii="Times New Roman" w:hAnsi="Times New Roman" w:cs="Times New Roman"/>
+          <w:sz w:val="26"/>
+          <w:szCs w:val="26"/>
+        </w:rPr>
+      </w:pPr>
+      <w:r>
+        <w:rPr>
+          <w:rFonts w:ascii="Times New Roman" w:hAnsi="Times New Roman" w:cs="Times New Roman"/>
+          <w:sz w:val="26"/>
+          <w:szCs w:val="26"/>
+        </w:rPr>
+        <w:t xml:space="preserve">and </w:t>
+      </w:r>
+      <w:r>
+        <w:rPr>
+          <w:rFonts w:ascii="Times New Roman" w:hAnsi="Times New Roman" w:cs="Times New Roman"/>
+          <w:sz w:val="26"/>
+          <w:szCs w:val="26"/>
+        </w:rPr>
+        <w:t>user-friendly</w:t>
+      </w:r>
+      <w:r>
+        <w:rPr>
+          <w:rFonts w:ascii="Times New Roman" w:hAnsi="Times New Roman" w:cs="Times New Roman"/>
+          <w:sz w:val="26"/>
+          <w:szCs w:val="26"/>
+        </w:rPr>
+        <w:t xml:space="preserve"> screen navigation using Screen Painter and PBO/PAI modules. </w:t>
+      </w:r>
+    </w:p>
+    <w:p>
+      <w:pPr>
+        <w:pStyle w:val="ListParagraph"/>
+        <w:numPr>
+          <w:ilvl w:val="0"/>
+          <w:numId w:val="16"/>
+        </w:numPr>
+        <w:spacing w:after="0"/>
+        <w:ind w:right="-1531"/>
+        <w:jc w:val="both"/>
+        <w:rPr>
+          <w:rFonts w:ascii="Times New Roman" w:hAnsi="Times New Roman" w:cs="Times New Roman"/>
+          <w:sz w:val="26"/>
+          <w:szCs w:val="26"/>
+        </w:rPr>
+      </w:pPr>
+      <w:r>
+        <w:rPr>
+          <w:rFonts w:ascii="Times New Roman" w:hAnsi="Times New Roman" w:cs="Times New Roman"/>
+          <w:sz w:val="26"/>
+          <w:szCs w:val="26"/>
+        </w:rPr>
+        <w:t xml:space="preserve">Generated ALV reports for invoice monitoring, payment status tracking, and </w:t>
+      </w:r>
+    </w:p>
+    <w:p>
+      <w:pPr>
+        <w:spacing w:after="0"/>
+        <w:ind w:right="-1531" w:firstLine="360"/>
+        <w:jc w:val="both"/>
+        <w:rPr>
+          <w:rFonts w:ascii="Times New Roman" w:hAnsi="Times New Roman" w:cs="Times New Roman"/>
+          <w:sz w:val="26"/>
+          <w:szCs w:val="26"/>
+        </w:rPr>
+      </w:pPr>
+      <w:r>
+        <w:rPr>
+          <w:rFonts w:ascii="Times New Roman" w:hAnsi="Times New Roman" w:cs="Times New Roman"/>
+          <w:sz w:val="26"/>
+          <w:szCs w:val="26"/>
+        </w:rPr>
+        <w:tab/>
+      </w:r>
+      <w:r>
+        <w:rPr>
+          <w:rFonts w:ascii="Times New Roman" w:hAnsi="Times New Roman" w:cs="Times New Roman"/>
+          <w:sz w:val="26"/>
+          <w:szCs w:val="26"/>
+        </w:rPr>
+        <w:t>vendor-wise invoice</w:t>
+      </w:r>
+      <w:r>
+        <w:rPr>
+          <w:rFonts w:ascii="Times New Roman" w:hAnsi="Times New Roman" w:cs="Times New Roman"/>
+          <w:sz w:val="26"/>
+          <w:szCs w:val="26"/>
+        </w:rPr>
+        <w:t>.</w:t>
+      </w:r>
+    </w:p>
+    <w:p>
+      <w:pPr>
+        <w:spacing w:after="0"/>
+        <w:ind w:left="-794" w:right="-794"/>
+        <w:jc w:val="both"/>
+        <w:rPr>
+          <w:rFonts w:ascii="Times New Roman" w:hAnsi="Times New Roman" w:cs="Times New Roman"/>
+          <w:b/>
+          <w:bCs/>
+          <w:sz w:val="28"/>
+          <w:szCs w:val="28"/>
+        </w:rPr>
+      </w:pPr>
+    </w:p>
+    <w:p>
+      <w:pPr>
+        <w:spacing w:after="0"/>
+        <w:ind w:left="-794" w:right="-794"/>
+        <w:jc w:val="both"/>
+        <w:rPr>
+          <w:rFonts w:ascii="Times New Roman" w:hAnsi="Times New Roman" w:cs="Times New Roman"/>
+          <w:b/>
+          <w:bCs/>
+          <w:sz w:val="30"/>
+          <w:szCs w:val="30"/>
+        </w:rPr>
+      </w:pPr>
+      <w:r>
+        <w:rPr>
+          <w:rFonts w:ascii="Times New Roman" w:hAnsi="Times New Roman" w:cs="Times New Roman"/>
+          <w:b/>
+          <w:bCs/>
+          <w:sz w:val="30"/>
+          <w:szCs w:val="30"/>
+        </w:rPr>
+        <w:t>CONTRIBUTION AND ACHIVEMENTS</w:t>
+      </w:r>
+    </w:p>
+    <w:p>
+      <w:pPr>
+        <w:pStyle w:val="ListParagraph"/>
+        <w:numPr>
+          <w:ilvl w:val="0"/>
+          <w:numId w:val="16"/>
+        </w:numPr>
+        <w:spacing w:after="0"/>
+        <w:ind w:right="-1531"/>
+        <w:jc w:val="both"/>
+        <w:rPr>
+          <w:rFonts w:ascii="Times New Roman" w:hAnsi="Times New Roman" w:cs="Times New Roman"/>
+          <w:sz w:val="26"/>
+          <w:szCs w:val="26"/>
+        </w:rPr>
+      </w:pPr>
+      <w:r>
+        <w:rPr>
+          <w:rFonts w:ascii="Times New Roman" w:hAnsi="Times New Roman" w:cs="Times New Roman"/>
+          <w:sz w:val="26"/>
+          <w:szCs w:val="26"/>
+        </w:rPr>
+        <w:t>Participated in inter-college Cricket and Football competitions.</w:t>
+      </w:r>
+    </w:p>
+    <w:p>
+      <w:pPr>
+        <w:pStyle w:val="ListParagraph"/>
+        <w:numPr>
+          <w:ilvl w:val="0"/>
+          <w:numId w:val="16"/>
+        </w:numPr>
+        <w:spacing w:after="0"/>
+        <w:ind w:right="-1531"/>
+        <w:jc w:val="both"/>
+        <w:rPr>
+          <w:rFonts w:ascii="Times New Roman" w:hAnsi="Times New Roman" w:cs="Times New Roman"/>
+          <w:sz w:val="26"/>
+          <w:szCs w:val="26"/>
+        </w:rPr>
+      </w:pPr>
+      <w:r>
+        <w:rPr>
+          <w:rFonts w:ascii="Times New Roman" w:hAnsi="Times New Roman" w:cs="Times New Roman"/>
+          <w:sz w:val="26"/>
+          <w:szCs w:val="26"/>
+        </w:rPr>
+        <w:t>Participated in college cultural festivals and annual gathering events.</w:t>
+      </w:r>
+    </w:p>
+    <w:p>
+      <w:pPr>
+        <w:spacing w:after="0"/>
+        <w:ind w:right="-1531"/>
+        <w:jc w:val="both"/>
+        <w:rPr>
+          <w:rFonts w:ascii="Times New Roman" w:hAnsi="Times New Roman" w:cs="Times New Roman"/>
+          <w:sz w:val="26"/>
+          <w:szCs w:val="26"/>
+        </w:rPr>
+      </w:pPr>
+    </w:p>
+    <w:p>
+      <w:pPr>
+        <w:spacing w:after="0"/>
+        <w:ind w:left="-794" w:right="-794"/>
+        <w:jc w:val="both"/>
+        <w:rPr>
+          <w:rFonts w:ascii="Times New Roman" w:hAnsi="Times New Roman" w:cs="Times New Roman"/>
+          <w:b/>
+          <w:bCs/>
+          <w:sz w:val="30"/>
+          <w:szCs w:val="30"/>
+        </w:rPr>
+      </w:pPr>
+      <w:r>
+        <w:rPr>
+          <w:rFonts w:ascii="Times New Roman" w:hAnsi="Times New Roman" w:cs="Times New Roman"/>
+          <w:b/>
+          <w:bCs/>
+          <w:sz w:val="30"/>
+          <w:szCs w:val="30"/>
+        </w:rPr>
+        <w:t>LANGUAGE</w:t>
+      </w:r>
+    </w:p>
+    <w:p>
+      <w:pPr>
+        <w:pStyle w:val="ListParagraph"/>
+        <w:numPr>
+          <w:ilvl w:val="0"/>
+          <w:numId w:val="20"/>
+        </w:numPr>
+        <w:spacing w:after="0"/>
+        <w:jc w:val="both"/>
         <w:rPr>
           <w:rFonts w:ascii="Times New Roman" w:hAnsi="Times New Roman" w:cs="Times New Roman"/>
           <w:sz w:val="24"/>
@@ -912,7 +1942,7 @@
           <w:sz w:val="24"/>
           <w:szCs w:val="24"/>
         </w:rPr>
-        <w:t>Data Dictionary</w:t>
+        <w:t>English</w:t>
       </w:r>
       <w:r>
         <w:rPr>
@@ -930,158 +1960,83 @@
         </w:rPr>
         <w:tab/>
       </w:r>
-      <w:r>
+    </w:p>
+    <w:p>
+      <w:pPr>
+        <w:pStyle w:val="ListParagraph"/>
+        <w:numPr>
+          <w:ilvl w:val="0"/>
+          <w:numId w:val="20"/>
+        </w:numPr>
+        <w:spacing w:after="0"/>
+        <w:jc w:val="both"/>
         <w:rPr>
           <w:rFonts w:ascii="Times New Roman" w:hAnsi="Times New Roman" w:cs="Times New Roman"/>
           <w:sz w:val="24"/>
           <w:szCs w:val="24"/>
         </w:rPr>
-        <w:tab/>
-      </w:r>
+      </w:pPr>
       <w:r>
         <w:rPr>
           <w:rFonts w:ascii="Times New Roman" w:hAnsi="Times New Roman" w:cs="Times New Roman"/>
           <w:sz w:val="24"/>
           <w:szCs w:val="24"/>
         </w:rPr>
+        <w:t>Marathi</w:t>
+      </w:r>
+      <w:r>
+        <w:rPr>
+          <w:rFonts w:ascii="Times New Roman" w:hAnsi="Times New Roman" w:cs="Times New Roman"/>
+          <w:sz w:val="24"/>
+          <w:szCs w:val="24"/>
+        </w:rPr>
         <w:tab/>
-        <w:t>-   BAPI</w:t>
-      </w:r>
-    </w:p>
-    <w:p>
-      <w:pPr>
+      </w:r>
+      <w:r>
+        <w:rPr>
+          <w:rFonts w:ascii="Times New Roman" w:hAnsi="Times New Roman" w:cs="Times New Roman"/>
+          <w:sz w:val="24"/>
+          <w:szCs w:val="24"/>
+        </w:rPr>
+        <w:tab/>
+      </w:r>
+      <w:r>
+        <w:rPr>
+          <w:rFonts w:ascii="Times New Roman" w:hAnsi="Times New Roman" w:cs="Times New Roman"/>
+          <w:sz w:val="24"/>
+          <w:szCs w:val="24"/>
+        </w:rPr>
+        <w:tab/>
+      </w:r>
+    </w:p>
+    <w:p>
+      <w:pPr>
+        <w:pStyle w:val="ListParagraph"/>
+        <w:numPr>
+          <w:ilvl w:val="0"/>
+          <w:numId w:val="20"/>
+        </w:numPr>
         <w:spacing w:after="0"/>
-        <w:ind w:left="-794"/>
-        <w:rPr>
-          <w:rFonts w:ascii="Times New Roman" w:hAnsi="Times New Roman" w:cs="Times New Roman"/>
-          <w:b/>
-          <w:bCs/>
-          <w:sz w:val="28"/>
-          <w:szCs w:val="28"/>
-        </w:rPr>
-      </w:pPr>
-    </w:p>
-    <w:p>
-      <w:pPr>
-        <w:spacing w:after="0"/>
-        <w:ind w:left="-794"/>
-        <w:rPr>
-          <w:rFonts w:ascii="Times New Roman" w:hAnsi="Times New Roman" w:cs="Times New Roman"/>
-          <w:b/>
-          <w:bCs/>
-          <w:sz w:val="28"/>
-          <w:szCs w:val="28"/>
-        </w:rPr>
-      </w:pPr>
-      <w:r>
-        <w:rPr>
-          <w:rFonts w:ascii="Times New Roman" w:hAnsi="Times New Roman" w:cs="Times New Roman"/>
-          <w:b/>
-          <w:bCs/>
-          <w:sz w:val="28"/>
-          <w:szCs w:val="28"/>
-        </w:rPr>
-        <w:t>STRENGTHS</w:t>
-      </w:r>
-    </w:p>
-    <w:p>
-      <w:pPr>
-        <w:spacing w:after="0"/>
-        <w:ind w:left="-794"/>
-        <w:rPr>
-          <w:rFonts w:ascii="Times New Roman" w:hAnsi="Times New Roman" w:cs="Times New Roman"/>
-          <w:sz w:val="28"/>
-          <w:szCs w:val="28"/>
-        </w:rPr>
-      </w:pPr>
-      <w:r>
-        <w:rPr>
-          <w:rFonts w:ascii="Times New Roman" w:hAnsi="Times New Roman" w:cs="Times New Roman"/>
-          <w:sz w:val="28"/>
-          <w:szCs w:val="28"/>
-        </w:rPr>
-        <w:t>Strong analytical skill</w:t>
-      </w:r>
-    </w:p>
-    <w:p>
-      <w:pPr>
-        <w:spacing w:after="0"/>
-        <w:ind w:left="-794"/>
-        <w:rPr>
-          <w:rFonts w:ascii="Times New Roman" w:hAnsi="Times New Roman" w:cs="Times New Roman"/>
-          <w:sz w:val="28"/>
-          <w:szCs w:val="28"/>
-        </w:rPr>
-      </w:pPr>
-      <w:r>
-        <w:rPr>
-          <w:rFonts w:ascii="Times New Roman" w:hAnsi="Times New Roman" w:cs="Times New Roman"/>
-          <w:sz w:val="28"/>
-          <w:szCs w:val="28"/>
-        </w:rPr>
-        <w:t xml:space="preserve"> Problem-solving new technologies</w:t>
-      </w:r>
-    </w:p>
-    <w:p>
-      <w:pPr>
-        <w:spacing w:after="0"/>
-        <w:ind w:left="-794"/>
-        <w:rPr>
-          <w:rFonts w:ascii="Times New Roman" w:hAnsi="Times New Roman" w:cs="Times New Roman"/>
-          <w:sz w:val="28"/>
-          <w:szCs w:val="28"/>
-        </w:rPr>
-      </w:pPr>
-      <w:r>
-        <w:rPr>
-          <w:rFonts w:ascii="Times New Roman" w:hAnsi="Times New Roman" w:cs="Times New Roman"/>
-          <w:sz w:val="28"/>
-          <w:szCs w:val="28"/>
-        </w:rPr>
-        <w:t xml:space="preserve"> Adaptability to new technologies</w:t>
-      </w:r>
-    </w:p>
-    <w:p>
-      <w:pPr>
-        <w:spacing w:after="0"/>
-        <w:ind w:left="-794"/>
-        <w:rPr>
-          <w:rFonts w:ascii="Times New Roman" w:hAnsi="Times New Roman" w:cs="Times New Roman"/>
-          <w:spacing w:val="-2"/>
-        </w:rPr>
-      </w:pPr>
-      <w:r>
-        <w:rPr>
-          <w:rFonts w:ascii="Times New Roman" w:hAnsi="Times New Roman" w:cs="Times New Roman"/>
-          <w:sz w:val="28"/>
-          <w:szCs w:val="28"/>
-        </w:rPr>
-        <w:t xml:space="preserve"> Strong debugging Knowledge</w:t>
-      </w:r>
-      <w:r>
-        <w:rPr>
-          <w:rFonts w:ascii="Times New Roman" w:hAnsi="Times New Roman" w:cs="Times New Roman"/>
-          <w:spacing w:val="-2"/>
-        </w:rPr>
-        <w:t xml:space="preserve"> </w:t>
-      </w:r>
-    </w:p>
-    <w:p>
-      <w:pPr>
-        <w:spacing w:after="0"/>
-        <w:ind w:left="-794"/>
-        <w:rPr>
-          <w:rFonts w:ascii="Times New Roman" w:hAnsi="Times New Roman" w:cs="Times New Roman"/>
-          <w:b/>
-          <w:bCs/>
-          <w:sz w:val="28"/>
-          <w:szCs w:val="28"/>
-        </w:rPr>
-      </w:pPr>
+        <w:jc w:val="both"/>
+        <w:rPr>
+          <w:rFonts w:ascii="Times New Roman" w:hAnsi="Times New Roman" w:cs="Times New Roman"/>
+          <w:sz w:val="24"/>
+          <w:szCs w:val="24"/>
+        </w:rPr>
+      </w:pPr>
+      <w:r>
+        <w:rPr>
+          <w:rFonts w:ascii="Times New Roman" w:hAnsi="Times New Roman" w:cs="Times New Roman"/>
+          <w:sz w:val="24"/>
+          <w:szCs w:val="24"/>
+        </w:rPr>
+        <w:t>Hindi</w:t>
+      </w:r>
     </w:p>
     <w:sectPr>
+      <w:footerReference w:type="default" r:id="rId18"/>
       <w:pgSz w:w="11906" w:h="16838"/>
-      <w:pgMar w:top="-113" w:right="1440" w:bottom="1440" w:left="1440" w:header="709" w:footer="709" w:gutter="0"/>
+      <w:pgMar w:top="-113" w:right="1440" w:bottom="1440" w:left="1440" w:header="0" w:footer="113" w:gutter="0"/>
       <w:cols w:space="708"/>
       <w:docGrid w:linePitch="360"/>
     </w:sectPr>
@@ -1089,9 +2044,209 @@
 </w:document>
 </file>
 
+<file path=word/endnotes.xml><?xml version="1.0" encoding="utf-8"?>
+<w:endnotes xmlns:wpc="http://schemas.microsoft.com/office/word/2010/wordprocessingCanvas" xmlns:cx="http://schemas.microsoft.com/office/drawing/2014/chartex" xmlns:cx1="http://schemas.microsoft.com/office/drawing/2015/9/8/chartex" xmlns:cx2="http://schemas.microsoft.com/office/drawing/2015/10/21/chartex" xmlns:cx3="http://schemas.microsoft.com/office/drawing/2016/5/9/chartex" xmlns:cx4="http://schemas.microsoft.com/office/drawing/2016/5/10/chartex" xmlns:cx5="http://schemas.microsoft.com/office/drawing/2016/5/11/chartex" xmlns:cx6="http://schemas.microsoft.com/office/drawing/2016/5/12/chartex" xmlns:cx7="http://schemas.microsoft.com/office/drawing/2016/5/13/chartex" xmlns:cx8="http://schemas.microsoft.com/office/drawing/2016/5/14/chartex" xmlns:mc="http://schemas.openxmlformats.org/markup-compatibility/2006" xmlns:aink="http://schemas.microsoft.com/office/drawing/2016/ink" xmlns:am3d="http://schemas.microsoft.com/office/drawing/2017/model3d" xmlns:o="urn:schemas-microsoft-com:office:office" xmlns:oel="http://schemas.microsoft.com/office/2019/extlst" xmlns:r="http://schemas.openxmlformats.org/officeDocument/2006/relationships" xmlns:m="http://schemas.openxmlformats.org/officeDocument/2006/math" xmlns:v="urn:schemas-microsoft-com:vml" xmlns:wp14="http://schemas.microsoft.com/office/word/2010/wordprocessingDrawing" xmlns:wp="http://schemas.openxmlformats.org/drawingml/2006/wordprocessingDrawing" xmlns:w10="urn:schemas-microsoft-com:office:word" xmlns:w="http://schemas.openxmlformats.org/wordprocessingml/2006/main" xmlns:w14="http://schemas.microsoft.com/office/word/2010/wordml" xmlns:w15="http://schemas.microsoft.com/office/word/2012/wordml" xmlns:w16cex="http://schemas.microsoft.com/office/word/2018/wordml/cex" xmlns:w16cid="http://schemas.microsoft.com/office/word/2016/wordml/cid" xmlns:w16="http://schemas.microsoft.com/office/word/2018/wordml" xmlns:w16du="http://schemas.microsoft.com/office/word/2023/wordml/word16du" xmlns:w16sdtdh="http://schemas.microsoft.com/office/word/2020/wordml/sdtdatahash" xmlns:w16sdtfl="http://schemas.microsoft.com/office/word/2024/wordml/sdtformatlock" xmlns:w16se="http://schemas.microsoft.com/office/word/2015/wordml/symex" xmlns:wpg="http://schemas.microsoft.com/office/word/2010/wordprocessingGroup" xmlns:wpi="http://schemas.microsoft.com/office/word/2010/wordprocessingInk" xmlns:wne="http://schemas.microsoft.com/office/word/2006/wordml" xmlns:wps="http://schemas.microsoft.com/office/word/2010/wordprocessingShape" mc:Ignorable="w14 w15 w16se w16cid w16 w16cex w16sdtdh w16sdtfl w16du wp14">
+  <w:endnote w:type="separator" w:id="-1">
+    <w:p>
+      <w:pPr>
+        <w:spacing w:after="0" w:line="240" w:lineRule="auto"/>
+      </w:pPr>
+      <w:r>
+        <w:separator/>
+      </w:r>
+    </w:p>
+  </w:endnote>
+  <w:endnote w:type="continuationSeparator" w:id="0">
+    <w:p>
+      <w:pPr>
+        <w:spacing w:after="0" w:line="240" w:lineRule="auto"/>
+      </w:pPr>
+      <w:r>
+        <w:continuationSeparator/>
+      </w:r>
+    </w:p>
+  </w:endnote>
+</w:endnotes>
+</file>
+
+<file path=word/footer1.xml><?xml version="1.0" encoding="utf-8"?>
+<w:ftr xmlns:wpc="http://schemas.microsoft.com/office/word/2010/wordprocessingCanvas" xmlns:cx="http://schemas.microsoft.com/office/drawing/2014/chartex" xmlns:cx1="http://schemas.microsoft.com/office/drawing/2015/9/8/chartex" xmlns:cx2="http://schemas.microsoft.com/office/drawing/2015/10/21/chartex" xmlns:cx3="http://schemas.microsoft.com/office/drawing/2016/5/9/chartex" xmlns:cx4="http://schemas.microsoft.com/office/drawing/2016/5/10/chartex" xmlns:cx5="http://schemas.microsoft.com/office/drawing/2016/5/11/chartex" xmlns:cx6="http://schemas.microsoft.com/office/drawing/2016/5/12/chartex" xmlns:cx7="http://schemas.microsoft.com/office/drawing/2016/5/13/chartex" xmlns:cx8="http://schemas.microsoft.com/office/drawing/2016/5/14/chartex" xmlns:mc="http://schemas.openxmlformats.org/markup-compatibility/2006" xmlns:aink="http://schemas.microsoft.com/office/drawing/2016/ink" xmlns:am3d="http://schemas.microsoft.com/office/drawing/2017/model3d" xmlns:o="urn:schemas-microsoft-com:office:office" xmlns:oel="http://schemas.microsoft.com/office/2019/extlst" xmlns:r="http://schemas.openxmlformats.org/officeDocument/2006/relationships" xmlns:m="http://schemas.openxmlformats.org/officeDocument/2006/math" xmlns:v="urn:schemas-microsoft-com:vml" xmlns:wp14="http://schemas.microsoft.com/office/word/2010/wordprocessingDrawing" xmlns:wp="http://schemas.openxmlformats.org/drawingml/2006/wordprocessingDrawing" xmlns:w10="urn:schemas-microsoft-com:office:word" xmlns:w="http://schemas.openxmlformats.org/wordprocessingml/2006/main" xmlns:w14="http://schemas.microsoft.com/office/word/2010/wordml" xmlns:w15="http://schemas.microsoft.com/office/word/2012/wordml" xmlns:w16cex="http://schemas.microsoft.com/office/word/2018/wordml/cex" xmlns:w16cid="http://schemas.microsoft.com/office/word/2016/wordml/cid" xmlns:w16="http://schemas.microsoft.com/office/word/2018/wordml" xmlns:w16du="http://schemas.microsoft.com/office/word/2023/wordml/word16du" xmlns:w16sdtdh="http://schemas.microsoft.com/office/word/2020/wordml/sdtdatahash" xmlns:w16sdtfl="http://schemas.microsoft.com/office/word/2024/wordml/sdtformatlock" xmlns:w16se="http://schemas.microsoft.com/office/word/2015/wordml/symex" xmlns:wpg="http://schemas.microsoft.com/office/word/2010/wordprocessingGroup" xmlns:wpi="http://schemas.microsoft.com/office/word/2010/wordprocessingInk" xmlns:wne="http://schemas.microsoft.com/office/word/2006/wordml" xmlns:wps="http://schemas.microsoft.com/office/word/2010/wordprocessingShape" mc:Ignorable="w14 w15 w16se w16cid w16 w16cex w16sdtdh w16sdtfl w16du wp14">
+  <w:p>
+    <w:pPr>
+      <w:pStyle w:val="Footer"/>
+    </w:pPr>
+    <w:r>
+      <w:ptab w:relativeTo="margin" w:alignment="right" w:leader="none"/>
+    </w:r>
+    <w:r>
+      <w:t xml:space="preserve">      </w:t>
+    </w:r>
+    <w:r>
+      <w:tab/>
+    </w:r>
+    <w:r>
+      <w:tab/>
+      <w:t xml:space="preserve">          </w:t>
+    </w:r>
+    <w:r>
+      <w:tab/>
+    </w:r>
+    <w:r>
+      <w:tab/>
+    </w:r>
+    <w:r>
+      <w:tab/>
+    </w:r>
+    <w:r>
+      <w:tab/>
+    </w:r>
+    <w:r>
+      <w:tab/>
+    </w:r>
+  </w:p>
+</w:ftr>
+</file>
+
+<file path=word/footnotes.xml><?xml version="1.0" encoding="utf-8"?>
+<w:footnotes xmlns:wpc="http://schemas.microsoft.com/office/word/2010/wordprocessingCanvas" xmlns:cx="http://schemas.microsoft.com/office/drawing/2014/chartex" xmlns:cx1="http://schemas.microsoft.com/office/drawing/2015/9/8/chartex" xmlns:cx2="http://schemas.microsoft.com/office/drawing/2015/10/21/chartex" xmlns:cx3="http://schemas.microsoft.com/office/drawing/2016/5/9/chartex" xmlns:cx4="http://schemas.microsoft.com/office/drawing/2016/5/10/chartex" xmlns:cx5="http://schemas.microsoft.com/office/drawing/2016/5/11/chartex" xmlns:cx6="http://schemas.microsoft.com/office/drawing/2016/5/12/chartex" xmlns:cx7="http://schemas.microsoft.com/office/drawing/2016/5/13/chartex" xmlns:cx8="http://schemas.microsoft.com/office/drawing/2016/5/14/chartex" xmlns:mc="http://schemas.openxmlformats.org/markup-compatibility/2006" xmlns:aink="http://schemas.microsoft.com/office/drawing/2016/ink" xmlns:am3d="http://schemas.microsoft.com/office/drawing/2017/model3d" xmlns:o="urn:schemas-microsoft-com:office:office" xmlns:oel="http://schemas.microsoft.com/office/2019/extlst" xmlns:r="http://schemas.openxmlformats.org/officeDocument/2006/relationships" xmlns:m="http://schemas.openxmlformats.org/officeDocument/2006/math" xmlns:v="urn:schemas-microsoft-com:vml" xmlns:wp14="http://schemas.microsoft.com/office/word/2010/wordprocessingDrawing" xmlns:wp="http://schemas.openxmlformats.org/drawingml/2006/wordprocessingDrawing" xmlns:w10="urn:schemas-microsoft-com:office:word" xmlns:w="http://schemas.openxmlformats.org/wordprocessingml/2006/main" xmlns:w14="http://schemas.microsoft.com/office/word/2010/wordml" xmlns:w15="http://schemas.microsoft.com/office/word/2012/wordml" xmlns:w16cex="http://schemas.microsoft.com/office/word/2018/wordml/cex" xmlns:w16cid="http://schemas.microsoft.com/office/word/2016/wordml/cid" xmlns:w16="http://schemas.microsoft.com/office/word/2018/wordml" xmlns:w16du="http://schemas.microsoft.com/office/word/2023/wordml/word16du" xmlns:w16sdtdh="http://schemas.microsoft.com/office/word/2020/wordml/sdtdatahash" xmlns:w16sdtfl="http://schemas.microsoft.com/office/word/2024/wordml/sdtformatlock" xmlns:w16se="http://schemas.microsoft.com/office/word/2015/wordml/symex" xmlns:wpg="http://schemas.microsoft.com/office/word/2010/wordprocessingGroup" xmlns:wpi="http://schemas.microsoft.com/office/word/2010/wordprocessingInk" xmlns:wne="http://schemas.microsoft.com/office/word/2006/wordml" xmlns:wps="http://schemas.microsoft.com/office/word/2010/wordprocessingShape" mc:Ignorable="w14 w15 w16se w16cid w16 w16cex w16sdtdh w16sdtfl w16du wp14">
+  <w:footnote w:type="separator" w:id="-1">
+    <w:p>
+      <w:pPr>
+        <w:spacing w:after="0" w:line="240" w:lineRule="auto"/>
+      </w:pPr>
+      <w:r>
+        <w:separator/>
+      </w:r>
+    </w:p>
+  </w:footnote>
+  <w:footnote w:type="continuationSeparator" w:id="0">
+    <w:p>
+      <w:pPr>
+        <w:spacing w:after="0" w:line="240" w:lineRule="auto"/>
+      </w:pPr>
+      <w:r>
+        <w:continuationSeparator/>
+      </w:r>
+    </w:p>
+  </w:footnote>
+</w:footnotes>
+</file>
+
 <file path=word/numbering.xml><?xml version="1.0" encoding="utf-8"?>
 <w:numbering xmlns:wpc="http://schemas.microsoft.com/office/word/2010/wordprocessingCanvas" xmlns:cx="http://schemas.microsoft.com/office/drawing/2014/chartex" xmlns:cx1="http://schemas.microsoft.com/office/drawing/2015/9/8/chartex" xmlns:cx2="http://schemas.microsoft.com/office/drawing/2015/10/21/chartex" xmlns:cx3="http://schemas.microsoft.com/office/drawing/2016/5/9/chartex" xmlns:cx4="http://schemas.microsoft.com/office/drawing/2016/5/10/chartex" xmlns:cx5="http://schemas.microsoft.com/office/drawing/2016/5/11/chartex" xmlns:cx6="http://schemas.microsoft.com/office/drawing/2016/5/12/chartex" xmlns:cx7="http://schemas.microsoft.com/office/drawing/2016/5/13/chartex" xmlns:cx8="http://schemas.microsoft.com/office/drawing/2016/5/14/chartex" xmlns:mc="http://schemas.openxmlformats.org/markup-compatibility/2006" xmlns:aink="http://schemas.microsoft.com/office/drawing/2016/ink" xmlns:am3d="http://schemas.microsoft.com/office/drawing/2017/model3d" xmlns:o="urn:schemas-microsoft-com:office:office" xmlns:oel="http://schemas.microsoft.com/office/2019/extlst" xmlns:r="http://schemas.openxmlformats.org/officeDocument/2006/relationships" xmlns:m="http://schemas.openxmlformats.org/officeDocument/2006/math" xmlns:v="urn:schemas-microsoft-com:vml" xmlns:wp14="http://schemas.microsoft.com/office/word/2010/wordprocessingDrawing" xmlns:wp="http://schemas.openxmlformats.org/drawingml/2006/wordprocessingDrawing" xmlns:w10="urn:schemas-microsoft-com:office:word" xmlns:w="http://schemas.openxmlformats.org/wordprocessingml/2006/main" xmlns:w14="http://schemas.microsoft.com/office/word/2010/wordml" xmlns:w15="http://schemas.microsoft.com/office/word/2012/wordml" xmlns:w16cex="http://schemas.microsoft.com/office/word/2018/wordml/cex" xmlns:w16cid="http://schemas.microsoft.com/office/word/2016/wordml/cid" xmlns:w16="http://schemas.microsoft.com/office/word/2018/wordml" xmlns:w16du="http://schemas.microsoft.com/office/word/2023/wordml/word16du" xmlns:w16sdtdh="http://schemas.microsoft.com/office/word/2020/wordml/sdtdatahash" xmlns:w16sdtfl="http://schemas.microsoft.com/office/word/2024/wordml/sdtformatlock" xmlns:w16se="http://schemas.microsoft.com/office/word/2015/wordml/symex" xmlns:wpg="http://schemas.microsoft.com/office/word/2010/wordprocessingGroup" xmlns:wpi="http://schemas.microsoft.com/office/word/2010/wordprocessingInk" xmlns:wne="http://schemas.microsoft.com/office/word/2006/wordml" xmlns:wps="http://schemas.microsoft.com/office/word/2010/wordprocessingShape" mc:Ignorable="w14 w15 w16se w16cid w16 w16cex w16sdtdh w16sdtfl w16du wp14">
   <w:abstractNum w:abstractNumId="0" w15:restartNumberingAfterBreak="0">
+    <w:nsid w:val="01862C8E"/>
+    <w:multiLevelType w:val="hybridMultilevel"/>
+    <w:tmpl w:val="544C6A38"/>
+    <w:lvl w:ilvl="0" w:tplc="83B07E3C">
+      <w:numFmt w:val="bullet"/>
+      <w:lvlText w:val="-"/>
+      <w:lvlJc w:val="left"/>
+      <w:pPr>
+        <w:ind w:left="1080" w:hanging="360"/>
+      </w:pPr>
+      <w:rPr>
+        <w:rFonts w:ascii="Times New Roman" w:eastAsiaTheme="minorHAnsi" w:hAnsi="Times New Roman" w:cs="Times New Roman" w:hint="default"/>
+      </w:rPr>
+    </w:lvl>
+    <w:lvl w:ilvl="1" w:tplc="40090003" w:tentative="1">
+      <w:start w:val="1"/>
+      <w:numFmt w:val="bullet"/>
+      <w:lvlText w:val="o"/>
+      <w:lvlJc w:val="left"/>
+      <w:pPr>
+        <w:ind w:left="1800" w:hanging="360"/>
+      </w:pPr>
+      <w:rPr>
+        <w:rFonts w:ascii="Courier New" w:hAnsi="Courier New" w:cs="Courier New" w:hint="default"/>
+      </w:rPr>
+    </w:lvl>
+    <w:lvl w:ilvl="2" w:tplc="40090005" w:tentative="1">
+      <w:start w:val="1"/>
+      <w:numFmt w:val="bullet"/>
+      <w:lvlText w:val=""/>
+      <w:lvlJc w:val="left"/>
+      <w:pPr>
+        <w:ind w:left="2520" w:hanging="360"/>
+      </w:pPr>
+      <w:rPr>
+        <w:rFonts w:ascii="Wingdings" w:hAnsi="Wingdings" w:hint="default"/>
+      </w:rPr>
+    </w:lvl>
+    <w:lvl w:ilvl="3" w:tplc="40090001" w:tentative="1">
+      <w:start w:val="1"/>
+      <w:numFmt w:val="bullet"/>
+      <w:lvlText w:val=""/>
+      <w:lvlJc w:val="left"/>
+      <w:pPr>
+        <w:ind w:left="3240" w:hanging="360"/>
+      </w:pPr>
+      <w:rPr>
+        <w:rFonts w:ascii="Symbol" w:hAnsi="Symbol" w:hint="default"/>
+      </w:rPr>
+    </w:lvl>
+    <w:lvl w:ilvl="4" w:tplc="40090003" w:tentative="1">
+      <w:start w:val="1"/>
+      <w:numFmt w:val="bullet"/>
+      <w:lvlText w:val="o"/>
+      <w:lvlJc w:val="left"/>
+      <w:pPr>
+        <w:ind w:left="3960" w:hanging="360"/>
+      </w:pPr>
+      <w:rPr>
+        <w:rFonts w:ascii="Courier New" w:hAnsi="Courier New" w:cs="Courier New" w:hint="default"/>
+      </w:rPr>
+    </w:lvl>
+    <w:lvl w:ilvl="5" w:tplc="40090005" w:tentative="1">
+      <w:start w:val="1"/>
+      <w:numFmt w:val="bullet"/>
+      <w:lvlText w:val=""/>
+      <w:lvlJc w:val="left"/>
+      <w:pPr>
+        <w:ind w:left="4680" w:hanging="360"/>
+      </w:pPr>
+      <w:rPr>
+        <w:rFonts w:ascii="Wingdings" w:hAnsi="Wingdings" w:hint="default"/>
+      </w:rPr>
+    </w:lvl>
+    <w:lvl w:ilvl="6" w:tplc="40090001" w:tentative="1">
+      <w:start w:val="1"/>
+      <w:numFmt w:val="bullet"/>
+      <w:lvlText w:val=""/>
+      <w:lvlJc w:val="left"/>
+      <w:pPr>
+        <w:ind w:left="5400" w:hanging="360"/>
+      </w:pPr>
+      <w:rPr>
+        <w:rFonts w:ascii="Symbol" w:hAnsi="Symbol" w:hint="default"/>
+      </w:rPr>
+    </w:lvl>
+    <w:lvl w:ilvl="7" w:tplc="40090003" w:tentative="1">
+      <w:start w:val="1"/>
+      <w:numFmt w:val="bullet"/>
+      <w:lvlText w:val="o"/>
+      <w:lvlJc w:val="left"/>
+      <w:pPr>
+        <w:ind w:left="6120" w:hanging="360"/>
+      </w:pPr>
+      <w:rPr>
+        <w:rFonts w:ascii="Courier New" w:hAnsi="Courier New" w:cs="Courier New" w:hint="default"/>
+      </w:rPr>
+    </w:lvl>
+    <w:lvl w:ilvl="8" w:tplc="40090005" w:tentative="1">
+      <w:start w:val="1"/>
+      <w:numFmt w:val="bullet"/>
+      <w:lvlText w:val=""/>
+      <w:lvlJc w:val="left"/>
+      <w:pPr>
+        <w:ind w:left="6840" w:hanging="360"/>
+      </w:pPr>
+      <w:rPr>
+        <w:rFonts w:ascii="Wingdings" w:hAnsi="Wingdings" w:hint="default"/>
+      </w:rPr>
+    </w:lvl>
+  </w:abstractNum>
+  <w:abstractNum w:abstractNumId="1" w15:restartNumberingAfterBreak="0">
     <w:nsid w:val="03D5288D"/>
     <w:multiLevelType w:val="hybridMultilevel"/>
     <w:tmpl w:val="5406DA60"/>
@@ -1204,7 +2359,119 @@
       </w:rPr>
     </w:lvl>
   </w:abstractNum>
-  <w:abstractNum w:abstractNumId="1" w15:restartNumberingAfterBreak="0">
+  <w:abstractNum w:abstractNumId="2" w15:restartNumberingAfterBreak="0">
+    <w:nsid w:val="0E6F77C6"/>
+    <w:multiLevelType w:val="hybridMultilevel"/>
+    <w:tmpl w:val="3E2C836E"/>
+    <w:lvl w:ilvl="0" w:tplc="388CD2CA">
+      <w:numFmt w:val="bullet"/>
+      <w:lvlText w:val="-"/>
+      <w:lvlJc w:val="left"/>
+      <w:pPr>
+        <w:ind w:left="720" w:hanging="360"/>
+      </w:pPr>
+      <w:rPr>
+        <w:rFonts w:ascii="Times New Roman" w:eastAsiaTheme="minorHAnsi" w:hAnsi="Times New Roman" w:cs="Times New Roman" w:hint="default"/>
+      </w:rPr>
+    </w:lvl>
+    <w:lvl w:ilvl="1" w:tplc="40090003" w:tentative="1">
+      <w:start w:val="1"/>
+      <w:numFmt w:val="bullet"/>
+      <w:lvlText w:val="o"/>
+      <w:lvlJc w:val="left"/>
+      <w:pPr>
+        <w:ind w:left="1440" w:hanging="360"/>
+      </w:pPr>
+      <w:rPr>
+        <w:rFonts w:ascii="Courier New" w:hAnsi="Courier New" w:cs="Courier New" w:hint="default"/>
+      </w:rPr>
+    </w:lvl>
+    <w:lvl w:ilvl="2" w:tplc="40090005" w:tentative="1">
+      <w:start w:val="1"/>
+      <w:numFmt w:val="bullet"/>
+      <w:lvlText w:val=""/>
+      <w:lvlJc w:val="left"/>
+      <w:pPr>
+        <w:ind w:left="2160" w:hanging="360"/>
+      </w:pPr>
+      <w:rPr>
+        <w:rFonts w:ascii="Wingdings" w:hAnsi="Wingdings" w:hint="default"/>
+      </w:rPr>
+    </w:lvl>
+    <w:lvl w:ilvl="3" w:tplc="40090001" w:tentative="1">
+      <w:start w:val="1"/>
+      <w:numFmt w:val="bullet"/>
+      <w:lvlText w:val=""/>
+      <w:lvlJc w:val="left"/>
+      <w:pPr>
+        <w:ind w:left="2880" w:hanging="360"/>
+      </w:pPr>
+      <w:rPr>
+        <w:rFonts w:ascii="Symbol" w:hAnsi="Symbol" w:hint="default"/>
+      </w:rPr>
+    </w:lvl>
+    <w:lvl w:ilvl="4" w:tplc="40090003" w:tentative="1">
+      <w:start w:val="1"/>
+      <w:numFmt w:val="bullet"/>
+      <w:lvlText w:val="o"/>
+      <w:lvlJc w:val="left"/>
+      <w:pPr>
+        <w:ind w:left="3600" w:hanging="360"/>
+      </w:pPr>
+      <w:rPr>
+        <w:rFonts w:ascii="Courier New" w:hAnsi="Courier New" w:cs="Courier New" w:hint="default"/>
+      </w:rPr>
+    </w:lvl>
+    <w:lvl w:ilvl="5" w:tplc="40090005" w:tentative="1">
+      <w:start w:val="1"/>
+      <w:numFmt w:val="bullet"/>
+      <w:lvlText w:val=""/>
+      <w:lvlJc w:val="left"/>
+      <w:pPr>
+        <w:ind w:left="4320" w:hanging="360"/>
+      </w:pPr>
+      <w:rPr>
+        <w:rFonts w:ascii="Wingdings" w:hAnsi="Wingdings" w:hint="default"/>
+      </w:rPr>
+    </w:lvl>
+    <w:lvl w:ilvl="6" w:tplc="40090001" w:tentative="1">
+      <w:start w:val="1"/>
+      <w:numFmt w:val="bullet"/>
+      <w:lvlText w:val=""/>
+      <w:lvlJc w:val="left"/>
+      <w:pPr>
+        <w:ind w:left="5040" w:hanging="360"/>
+      </w:pPr>
+      <w:rPr>
+        <w:rFonts w:ascii="Symbol" w:hAnsi="Symbol" w:hint="default"/>
+      </w:rPr>
+    </w:lvl>
+    <w:lvl w:ilvl="7" w:tplc="40090003" w:tentative="1">
+      <w:start w:val="1"/>
+      <w:numFmt w:val="bullet"/>
+      <w:lvlText w:val="o"/>
+      <w:lvlJc w:val="left"/>
+      <w:pPr>
+        <w:ind w:left="5760" w:hanging="360"/>
+      </w:pPr>
+      <w:rPr>
+        <w:rFonts w:ascii="Courier New" w:hAnsi="Courier New" w:cs="Courier New" w:hint="default"/>
+      </w:rPr>
+    </w:lvl>
+    <w:lvl w:ilvl="8" w:tplc="40090005" w:tentative="1">
+      <w:start w:val="1"/>
+      <w:numFmt w:val="bullet"/>
+      <w:lvlText w:val=""/>
+      <w:lvlJc w:val="left"/>
+      <w:pPr>
+        <w:ind w:left="6480" w:hanging="360"/>
+      </w:pPr>
+      <w:rPr>
+        <w:rFonts w:ascii="Wingdings" w:hAnsi="Wingdings" w:hint="default"/>
+      </w:rPr>
+    </w:lvl>
+  </w:abstractNum>
+  <w:abstractNum w:abstractNumId="3" w15:restartNumberingAfterBreak="0">
     <w:nsid w:val="0F0E386B"/>
     <w:multiLevelType w:val="hybridMultilevel"/>
     <w:tmpl w:val="518826E2"/>
@@ -1317,7 +2584,120 @@
       </w:rPr>
     </w:lvl>
   </w:abstractNum>
-  <w:abstractNum w:abstractNumId="2" w15:restartNumberingAfterBreak="0">
+  <w:abstractNum w:abstractNumId="4" w15:restartNumberingAfterBreak="0">
+    <w:nsid w:val="13694FA2"/>
+    <w:multiLevelType w:val="hybridMultilevel"/>
+    <w:tmpl w:val="7B365F26"/>
+    <w:lvl w:ilvl="0" w:tplc="40090001">
+      <w:start w:val="1"/>
+      <w:numFmt w:val="bullet"/>
+      <w:lvlText w:val=""/>
+      <w:lvlJc w:val="left"/>
+      <w:pPr>
+        <w:ind w:left="720" w:hanging="360"/>
+      </w:pPr>
+      <w:rPr>
+        <w:rFonts w:ascii="Symbol" w:hAnsi="Symbol" w:hint="default"/>
+      </w:rPr>
+    </w:lvl>
+    <w:lvl w:ilvl="1" w:tplc="40090003">
+      <w:start w:val="1"/>
+      <w:numFmt w:val="bullet"/>
+      <w:lvlText w:val="o"/>
+      <w:lvlJc w:val="left"/>
+      <w:pPr>
+        <w:ind w:left="1440" w:hanging="360"/>
+      </w:pPr>
+      <w:rPr>
+        <w:rFonts w:ascii="Courier New" w:hAnsi="Courier New" w:cs="Courier New" w:hint="default"/>
+      </w:rPr>
+    </w:lvl>
+    <w:lvl w:ilvl="2" w:tplc="40090005" w:tentative="1">
+      <w:start w:val="1"/>
+      <w:numFmt w:val="bullet"/>
+      <w:lvlText w:val=""/>
+      <w:lvlJc w:val="left"/>
+      <w:pPr>
+        <w:ind w:left="2160" w:hanging="360"/>
+      </w:pPr>
+      <w:rPr>
+        <w:rFonts w:ascii="Wingdings" w:hAnsi="Wingdings" w:hint="default"/>
+      </w:rPr>
+    </w:lvl>
+    <w:lvl w:ilvl="3" w:tplc="40090001" w:tentative="1">
+      <w:start w:val="1"/>
+      <w:numFmt w:val="bullet"/>
+      <w:lvlText w:val=""/>
+      <w:lvlJc w:val="left"/>
+      <w:pPr>
+        <w:ind w:left="2880" w:hanging="360"/>
+      </w:pPr>
+      <w:rPr>
+        <w:rFonts w:ascii="Symbol" w:hAnsi="Symbol" w:hint="default"/>
+      </w:rPr>
+    </w:lvl>
+    <w:lvl w:ilvl="4" w:tplc="40090003" w:tentative="1">
+      <w:start w:val="1"/>
+      <w:numFmt w:val="bullet"/>
+      <w:lvlText w:val="o"/>
+      <w:lvlJc w:val="left"/>
+      <w:pPr>
+        <w:ind w:left="3600" w:hanging="360"/>
+      </w:pPr>
+      <w:rPr>
+        <w:rFonts w:ascii="Courier New" w:hAnsi="Courier New" w:cs="Courier New" w:hint="default"/>
+      </w:rPr>
+    </w:lvl>
+    <w:lvl w:ilvl="5" w:tplc="40090005" w:tentative="1">
+      <w:start w:val="1"/>
+      <w:numFmt w:val="bullet"/>
+      <w:lvlText w:val=""/>
+      <w:lvlJc w:val="left"/>
+      <w:pPr>
+        <w:ind w:left="4320" w:hanging="360"/>
+      </w:pPr>
+      <w:rPr>
+        <w:rFonts w:ascii="Wingdings" w:hAnsi="Wingdings" w:hint="default"/>
+      </w:rPr>
+    </w:lvl>
+    <w:lvl w:ilvl="6" w:tplc="40090001" w:tentative="1">
+      <w:start w:val="1"/>
+      <w:numFmt w:val="bullet"/>
+      <w:lvlText w:val=""/>
+      <w:lvlJc w:val="left"/>
+      <w:pPr>
+        <w:ind w:left="5040" w:hanging="360"/>
+      </w:pPr>
+      <w:rPr>
+        <w:rFonts w:ascii="Symbol" w:hAnsi="Symbol" w:hint="default"/>
+      </w:rPr>
+    </w:lvl>
+    <w:lvl w:ilvl="7" w:tplc="40090003" w:tentative="1">
+      <w:start w:val="1"/>
+      <w:numFmt w:val="bullet"/>
+      <w:lvlText w:val="o"/>
+      <w:lvlJc w:val="left"/>
+      <w:pPr>
+        <w:ind w:left="5760" w:hanging="360"/>
+      </w:pPr>
+      <w:rPr>
+        <w:rFonts w:ascii="Courier New" w:hAnsi="Courier New" w:cs="Courier New" w:hint="default"/>
+      </w:rPr>
+    </w:lvl>
+    <w:lvl w:ilvl="8" w:tplc="40090005" w:tentative="1">
+      <w:start w:val="1"/>
+      <w:numFmt w:val="bullet"/>
+      <w:lvlText w:val=""/>
+      <w:lvlJc w:val="left"/>
+      <w:pPr>
+        <w:ind w:left="6480" w:hanging="360"/>
+      </w:pPr>
+      <w:rPr>
+        <w:rFonts w:ascii="Wingdings" w:hAnsi="Wingdings" w:hint="default"/>
+      </w:rPr>
+    </w:lvl>
+  </w:abstractNum>
+  <w:abstractNum w:abstractNumId="5" w15:restartNumberingAfterBreak="0">
     <w:nsid w:val="1C3C5C58"/>
     <w:multiLevelType w:val="hybridMultilevel"/>
     <w:tmpl w:val="2912FD70"/>
@@ -1430,7 +2810,345 @@
       </w:rPr>
     </w:lvl>
   </w:abstractNum>
-  <w:abstractNum w:abstractNumId="3" w15:restartNumberingAfterBreak="0">
+  <w:abstractNum w:abstractNumId="6" w15:restartNumberingAfterBreak="0">
+    <w:nsid w:val="212946F6"/>
+    <w:multiLevelType w:val="hybridMultilevel"/>
+    <w:tmpl w:val="2EC6CE50"/>
+    <w:lvl w:ilvl="0" w:tplc="40090001">
+      <w:start w:val="1"/>
+      <w:numFmt w:val="bullet"/>
+      <w:lvlText w:val=""/>
+      <w:lvlJc w:val="left"/>
+      <w:pPr>
+        <w:ind w:left="1080" w:hanging="360"/>
+      </w:pPr>
+      <w:rPr>
+        <w:rFonts w:ascii="Symbol" w:hAnsi="Symbol" w:hint="default"/>
+      </w:rPr>
+    </w:lvl>
+    <w:lvl w:ilvl="1" w:tplc="40090003" w:tentative="1">
+      <w:start w:val="1"/>
+      <w:numFmt w:val="bullet"/>
+      <w:lvlText w:val="o"/>
+      <w:lvlJc w:val="left"/>
+      <w:pPr>
+        <w:ind w:left="1800" w:hanging="360"/>
+      </w:pPr>
+      <w:rPr>
+        <w:rFonts w:ascii="Courier New" w:hAnsi="Courier New" w:cs="Courier New" w:hint="default"/>
+      </w:rPr>
+    </w:lvl>
+    <w:lvl w:ilvl="2" w:tplc="40090005" w:tentative="1">
+      <w:start w:val="1"/>
+      <w:numFmt w:val="bullet"/>
+      <w:lvlText w:val=""/>
+      <w:lvlJc w:val="left"/>
+      <w:pPr>
+        <w:ind w:left="2520" w:hanging="360"/>
+      </w:pPr>
+      <w:rPr>
+        <w:rFonts w:ascii="Wingdings" w:hAnsi="Wingdings" w:hint="default"/>
+      </w:rPr>
+    </w:lvl>
+    <w:lvl w:ilvl="3" w:tplc="40090001" w:tentative="1">
+      <w:start w:val="1"/>
+      <w:numFmt w:val="bullet"/>
+      <w:lvlText w:val=""/>
+      <w:lvlJc w:val="left"/>
+      <w:pPr>
+        <w:ind w:left="3240" w:hanging="360"/>
+      </w:pPr>
+      <w:rPr>
+        <w:rFonts w:ascii="Symbol" w:hAnsi="Symbol" w:hint="default"/>
+      </w:rPr>
+    </w:lvl>
+    <w:lvl w:ilvl="4" w:tplc="40090003" w:tentative="1">
+      <w:start w:val="1"/>
+      <w:numFmt w:val="bullet"/>
+      <w:lvlText w:val="o"/>
+      <w:lvlJc w:val="left"/>
+      <w:pPr>
+        <w:ind w:left="3960" w:hanging="360"/>
+      </w:pPr>
+      <w:rPr>
+        <w:rFonts w:ascii="Courier New" w:hAnsi="Courier New" w:cs="Courier New" w:hint="default"/>
+      </w:rPr>
+    </w:lvl>
+    <w:lvl w:ilvl="5" w:tplc="40090005" w:tentative="1">
+      <w:start w:val="1"/>
+      <w:numFmt w:val="bullet"/>
+      <w:lvlText w:val=""/>
+      <w:lvlJc w:val="left"/>
+      <w:pPr>
+        <w:ind w:left="4680" w:hanging="360"/>
+      </w:pPr>
+      <w:rPr>
+        <w:rFonts w:ascii="Wingdings" w:hAnsi="Wingdings" w:hint="default"/>
+      </w:rPr>
+    </w:lvl>
+    <w:lvl w:ilvl="6" w:tplc="40090001" w:tentative="1">
+      <w:start w:val="1"/>
+      <w:numFmt w:val="bullet"/>
+      <w:lvlText w:val=""/>
+      <w:lvlJc w:val="left"/>
+      <w:pPr>
+        <w:ind w:left="5400" w:hanging="360"/>
+      </w:pPr>
+      <w:rPr>
+        <w:rFonts w:ascii="Symbol" w:hAnsi="Symbol" w:hint="default"/>
+      </w:rPr>
+    </w:lvl>
+    <w:lvl w:ilvl="7" w:tplc="40090003" w:tentative="1">
+      <w:start w:val="1"/>
+      <w:numFmt w:val="bullet"/>
+      <w:lvlText w:val="o"/>
+      <w:lvlJc w:val="left"/>
+      <w:pPr>
+        <w:ind w:left="6120" w:hanging="360"/>
+      </w:pPr>
+      <w:rPr>
+        <w:rFonts w:ascii="Courier New" w:hAnsi="Courier New" w:cs="Courier New" w:hint="default"/>
+      </w:rPr>
+    </w:lvl>
+    <w:lvl w:ilvl="8" w:tplc="40090005" w:tentative="1">
+      <w:start w:val="1"/>
+      <w:numFmt w:val="bullet"/>
+      <w:lvlText w:val=""/>
+      <w:lvlJc w:val="left"/>
+      <w:pPr>
+        <w:ind w:left="6840" w:hanging="360"/>
+      </w:pPr>
+      <w:rPr>
+        <w:rFonts w:ascii="Wingdings" w:hAnsi="Wingdings" w:hint="default"/>
+      </w:rPr>
+    </w:lvl>
+  </w:abstractNum>
+  <w:abstractNum w:abstractNumId="7" w15:restartNumberingAfterBreak="0">
+    <w:nsid w:val="22C4725F"/>
+    <w:multiLevelType w:val="hybridMultilevel"/>
+    <w:tmpl w:val="E4E4A734"/>
+    <w:lvl w:ilvl="0" w:tplc="40090001">
+      <w:start w:val="1"/>
+      <w:numFmt w:val="bullet"/>
+      <w:lvlText w:val=""/>
+      <w:lvlJc w:val="left"/>
+      <w:pPr>
+        <w:ind w:left="720" w:hanging="360"/>
+      </w:pPr>
+      <w:rPr>
+        <w:rFonts w:ascii="Symbol" w:hAnsi="Symbol" w:hint="default"/>
+      </w:rPr>
+    </w:lvl>
+    <w:lvl w:ilvl="1" w:tplc="40090003" w:tentative="1">
+      <w:start w:val="1"/>
+      <w:numFmt w:val="bullet"/>
+      <w:lvlText w:val="o"/>
+      <w:lvlJc w:val="left"/>
+      <w:pPr>
+        <w:ind w:left="1440" w:hanging="360"/>
+      </w:pPr>
+      <w:rPr>
+        <w:rFonts w:ascii="Courier New" w:hAnsi="Courier New" w:cs="Courier New" w:hint="default"/>
+      </w:rPr>
+    </w:lvl>
+    <w:lvl w:ilvl="2" w:tplc="40090005" w:tentative="1">
+      <w:start w:val="1"/>
+      <w:numFmt w:val="bullet"/>
+      <w:lvlText w:val=""/>
+      <w:lvlJc w:val="left"/>
+      <w:pPr>
+        <w:ind w:left="2160" w:hanging="360"/>
+      </w:pPr>
+      <w:rPr>
+        <w:rFonts w:ascii="Wingdings" w:hAnsi="Wingdings" w:hint="default"/>
+      </w:rPr>
+    </w:lvl>
+    <w:lvl w:ilvl="3" w:tplc="40090001" w:tentative="1">
+      <w:start w:val="1"/>
+      <w:numFmt w:val="bullet"/>
+      <w:lvlText w:val=""/>
+      <w:lvlJc w:val="left"/>
+      <w:pPr>
+        <w:ind w:left="2880" w:hanging="360"/>
+      </w:pPr>
+      <w:rPr>
+        <w:rFonts w:ascii="Symbol" w:hAnsi="Symbol" w:hint="default"/>
+      </w:rPr>
+    </w:lvl>
+    <w:lvl w:ilvl="4" w:tplc="40090003" w:tentative="1">
+      <w:start w:val="1"/>
+      <w:numFmt w:val="bullet"/>
+      <w:lvlText w:val="o"/>
+      <w:lvlJc w:val="left"/>
+      <w:pPr>
+        <w:ind w:left="3600" w:hanging="360"/>
+      </w:pPr>
+      <w:rPr>
+        <w:rFonts w:ascii="Courier New" w:hAnsi="Courier New" w:cs="Courier New" w:hint="default"/>
+      </w:rPr>
+    </w:lvl>
+    <w:lvl w:ilvl="5" w:tplc="40090005" w:tentative="1">
+      <w:start w:val="1"/>
+      <w:numFmt w:val="bullet"/>
+      <w:lvlText w:val=""/>
+      <w:lvlJc w:val="left"/>
+      <w:pPr>
+        <w:ind w:left="4320" w:hanging="360"/>
+      </w:pPr>
+      <w:rPr>
+        <w:rFonts w:ascii="Wingdings" w:hAnsi="Wingdings" w:hint="default"/>
+      </w:rPr>
+    </w:lvl>
+    <w:lvl w:ilvl="6" w:tplc="40090001" w:tentative="1">
+      <w:start w:val="1"/>
+      <w:numFmt w:val="bullet"/>
+      <w:lvlText w:val=""/>
+      <w:lvlJc w:val="left"/>
+      <w:pPr>
+        <w:ind w:left="5040" w:hanging="360"/>
+      </w:pPr>
+      <w:rPr>
+        <w:rFonts w:ascii="Symbol" w:hAnsi="Symbol" w:hint="default"/>
+      </w:rPr>
+    </w:lvl>
+    <w:lvl w:ilvl="7" w:tplc="40090003" w:tentative="1">
+      <w:start w:val="1"/>
+      <w:numFmt w:val="bullet"/>
+      <w:lvlText w:val="o"/>
+      <w:lvlJc w:val="left"/>
+      <w:pPr>
+        <w:ind w:left="5760" w:hanging="360"/>
+      </w:pPr>
+      <w:rPr>
+        <w:rFonts w:ascii="Courier New" w:hAnsi="Courier New" w:cs="Courier New" w:hint="default"/>
+      </w:rPr>
+    </w:lvl>
+    <w:lvl w:ilvl="8" w:tplc="40090005" w:tentative="1">
+      <w:start w:val="1"/>
+      <w:numFmt w:val="bullet"/>
+      <w:lvlText w:val=""/>
+      <w:lvlJc w:val="left"/>
+      <w:pPr>
+        <w:ind w:left="6480" w:hanging="360"/>
+      </w:pPr>
+      <w:rPr>
+        <w:rFonts w:ascii="Wingdings" w:hAnsi="Wingdings" w:hint="default"/>
+      </w:rPr>
+    </w:lvl>
+  </w:abstractNum>
+  <w:abstractNum w:abstractNumId="8" w15:restartNumberingAfterBreak="0">
+    <w:nsid w:val="254D3DFC"/>
+    <w:multiLevelType w:val="hybridMultilevel"/>
+    <w:tmpl w:val="242E3B0A"/>
+    <w:lvl w:ilvl="0" w:tplc="61B86D8C">
+      <w:numFmt w:val="bullet"/>
+      <w:lvlText w:val="-"/>
+      <w:lvlJc w:val="left"/>
+      <w:pPr>
+        <w:ind w:left="586" w:hanging="360"/>
+      </w:pPr>
+      <w:rPr>
+        <w:rFonts w:ascii="Times New Roman" w:eastAsiaTheme="minorHAnsi" w:hAnsi="Times New Roman" w:cs="Times New Roman" w:hint="default"/>
+      </w:rPr>
+    </w:lvl>
+    <w:lvl w:ilvl="1" w:tplc="40090003" w:tentative="1">
+      <w:start w:val="1"/>
+      <w:numFmt w:val="bullet"/>
+      <w:lvlText w:val="o"/>
+      <w:lvlJc w:val="left"/>
+      <w:pPr>
+        <w:ind w:left="1306" w:hanging="360"/>
+      </w:pPr>
+      <w:rPr>
+        <w:rFonts w:ascii="Courier New" w:hAnsi="Courier New" w:cs="Courier New" w:hint="default"/>
+      </w:rPr>
+    </w:lvl>
+    <w:lvl w:ilvl="2" w:tplc="40090005" w:tentative="1">
+      <w:start w:val="1"/>
+      <w:numFmt w:val="bullet"/>
+      <w:lvlText w:val=""/>
+      <w:lvlJc w:val="left"/>
+      <w:pPr>
+        <w:ind w:left="2026" w:hanging="360"/>
+      </w:pPr>
+      <w:rPr>
+        <w:rFonts w:ascii="Wingdings" w:hAnsi="Wingdings" w:hint="default"/>
+      </w:rPr>
+    </w:lvl>
+    <w:lvl w:ilvl="3" w:tplc="40090001" w:tentative="1">
+      <w:start w:val="1"/>
+      <w:numFmt w:val="bullet"/>
+      <w:lvlText w:val=""/>
+      <w:lvlJc w:val="left"/>
+      <w:pPr>
+        <w:ind w:left="2746" w:hanging="360"/>
+      </w:pPr>
+      <w:rPr>
+        <w:rFonts w:ascii="Symbol" w:hAnsi="Symbol" w:hint="default"/>
+      </w:rPr>
+    </w:lvl>
+    <w:lvl w:ilvl="4" w:tplc="40090003" w:tentative="1">
+      <w:start w:val="1"/>
+      <w:numFmt w:val="bullet"/>
+      <w:lvlText w:val="o"/>
+      <w:lvlJc w:val="left"/>
+      <w:pPr>
+        <w:ind w:left="3466" w:hanging="360"/>
+      </w:pPr>
+      <w:rPr>
+        <w:rFonts w:ascii="Courier New" w:hAnsi="Courier New" w:cs="Courier New" w:hint="default"/>
+      </w:rPr>
+    </w:lvl>
+    <w:lvl w:ilvl="5" w:tplc="40090005" w:tentative="1">
+      <w:start w:val="1"/>
+      <w:numFmt w:val="bullet"/>
+      <w:lvlText w:val=""/>
+      <w:lvlJc w:val="left"/>
+      <w:pPr>
+        <w:ind w:left="4186" w:hanging="360"/>
+      </w:pPr>
+      <w:rPr>
+        <w:rFonts w:ascii="Wingdings" w:hAnsi="Wingdings" w:hint="default"/>
+      </w:rPr>
+    </w:lvl>
+    <w:lvl w:ilvl="6" w:tplc="40090001" w:tentative="1">
+      <w:start w:val="1"/>
+      <w:numFmt w:val="bullet"/>
+      <w:lvlText w:val=""/>
+      <w:lvlJc w:val="left"/>
+      <w:pPr>
+        <w:ind w:left="4906" w:hanging="360"/>
+      </w:pPr>
+      <w:rPr>
+        <w:rFonts w:ascii="Symbol" w:hAnsi="Symbol" w:hint="default"/>
+      </w:rPr>
+    </w:lvl>
+    <w:lvl w:ilvl="7" w:tplc="40090003" w:tentative="1">
+      <w:start w:val="1"/>
+      <w:numFmt w:val="bullet"/>
+      <w:lvlText w:val="o"/>
+      <w:lvlJc w:val="left"/>
+      <w:pPr>
+        <w:ind w:left="5626" w:hanging="360"/>
+      </w:pPr>
+      <w:rPr>
+        <w:rFonts w:ascii="Courier New" w:hAnsi="Courier New" w:cs="Courier New" w:hint="default"/>
+      </w:rPr>
+    </w:lvl>
+    <w:lvl w:ilvl="8" w:tplc="40090005" w:tentative="1">
+      <w:start w:val="1"/>
+      <w:numFmt w:val="bullet"/>
+      <w:lvlText w:val=""/>
+      <w:lvlJc w:val="left"/>
+      <w:pPr>
+        <w:ind w:left="6346" w:hanging="360"/>
+      </w:pPr>
+      <w:rPr>
+        <w:rFonts w:ascii="Wingdings" w:hAnsi="Wingdings" w:hint="default"/>
+      </w:rPr>
+    </w:lvl>
+  </w:abstractNum>
+  <w:abstractNum w:abstractNumId="9" w15:restartNumberingAfterBreak="0">
     <w:nsid w:val="27C14F56"/>
     <w:multiLevelType w:val="hybridMultilevel"/>
     <w:tmpl w:val="626C2976"/>
@@ -1543,7 +3261,231 @@
       </w:rPr>
     </w:lvl>
   </w:abstractNum>
-  <w:abstractNum w:abstractNumId="4" w15:restartNumberingAfterBreak="0">
+  <w:abstractNum w:abstractNumId="10" w15:restartNumberingAfterBreak="0">
+    <w:nsid w:val="280204E1"/>
+    <w:multiLevelType w:val="hybridMultilevel"/>
+    <w:tmpl w:val="1B9CAE5C"/>
+    <w:lvl w:ilvl="0" w:tplc="D5A6BDC8">
+      <w:numFmt w:val="bullet"/>
+      <w:lvlText w:val="-"/>
+      <w:lvlJc w:val="left"/>
+      <w:pPr>
+        <w:ind w:left="-14" w:hanging="360"/>
+      </w:pPr>
+      <w:rPr>
+        <w:rFonts w:ascii="Times New Roman" w:eastAsiaTheme="minorHAnsi" w:hAnsi="Times New Roman" w:cs="Times New Roman" w:hint="default"/>
+      </w:rPr>
+    </w:lvl>
+    <w:lvl w:ilvl="1" w:tplc="40090003" w:tentative="1">
+      <w:start w:val="1"/>
+      <w:numFmt w:val="bullet"/>
+      <w:lvlText w:val="o"/>
+      <w:lvlJc w:val="left"/>
+      <w:pPr>
+        <w:ind w:left="706" w:hanging="360"/>
+      </w:pPr>
+      <w:rPr>
+        <w:rFonts w:ascii="Courier New" w:hAnsi="Courier New" w:cs="Courier New" w:hint="default"/>
+      </w:rPr>
+    </w:lvl>
+    <w:lvl w:ilvl="2" w:tplc="40090005" w:tentative="1">
+      <w:start w:val="1"/>
+      <w:numFmt w:val="bullet"/>
+      <w:lvlText w:val=""/>
+      <w:lvlJc w:val="left"/>
+      <w:pPr>
+        <w:ind w:left="1426" w:hanging="360"/>
+      </w:pPr>
+      <w:rPr>
+        <w:rFonts w:ascii="Wingdings" w:hAnsi="Wingdings" w:hint="default"/>
+      </w:rPr>
+    </w:lvl>
+    <w:lvl w:ilvl="3" w:tplc="40090001" w:tentative="1">
+      <w:start w:val="1"/>
+      <w:numFmt w:val="bullet"/>
+      <w:lvlText w:val=""/>
+      <w:lvlJc w:val="left"/>
+      <w:pPr>
+        <w:ind w:left="2146" w:hanging="360"/>
+      </w:pPr>
+      <w:rPr>
+        <w:rFonts w:ascii="Symbol" w:hAnsi="Symbol" w:hint="default"/>
+      </w:rPr>
+    </w:lvl>
+    <w:lvl w:ilvl="4" w:tplc="40090003" w:tentative="1">
+      <w:start w:val="1"/>
+      <w:numFmt w:val="bullet"/>
+      <w:lvlText w:val="o"/>
+      <w:lvlJc w:val="left"/>
+      <w:pPr>
+        <w:ind w:left="2866" w:hanging="360"/>
+      </w:pPr>
+      <w:rPr>
+        <w:rFonts w:ascii="Courier New" w:hAnsi="Courier New" w:cs="Courier New" w:hint="default"/>
+      </w:rPr>
+    </w:lvl>
+    <w:lvl w:ilvl="5" w:tplc="40090005" w:tentative="1">
+      <w:start w:val="1"/>
+      <w:numFmt w:val="bullet"/>
+      <w:lvlText w:val=""/>
+      <w:lvlJc w:val="left"/>
+      <w:pPr>
+        <w:ind w:left="3586" w:hanging="360"/>
+      </w:pPr>
+      <w:rPr>
+        <w:rFonts w:ascii="Wingdings" w:hAnsi="Wingdings" w:hint="default"/>
+      </w:rPr>
+    </w:lvl>
+    <w:lvl w:ilvl="6" w:tplc="40090001" w:tentative="1">
+      <w:start w:val="1"/>
+      <w:numFmt w:val="bullet"/>
+      <w:lvlText w:val=""/>
+      <w:lvlJc w:val="left"/>
+      <w:pPr>
+        <w:ind w:left="4306" w:hanging="360"/>
+      </w:pPr>
+      <w:rPr>
+        <w:rFonts w:ascii="Symbol" w:hAnsi="Symbol" w:hint="default"/>
+      </w:rPr>
+    </w:lvl>
+    <w:lvl w:ilvl="7" w:tplc="40090003" w:tentative="1">
+      <w:start w:val="1"/>
+      <w:numFmt w:val="bullet"/>
+      <w:lvlText w:val="o"/>
+      <w:lvlJc w:val="left"/>
+      <w:pPr>
+        <w:ind w:left="5026" w:hanging="360"/>
+      </w:pPr>
+      <w:rPr>
+        <w:rFonts w:ascii="Courier New" w:hAnsi="Courier New" w:cs="Courier New" w:hint="default"/>
+      </w:rPr>
+    </w:lvl>
+    <w:lvl w:ilvl="8" w:tplc="40090005" w:tentative="1">
+      <w:start w:val="1"/>
+      <w:numFmt w:val="bullet"/>
+      <w:lvlText w:val=""/>
+      <w:lvlJc w:val="left"/>
+      <w:pPr>
+        <w:ind w:left="5746" w:hanging="360"/>
+      </w:pPr>
+      <w:rPr>
+        <w:rFonts w:ascii="Wingdings" w:hAnsi="Wingdings" w:hint="default"/>
+      </w:rPr>
+    </w:lvl>
+  </w:abstractNum>
+  <w:abstractNum w:abstractNumId="11" w15:restartNumberingAfterBreak="0">
+    <w:nsid w:val="2CC95A44"/>
+    <w:multiLevelType w:val="hybridMultilevel"/>
+    <w:tmpl w:val="6844895C"/>
+    <w:lvl w:ilvl="0" w:tplc="4582FAF6">
+      <w:numFmt w:val="bullet"/>
+      <w:lvlText w:val="-"/>
+      <w:lvlJc w:val="left"/>
+      <w:pPr>
+        <w:ind w:left="-374" w:hanging="360"/>
+      </w:pPr>
+      <w:rPr>
+        <w:rFonts w:ascii="Times New Roman" w:eastAsiaTheme="minorHAnsi" w:hAnsi="Times New Roman" w:cs="Times New Roman" w:hint="default"/>
+      </w:rPr>
+    </w:lvl>
+    <w:lvl w:ilvl="1" w:tplc="40090003" w:tentative="1">
+      <w:start w:val="1"/>
+      <w:numFmt w:val="bullet"/>
+      <w:lvlText w:val="o"/>
+      <w:lvlJc w:val="left"/>
+      <w:pPr>
+        <w:ind w:left="346" w:hanging="360"/>
+      </w:pPr>
+      <w:rPr>
+        <w:rFonts w:ascii="Courier New" w:hAnsi="Courier New" w:cs="Courier New" w:hint="default"/>
+      </w:rPr>
+    </w:lvl>
+    <w:lvl w:ilvl="2" w:tplc="40090005" w:tentative="1">
+      <w:start w:val="1"/>
+      <w:numFmt w:val="bullet"/>
+      <w:lvlText w:val=""/>
+      <w:lvlJc w:val="left"/>
+      <w:pPr>
+        <w:ind w:left="1066" w:hanging="360"/>
+      </w:pPr>
+      <w:rPr>
+        <w:rFonts w:ascii="Wingdings" w:hAnsi="Wingdings" w:hint="default"/>
+      </w:rPr>
+    </w:lvl>
+    <w:lvl w:ilvl="3" w:tplc="40090001" w:tentative="1">
+      <w:start w:val="1"/>
+      <w:numFmt w:val="bullet"/>
+      <w:lvlText w:val=""/>
+      <w:lvlJc w:val="left"/>
+      <w:pPr>
+        <w:ind w:left="1786" w:hanging="360"/>
+      </w:pPr>
+      <w:rPr>
+        <w:rFonts w:ascii="Symbol" w:hAnsi="Symbol" w:hint="default"/>
+      </w:rPr>
+    </w:lvl>
+    <w:lvl w:ilvl="4" w:tplc="40090003" w:tentative="1">
+      <w:start w:val="1"/>
+      <w:numFmt w:val="bullet"/>
+      <w:lvlText w:val="o"/>
+      <w:lvlJc w:val="left"/>
+      <w:pPr>
+        <w:ind w:left="2506" w:hanging="360"/>
+      </w:pPr>
+      <w:rPr>
+        <w:rFonts w:ascii="Courier New" w:hAnsi="Courier New" w:cs="Courier New" w:hint="default"/>
+      </w:rPr>
+    </w:lvl>
+    <w:lvl w:ilvl="5" w:tplc="40090005" w:tentative="1">
+      <w:start w:val="1"/>
+      <w:numFmt w:val="bullet"/>
+      <w:lvlText w:val=""/>
+      <w:lvlJc w:val="left"/>
+      <w:pPr>
+        <w:ind w:left="3226" w:hanging="360"/>
+      </w:pPr>
+      <w:rPr>
+        <w:rFonts w:ascii="Wingdings" w:hAnsi="Wingdings" w:hint="default"/>
+      </w:rPr>
+    </w:lvl>
+    <w:lvl w:ilvl="6" w:tplc="40090001" w:tentative="1">
+      <w:start w:val="1"/>
+      <w:numFmt w:val="bullet"/>
+      <w:lvlText w:val=""/>
+      <w:lvlJc w:val="left"/>
+      <w:pPr>
+        <w:ind w:left="3946" w:hanging="360"/>
+      </w:pPr>
+      <w:rPr>
+        <w:rFonts w:ascii="Symbol" w:hAnsi="Symbol" w:hint="default"/>
+      </w:rPr>
+    </w:lvl>
+    <w:lvl w:ilvl="7" w:tplc="40090003" w:tentative="1">
+      <w:start w:val="1"/>
+      <w:numFmt w:val="bullet"/>
+      <w:lvlText w:val="o"/>
+      <w:lvlJc w:val="left"/>
+      <w:pPr>
+        <w:ind w:left="4666" w:hanging="360"/>
+      </w:pPr>
+      <w:rPr>
+        <w:rFonts w:ascii="Courier New" w:hAnsi="Courier New" w:cs="Courier New" w:hint="default"/>
+      </w:rPr>
+    </w:lvl>
+    <w:lvl w:ilvl="8" w:tplc="40090005" w:tentative="1">
+      <w:start w:val="1"/>
+      <w:numFmt w:val="bullet"/>
+      <w:lvlText w:val=""/>
+      <w:lvlJc w:val="left"/>
+      <w:pPr>
+        <w:ind w:left="5386" w:hanging="360"/>
+      </w:pPr>
+      <w:rPr>
+        <w:rFonts w:ascii="Wingdings" w:hAnsi="Wingdings" w:hint="default"/>
+      </w:rPr>
+    </w:lvl>
+  </w:abstractNum>
+  <w:abstractNum w:abstractNumId="12" w15:restartNumberingAfterBreak="0">
     <w:nsid w:val="436B1683"/>
     <w:multiLevelType w:val="hybridMultilevel"/>
     <w:tmpl w:val="B5DC4520"/>
@@ -1657,7 +3599,345 @@
       </w:rPr>
     </w:lvl>
   </w:abstractNum>
-  <w:abstractNum w:abstractNumId="5" w15:restartNumberingAfterBreak="0">
+  <w:abstractNum w:abstractNumId="13" w15:restartNumberingAfterBreak="0">
+    <w:nsid w:val="453533C1"/>
+    <w:multiLevelType w:val="hybridMultilevel"/>
+    <w:tmpl w:val="5DAE6684"/>
+    <w:lvl w:ilvl="0" w:tplc="40090001">
+      <w:start w:val="1"/>
+      <w:numFmt w:val="bullet"/>
+      <w:lvlText w:val=""/>
+      <w:lvlJc w:val="left"/>
+      <w:pPr>
+        <w:ind w:left="946" w:hanging="360"/>
+      </w:pPr>
+      <w:rPr>
+        <w:rFonts w:ascii="Symbol" w:hAnsi="Symbol" w:hint="default"/>
+      </w:rPr>
+    </w:lvl>
+    <w:lvl w:ilvl="1" w:tplc="40090003" w:tentative="1">
+      <w:start w:val="1"/>
+      <w:numFmt w:val="bullet"/>
+      <w:lvlText w:val="o"/>
+      <w:lvlJc w:val="left"/>
+      <w:pPr>
+        <w:ind w:left="1666" w:hanging="360"/>
+      </w:pPr>
+      <w:rPr>
+        <w:rFonts w:ascii="Courier New" w:hAnsi="Courier New" w:cs="Courier New" w:hint="default"/>
+      </w:rPr>
+    </w:lvl>
+    <w:lvl w:ilvl="2" w:tplc="40090005" w:tentative="1">
+      <w:start w:val="1"/>
+      <w:numFmt w:val="bullet"/>
+      <w:lvlText w:val=""/>
+      <w:lvlJc w:val="left"/>
+      <w:pPr>
+        <w:ind w:left="2386" w:hanging="360"/>
+      </w:pPr>
+      <w:rPr>
+        <w:rFonts w:ascii="Wingdings" w:hAnsi="Wingdings" w:hint="default"/>
+      </w:rPr>
+    </w:lvl>
+    <w:lvl w:ilvl="3" w:tplc="40090001" w:tentative="1">
+      <w:start w:val="1"/>
+      <w:numFmt w:val="bullet"/>
+      <w:lvlText w:val=""/>
+      <w:lvlJc w:val="left"/>
+      <w:pPr>
+        <w:ind w:left="3106" w:hanging="360"/>
+      </w:pPr>
+      <w:rPr>
+        <w:rFonts w:ascii="Symbol" w:hAnsi="Symbol" w:hint="default"/>
+      </w:rPr>
+    </w:lvl>
+    <w:lvl w:ilvl="4" w:tplc="40090003" w:tentative="1">
+      <w:start w:val="1"/>
+      <w:numFmt w:val="bullet"/>
+      <w:lvlText w:val="o"/>
+      <w:lvlJc w:val="left"/>
+      <w:pPr>
+        <w:ind w:left="3826" w:hanging="360"/>
+      </w:pPr>
+      <w:rPr>
+        <w:rFonts w:ascii="Courier New" w:hAnsi="Courier New" w:cs="Courier New" w:hint="default"/>
+      </w:rPr>
+    </w:lvl>
+    <w:lvl w:ilvl="5" w:tplc="40090005" w:tentative="1">
+      <w:start w:val="1"/>
+      <w:numFmt w:val="bullet"/>
+      <w:lvlText w:val=""/>
+      <w:lvlJc w:val="left"/>
+      <w:pPr>
+        <w:ind w:left="4546" w:hanging="360"/>
+      </w:pPr>
+      <w:rPr>
+        <w:rFonts w:ascii="Wingdings" w:hAnsi="Wingdings" w:hint="default"/>
+      </w:rPr>
+    </w:lvl>
+    <w:lvl w:ilvl="6" w:tplc="40090001" w:tentative="1">
+      <w:start w:val="1"/>
+      <w:numFmt w:val="bullet"/>
+      <w:lvlText w:val=""/>
+      <w:lvlJc w:val="left"/>
+      <w:pPr>
+        <w:ind w:left="5266" w:hanging="360"/>
+      </w:pPr>
+      <w:rPr>
+        <w:rFonts w:ascii="Symbol" w:hAnsi="Symbol" w:hint="default"/>
+      </w:rPr>
+    </w:lvl>
+    <w:lvl w:ilvl="7" w:tplc="40090003" w:tentative="1">
+      <w:start w:val="1"/>
+      <w:numFmt w:val="bullet"/>
+      <w:lvlText w:val="o"/>
+      <w:lvlJc w:val="left"/>
+      <w:pPr>
+        <w:ind w:left="5986" w:hanging="360"/>
+      </w:pPr>
+      <w:rPr>
+        <w:rFonts w:ascii="Courier New" w:hAnsi="Courier New" w:cs="Courier New" w:hint="default"/>
+      </w:rPr>
+    </w:lvl>
+    <w:lvl w:ilvl="8" w:tplc="40090005" w:tentative="1">
+      <w:start w:val="1"/>
+      <w:numFmt w:val="bullet"/>
+      <w:lvlText w:val=""/>
+      <w:lvlJc w:val="left"/>
+      <w:pPr>
+        <w:ind w:left="6706" w:hanging="360"/>
+      </w:pPr>
+      <w:rPr>
+        <w:rFonts w:ascii="Wingdings" w:hAnsi="Wingdings" w:hint="default"/>
+      </w:rPr>
+    </w:lvl>
+  </w:abstractNum>
+  <w:abstractNum w:abstractNumId="14" w15:restartNumberingAfterBreak="0">
+    <w:nsid w:val="539130D9"/>
+    <w:multiLevelType w:val="hybridMultilevel"/>
+    <w:tmpl w:val="6442B08E"/>
+    <w:lvl w:ilvl="0" w:tplc="40090001">
+      <w:start w:val="1"/>
+      <w:numFmt w:val="bullet"/>
+      <w:lvlText w:val=""/>
+      <w:lvlJc w:val="left"/>
+      <w:pPr>
+        <w:ind w:left="720" w:hanging="360"/>
+      </w:pPr>
+      <w:rPr>
+        <w:rFonts w:ascii="Symbol" w:hAnsi="Symbol" w:hint="default"/>
+      </w:rPr>
+    </w:lvl>
+    <w:lvl w:ilvl="1" w:tplc="40090003">
+      <w:start w:val="1"/>
+      <w:numFmt w:val="bullet"/>
+      <w:lvlText w:val="o"/>
+      <w:lvlJc w:val="left"/>
+      <w:pPr>
+        <w:ind w:left="1440" w:hanging="360"/>
+      </w:pPr>
+      <w:rPr>
+        <w:rFonts w:ascii="Courier New" w:hAnsi="Courier New" w:cs="Courier New" w:hint="default"/>
+      </w:rPr>
+    </w:lvl>
+    <w:lvl w:ilvl="2" w:tplc="40090005" w:tentative="1">
+      <w:start w:val="1"/>
+      <w:numFmt w:val="bullet"/>
+      <w:lvlText w:val=""/>
+      <w:lvlJc w:val="left"/>
+      <w:pPr>
+        <w:ind w:left="2160" w:hanging="360"/>
+      </w:pPr>
+      <w:rPr>
+        <w:rFonts w:ascii="Wingdings" w:hAnsi="Wingdings" w:hint="default"/>
+      </w:rPr>
+    </w:lvl>
+    <w:lvl w:ilvl="3" w:tplc="40090001" w:tentative="1">
+      <w:start w:val="1"/>
+      <w:numFmt w:val="bullet"/>
+      <w:lvlText w:val=""/>
+      <w:lvlJc w:val="left"/>
+      <w:pPr>
+        <w:ind w:left="2880" w:hanging="360"/>
+      </w:pPr>
+      <w:rPr>
+        <w:rFonts w:ascii="Symbol" w:hAnsi="Symbol" w:hint="default"/>
+      </w:rPr>
+    </w:lvl>
+    <w:lvl w:ilvl="4" w:tplc="40090003" w:tentative="1">
+      <w:start w:val="1"/>
+      <w:numFmt w:val="bullet"/>
+      <w:lvlText w:val="o"/>
+      <w:lvlJc w:val="left"/>
+      <w:pPr>
+        <w:ind w:left="3600" w:hanging="360"/>
+      </w:pPr>
+      <w:rPr>
+        <w:rFonts w:ascii="Courier New" w:hAnsi="Courier New" w:cs="Courier New" w:hint="default"/>
+      </w:rPr>
+    </w:lvl>
+    <w:lvl w:ilvl="5" w:tplc="40090005" w:tentative="1">
+      <w:start w:val="1"/>
+      <w:numFmt w:val="bullet"/>
+      <w:lvlText w:val=""/>
+      <w:lvlJc w:val="left"/>
+      <w:pPr>
+        <w:ind w:left="4320" w:hanging="360"/>
+      </w:pPr>
+      <w:rPr>
+        <w:rFonts w:ascii="Wingdings" w:hAnsi="Wingdings" w:hint="default"/>
+      </w:rPr>
+    </w:lvl>
+    <w:lvl w:ilvl="6" w:tplc="40090001" w:tentative="1">
+      <w:start w:val="1"/>
+      <w:numFmt w:val="bullet"/>
+      <w:lvlText w:val=""/>
+      <w:lvlJc w:val="left"/>
+      <w:pPr>
+        <w:ind w:left="5040" w:hanging="360"/>
+      </w:pPr>
+      <w:rPr>
+        <w:rFonts w:ascii="Symbol" w:hAnsi="Symbol" w:hint="default"/>
+      </w:rPr>
+    </w:lvl>
+    <w:lvl w:ilvl="7" w:tplc="40090003" w:tentative="1">
+      <w:start w:val="1"/>
+      <w:numFmt w:val="bullet"/>
+      <w:lvlText w:val="o"/>
+      <w:lvlJc w:val="left"/>
+      <w:pPr>
+        <w:ind w:left="5760" w:hanging="360"/>
+      </w:pPr>
+      <w:rPr>
+        <w:rFonts w:ascii="Courier New" w:hAnsi="Courier New" w:cs="Courier New" w:hint="default"/>
+      </w:rPr>
+    </w:lvl>
+    <w:lvl w:ilvl="8" w:tplc="40090005" w:tentative="1">
+      <w:start w:val="1"/>
+      <w:numFmt w:val="bullet"/>
+      <w:lvlText w:val=""/>
+      <w:lvlJc w:val="left"/>
+      <w:pPr>
+        <w:ind w:left="6480" w:hanging="360"/>
+      </w:pPr>
+      <w:rPr>
+        <w:rFonts w:ascii="Wingdings" w:hAnsi="Wingdings" w:hint="default"/>
+      </w:rPr>
+    </w:lvl>
+  </w:abstractNum>
+  <w:abstractNum w:abstractNumId="15" w15:restartNumberingAfterBreak="0">
+    <w:nsid w:val="5B5A425A"/>
+    <w:multiLevelType w:val="hybridMultilevel"/>
+    <w:tmpl w:val="7D6659CE"/>
+    <w:lvl w:ilvl="0" w:tplc="61B86D8C">
+      <w:numFmt w:val="bullet"/>
+      <w:lvlText w:val="-"/>
+      <w:lvlJc w:val="left"/>
+      <w:pPr>
+        <w:ind w:left="586" w:hanging="360"/>
+      </w:pPr>
+      <w:rPr>
+        <w:rFonts w:ascii="Times New Roman" w:eastAsiaTheme="minorHAnsi" w:hAnsi="Times New Roman" w:cs="Times New Roman" w:hint="default"/>
+      </w:rPr>
+    </w:lvl>
+    <w:lvl w:ilvl="1" w:tplc="40090003" w:tentative="1">
+      <w:start w:val="1"/>
+      <w:numFmt w:val="bullet"/>
+      <w:lvlText w:val="o"/>
+      <w:lvlJc w:val="left"/>
+      <w:pPr>
+        <w:ind w:left="1440" w:hanging="360"/>
+      </w:pPr>
+      <w:rPr>
+        <w:rFonts w:ascii="Courier New" w:hAnsi="Courier New" w:cs="Courier New" w:hint="default"/>
+      </w:rPr>
+    </w:lvl>
+    <w:lvl w:ilvl="2" w:tplc="40090005" w:tentative="1">
+      <w:start w:val="1"/>
+      <w:numFmt w:val="bullet"/>
+      <w:lvlText w:val=""/>
+      <w:lvlJc w:val="left"/>
+      <w:pPr>
+        <w:ind w:left="2160" w:hanging="360"/>
+      </w:pPr>
+      <w:rPr>
+        <w:rFonts w:ascii="Wingdings" w:hAnsi="Wingdings" w:hint="default"/>
+      </w:rPr>
+    </w:lvl>
+    <w:lvl w:ilvl="3" w:tplc="40090001" w:tentative="1">
+      <w:start w:val="1"/>
+      <w:numFmt w:val="bullet"/>
+      <w:lvlText w:val=""/>
+      <w:lvlJc w:val="left"/>
+      <w:pPr>
+        <w:ind w:left="2880" w:hanging="360"/>
+      </w:pPr>
+      <w:rPr>
+        <w:rFonts w:ascii="Symbol" w:hAnsi="Symbol" w:hint="default"/>
+      </w:rPr>
+    </w:lvl>
+    <w:lvl w:ilvl="4" w:tplc="40090003" w:tentative="1">
+      <w:start w:val="1"/>
+      <w:numFmt w:val="bullet"/>
+      <w:lvlText w:val="o"/>
+      <w:lvlJc w:val="left"/>
+      <w:pPr>
+        <w:ind w:left="3600" w:hanging="360"/>
+      </w:pPr>
+      <w:rPr>
+        <w:rFonts w:ascii="Courier New" w:hAnsi="Courier New" w:cs="Courier New" w:hint="default"/>
+      </w:rPr>
+    </w:lvl>
+    <w:lvl w:ilvl="5" w:tplc="40090005" w:tentative="1">
+      <w:start w:val="1"/>
+      <w:numFmt w:val="bullet"/>
+      <w:lvlText w:val=""/>
+      <w:lvlJc w:val="left"/>
+      <w:pPr>
+        <w:ind w:left="4320" w:hanging="360"/>
+      </w:pPr>
+      <w:rPr>
+        <w:rFonts w:ascii="Wingdings" w:hAnsi="Wingdings" w:hint="default"/>
+      </w:rPr>
+    </w:lvl>
+    <w:lvl w:ilvl="6" w:tplc="40090001" w:tentative="1">
+      <w:start w:val="1"/>
+      <w:numFmt w:val="bullet"/>
+      <w:lvlText w:val=""/>
+      <w:lvlJc w:val="left"/>
+      <w:pPr>
+        <w:ind w:left="5040" w:hanging="360"/>
+      </w:pPr>
+      <w:rPr>
+        <w:rFonts w:ascii="Symbol" w:hAnsi="Symbol" w:hint="default"/>
+      </w:rPr>
+    </w:lvl>
+    <w:lvl w:ilvl="7" w:tplc="40090003" w:tentative="1">
+      <w:start w:val="1"/>
+      <w:numFmt w:val="bullet"/>
+      <w:lvlText w:val="o"/>
+      <w:lvlJc w:val="left"/>
+      <w:pPr>
+        <w:ind w:left="5760" w:hanging="360"/>
+      </w:pPr>
+      <w:rPr>
+        <w:rFonts w:ascii="Courier New" w:hAnsi="Courier New" w:cs="Courier New" w:hint="default"/>
+      </w:rPr>
+    </w:lvl>
+    <w:lvl w:ilvl="8" w:tplc="40090005" w:tentative="1">
+      <w:start w:val="1"/>
+      <w:numFmt w:val="bullet"/>
+      <w:lvlText w:val=""/>
+      <w:lvlJc w:val="left"/>
+      <w:pPr>
+        <w:ind w:left="6480" w:hanging="360"/>
+      </w:pPr>
+      <w:rPr>
+        <w:rFonts w:ascii="Wingdings" w:hAnsi="Wingdings" w:hint="default"/>
+      </w:rPr>
+    </w:lvl>
+  </w:abstractNum>
+  <w:abstractNum w:abstractNumId="16" w15:restartNumberingAfterBreak="0">
     <w:nsid w:val="5FDA7EB2"/>
     <w:multiLevelType w:val="hybridMultilevel"/>
     <w:tmpl w:val="67D85310"/>
@@ -1770,7 +4050,120 @@
       </w:rPr>
     </w:lvl>
   </w:abstractNum>
-  <w:abstractNum w:abstractNumId="6" w15:restartNumberingAfterBreak="0">
+  <w:abstractNum w:abstractNumId="17" w15:restartNumberingAfterBreak="0">
+    <w:nsid w:val="61973BAA"/>
+    <w:multiLevelType w:val="hybridMultilevel"/>
+    <w:tmpl w:val="6B786596"/>
+    <w:lvl w:ilvl="0" w:tplc="40090001">
+      <w:start w:val="1"/>
+      <w:numFmt w:val="bullet"/>
+      <w:lvlText w:val=""/>
+      <w:lvlJc w:val="left"/>
+      <w:pPr>
+        <w:ind w:left="1440" w:hanging="360"/>
+      </w:pPr>
+      <w:rPr>
+        <w:rFonts w:ascii="Symbol" w:hAnsi="Symbol" w:hint="default"/>
+      </w:rPr>
+    </w:lvl>
+    <w:lvl w:ilvl="1" w:tplc="40090003" w:tentative="1">
+      <w:start w:val="1"/>
+      <w:numFmt w:val="bullet"/>
+      <w:lvlText w:val="o"/>
+      <w:lvlJc w:val="left"/>
+      <w:pPr>
+        <w:ind w:left="2160" w:hanging="360"/>
+      </w:pPr>
+      <w:rPr>
+        <w:rFonts w:ascii="Courier New" w:hAnsi="Courier New" w:cs="Courier New" w:hint="default"/>
+      </w:rPr>
+    </w:lvl>
+    <w:lvl w:ilvl="2" w:tplc="40090005" w:tentative="1">
+      <w:start w:val="1"/>
+      <w:numFmt w:val="bullet"/>
+      <w:lvlText w:val=""/>
+      <w:lvlJc w:val="left"/>
+      <w:pPr>
+        <w:ind w:left="2880" w:hanging="360"/>
+      </w:pPr>
+      <w:rPr>
+        <w:rFonts w:ascii="Wingdings" w:hAnsi="Wingdings" w:hint="default"/>
+      </w:rPr>
+    </w:lvl>
+    <w:lvl w:ilvl="3" w:tplc="40090001" w:tentative="1">
+      <w:start w:val="1"/>
+      <w:numFmt w:val="bullet"/>
+      <w:lvlText w:val=""/>
+      <w:lvlJc w:val="left"/>
+      <w:pPr>
+        <w:ind w:left="3600" w:hanging="360"/>
+      </w:pPr>
+      <w:rPr>
+        <w:rFonts w:ascii="Symbol" w:hAnsi="Symbol" w:hint="default"/>
+      </w:rPr>
+    </w:lvl>
+    <w:lvl w:ilvl="4" w:tplc="40090003" w:tentative="1">
+      <w:start w:val="1"/>
+      <w:numFmt w:val="bullet"/>
+      <w:lvlText w:val="o"/>
+      <w:lvlJc w:val="left"/>
+      <w:pPr>
+        <w:ind w:left="4320" w:hanging="360"/>
+      </w:pPr>
+      <w:rPr>
+        <w:rFonts w:ascii="Courier New" w:hAnsi="Courier New" w:cs="Courier New" w:hint="default"/>
+      </w:rPr>
+    </w:lvl>
+    <w:lvl w:ilvl="5" w:tplc="40090005" w:tentative="1">
+      <w:start w:val="1"/>
+      <w:numFmt w:val="bullet"/>
+      <w:lvlText w:val=""/>
+      <w:lvlJc w:val="left"/>
+      <w:pPr>
+        <w:ind w:left="5040" w:hanging="360"/>
+      </w:pPr>
+      <w:rPr>
+        <w:rFonts w:ascii="Wingdings" w:hAnsi="Wingdings" w:hint="default"/>
+      </w:rPr>
+    </w:lvl>
+    <w:lvl w:ilvl="6" w:tplc="40090001" w:tentative="1">
+      <w:start w:val="1"/>
+      <w:numFmt w:val="bullet"/>
+      <w:lvlText w:val=""/>
+      <w:lvlJc w:val="left"/>
+      <w:pPr>
+        <w:ind w:left="5760" w:hanging="360"/>
+      </w:pPr>
+      <w:rPr>
+        <w:rFonts w:ascii="Symbol" w:hAnsi="Symbol" w:hint="default"/>
+      </w:rPr>
+    </w:lvl>
+    <w:lvl w:ilvl="7" w:tplc="40090003" w:tentative="1">
+      <w:start w:val="1"/>
+      <w:numFmt w:val="bullet"/>
+      <w:lvlText w:val="o"/>
+      <w:lvlJc w:val="left"/>
+      <w:pPr>
+        <w:ind w:left="6480" w:hanging="360"/>
+      </w:pPr>
+      <w:rPr>
+        <w:rFonts w:ascii="Courier New" w:hAnsi="Courier New" w:cs="Courier New" w:hint="default"/>
+      </w:rPr>
+    </w:lvl>
+    <w:lvl w:ilvl="8" w:tplc="40090005" w:tentative="1">
+      <w:start w:val="1"/>
+      <w:numFmt w:val="bullet"/>
+      <w:lvlText w:val=""/>
+      <w:lvlJc w:val="left"/>
+      <w:pPr>
+        <w:ind w:left="7200" w:hanging="360"/>
+      </w:pPr>
+      <w:rPr>
+        <w:rFonts w:ascii="Wingdings" w:hAnsi="Wingdings" w:hint="default"/>
+      </w:rPr>
+    </w:lvl>
+  </w:abstractNum>
+  <w:abstractNum w:abstractNumId="18" w15:restartNumberingAfterBreak="0">
     <w:nsid w:val="744F3A10"/>
     <w:multiLevelType w:val="hybridMultilevel"/>
     <w:tmpl w:val="7E54F3D8"/>
@@ -1883,26 +4276,294 @@
       </w:rPr>
     </w:lvl>
   </w:abstractNum>
+  <w:abstractNum w:abstractNumId="19" w15:restartNumberingAfterBreak="0">
+    <w:nsid w:val="76E73B2B"/>
+    <w:multiLevelType w:val="hybridMultilevel"/>
+    <w:tmpl w:val="4DEA82A0"/>
+    <w:lvl w:ilvl="0" w:tplc="40090001">
+      <w:start w:val="1"/>
+      <w:numFmt w:val="bullet"/>
+      <w:lvlText w:val=""/>
+      <w:lvlJc w:val="left"/>
+      <w:pPr>
+        <w:ind w:left="346" w:hanging="360"/>
+      </w:pPr>
+      <w:rPr>
+        <w:rFonts w:ascii="Symbol" w:hAnsi="Symbol" w:hint="default"/>
+      </w:rPr>
+    </w:lvl>
+    <w:lvl w:ilvl="1" w:tplc="40090003" w:tentative="1">
+      <w:start w:val="1"/>
+      <w:numFmt w:val="bullet"/>
+      <w:lvlText w:val="o"/>
+      <w:lvlJc w:val="left"/>
+      <w:pPr>
+        <w:ind w:left="1066" w:hanging="360"/>
+      </w:pPr>
+      <w:rPr>
+        <w:rFonts w:ascii="Courier New" w:hAnsi="Courier New" w:cs="Courier New" w:hint="default"/>
+      </w:rPr>
+    </w:lvl>
+    <w:lvl w:ilvl="2" w:tplc="40090005" w:tentative="1">
+      <w:start w:val="1"/>
+      <w:numFmt w:val="bullet"/>
+      <w:lvlText w:val=""/>
+      <w:lvlJc w:val="left"/>
+      <w:pPr>
+        <w:ind w:left="1786" w:hanging="360"/>
+      </w:pPr>
+      <w:rPr>
+        <w:rFonts w:ascii="Wingdings" w:hAnsi="Wingdings" w:hint="default"/>
+      </w:rPr>
+    </w:lvl>
+    <w:lvl w:ilvl="3" w:tplc="40090001" w:tentative="1">
+      <w:start w:val="1"/>
+      <w:numFmt w:val="bullet"/>
+      <w:lvlText w:val=""/>
+      <w:lvlJc w:val="left"/>
+      <w:pPr>
+        <w:ind w:left="2506" w:hanging="360"/>
+      </w:pPr>
+      <w:rPr>
+        <w:rFonts w:ascii="Symbol" w:hAnsi="Symbol" w:hint="default"/>
+      </w:rPr>
+    </w:lvl>
+    <w:lvl w:ilvl="4" w:tplc="40090003" w:tentative="1">
+      <w:start w:val="1"/>
+      <w:numFmt w:val="bullet"/>
+      <w:lvlText w:val="o"/>
+      <w:lvlJc w:val="left"/>
+      <w:pPr>
+        <w:ind w:left="3226" w:hanging="360"/>
+      </w:pPr>
+      <w:rPr>
+        <w:rFonts w:ascii="Courier New" w:hAnsi="Courier New" w:cs="Courier New" w:hint="default"/>
+      </w:rPr>
+    </w:lvl>
+    <w:lvl w:ilvl="5" w:tplc="40090005" w:tentative="1">
+      <w:start w:val="1"/>
+      <w:numFmt w:val="bullet"/>
+      <w:lvlText w:val=""/>
+      <w:lvlJc w:val="left"/>
+      <w:pPr>
+        <w:ind w:left="3946" w:hanging="360"/>
+      </w:pPr>
+      <w:rPr>
+        <w:rFonts w:ascii="Wingdings" w:hAnsi="Wingdings" w:hint="default"/>
+      </w:rPr>
+    </w:lvl>
+    <w:lvl w:ilvl="6" w:tplc="40090001" w:tentative="1">
+      <w:start w:val="1"/>
+      <w:numFmt w:val="bullet"/>
+      <w:lvlText w:val=""/>
+      <w:lvlJc w:val="left"/>
+      <w:pPr>
+        <w:ind w:left="4666" w:hanging="360"/>
+      </w:pPr>
+      <w:rPr>
+        <w:rFonts w:ascii="Symbol" w:hAnsi="Symbol" w:hint="default"/>
+      </w:rPr>
+    </w:lvl>
+    <w:lvl w:ilvl="7" w:tplc="40090003" w:tentative="1">
+      <w:start w:val="1"/>
+      <w:numFmt w:val="bullet"/>
+      <w:lvlText w:val="o"/>
+      <w:lvlJc w:val="left"/>
+      <w:pPr>
+        <w:ind w:left="5386" w:hanging="360"/>
+      </w:pPr>
+      <w:rPr>
+        <w:rFonts w:ascii="Courier New" w:hAnsi="Courier New" w:cs="Courier New" w:hint="default"/>
+      </w:rPr>
+    </w:lvl>
+    <w:lvl w:ilvl="8" w:tplc="40090005" w:tentative="1">
+      <w:start w:val="1"/>
+      <w:numFmt w:val="bullet"/>
+      <w:lvlText w:val=""/>
+      <w:lvlJc w:val="left"/>
+      <w:pPr>
+        <w:ind w:left="6106" w:hanging="360"/>
+      </w:pPr>
+      <w:rPr>
+        <w:rFonts w:ascii="Wingdings" w:hAnsi="Wingdings" w:hint="default"/>
+      </w:rPr>
+    </w:lvl>
+  </w:abstractNum>
+  <w:abstractNum w:abstractNumId="20" w15:restartNumberingAfterBreak="0">
+    <w:nsid w:val="7ECA6312"/>
+    <w:multiLevelType w:val="hybridMultilevel"/>
+    <w:tmpl w:val="E32A68A2"/>
+    <w:lvl w:ilvl="0" w:tplc="40090001">
+      <w:start w:val="1"/>
+      <w:numFmt w:val="bullet"/>
+      <w:lvlText w:val=""/>
+      <w:lvlJc w:val="left"/>
+      <w:pPr>
+        <w:ind w:left="720" w:hanging="360"/>
+      </w:pPr>
+      <w:rPr>
+        <w:rFonts w:ascii="Symbol" w:hAnsi="Symbol" w:hint="default"/>
+      </w:rPr>
+    </w:lvl>
+    <w:lvl w:ilvl="1" w:tplc="40090003" w:tentative="1">
+      <w:start w:val="1"/>
+      <w:numFmt w:val="bullet"/>
+      <w:lvlText w:val="o"/>
+      <w:lvlJc w:val="left"/>
+      <w:pPr>
+        <w:ind w:left="1440" w:hanging="360"/>
+      </w:pPr>
+      <w:rPr>
+        <w:rFonts w:ascii="Courier New" w:hAnsi="Courier New" w:cs="Courier New" w:hint="default"/>
+      </w:rPr>
+    </w:lvl>
+    <w:lvl w:ilvl="2" w:tplc="40090005" w:tentative="1">
+      <w:start w:val="1"/>
+      <w:numFmt w:val="bullet"/>
+      <w:lvlText w:val=""/>
+      <w:lvlJc w:val="left"/>
+      <w:pPr>
+        <w:ind w:left="2160" w:hanging="360"/>
+      </w:pPr>
+      <w:rPr>
+        <w:rFonts w:ascii="Wingdings" w:hAnsi="Wingdings" w:hint="default"/>
+      </w:rPr>
+    </w:lvl>
+    <w:lvl w:ilvl="3" w:tplc="40090001" w:tentative="1">
+      <w:start w:val="1"/>
+      <w:numFmt w:val="bullet"/>
+      <w:lvlText w:val=""/>
+      <w:lvlJc w:val="left"/>
+      <w:pPr>
+        <w:ind w:left="2880" w:hanging="360"/>
+      </w:pPr>
+      <w:rPr>
+        <w:rFonts w:ascii="Symbol" w:hAnsi="Symbol" w:hint="default"/>
+      </w:rPr>
+    </w:lvl>
+    <w:lvl w:ilvl="4" w:tplc="40090003" w:tentative="1">
+      <w:start w:val="1"/>
+      <w:numFmt w:val="bullet"/>
+      <w:lvlText w:val="o"/>
+      <w:lvlJc w:val="left"/>
+      <w:pPr>
+        <w:ind w:left="3600" w:hanging="360"/>
+      </w:pPr>
+      <w:rPr>
+        <w:rFonts w:ascii="Courier New" w:hAnsi="Courier New" w:cs="Courier New" w:hint="default"/>
+      </w:rPr>
+    </w:lvl>
+    <w:lvl w:ilvl="5" w:tplc="40090005" w:tentative="1">
+      <w:start w:val="1"/>
+      <w:numFmt w:val="bullet"/>
+      <w:lvlText w:val=""/>
+      <w:lvlJc w:val="left"/>
+      <w:pPr>
+        <w:ind w:left="4320" w:hanging="360"/>
+      </w:pPr>
+      <w:rPr>
+        <w:rFonts w:ascii="Wingdings" w:hAnsi="Wingdings" w:hint="default"/>
+      </w:rPr>
+    </w:lvl>
+    <w:lvl w:ilvl="6" w:tplc="40090001" w:tentative="1">
+      <w:start w:val="1"/>
+      <w:numFmt w:val="bullet"/>
+      <w:lvlText w:val=""/>
+      <w:lvlJc w:val="left"/>
+      <w:pPr>
+        <w:ind w:left="5040" w:hanging="360"/>
+      </w:pPr>
+      <w:rPr>
+        <w:rFonts w:ascii="Symbol" w:hAnsi="Symbol" w:hint="default"/>
+      </w:rPr>
+    </w:lvl>
+    <w:lvl w:ilvl="7" w:tplc="40090003" w:tentative="1">
+      <w:start w:val="1"/>
+      <w:numFmt w:val="bullet"/>
+      <w:lvlText w:val="o"/>
+      <w:lvlJc w:val="left"/>
+      <w:pPr>
+        <w:ind w:left="5760" w:hanging="360"/>
+      </w:pPr>
+      <w:rPr>
+        <w:rFonts w:ascii="Courier New" w:hAnsi="Courier New" w:cs="Courier New" w:hint="default"/>
+      </w:rPr>
+    </w:lvl>
+    <w:lvl w:ilvl="8" w:tplc="40090005" w:tentative="1">
+      <w:start w:val="1"/>
+      <w:numFmt w:val="bullet"/>
+      <w:lvlText w:val=""/>
+      <w:lvlJc w:val="left"/>
+      <w:pPr>
+        <w:ind w:left="6480" w:hanging="360"/>
+      </w:pPr>
+      <w:rPr>
+        <w:rFonts w:ascii="Wingdings" w:hAnsi="Wingdings" w:hint="default"/>
+      </w:rPr>
+    </w:lvl>
+  </w:abstractNum>
   <w:num w:numId="1" w16cid:durableId="1078215918">
+    <w:abstractNumId w:val="3"/>
+  </w:num>
+  <w:num w:numId="2" w16cid:durableId="1084716452">
+    <w:abstractNumId w:val="18"/>
+  </w:num>
+  <w:num w:numId="3" w16cid:durableId="1128861746">
     <w:abstractNumId w:val="1"/>
   </w:num>
-  <w:num w:numId="2" w16cid:durableId="1084716452">
+  <w:num w:numId="4" w16cid:durableId="1184634538">
+    <w:abstractNumId w:val="5"/>
+  </w:num>
+  <w:num w:numId="5" w16cid:durableId="1008293638">
+    <w:abstractNumId w:val="12"/>
+  </w:num>
+  <w:num w:numId="6" w16cid:durableId="1813518688">
+    <w:abstractNumId w:val="9"/>
+  </w:num>
+  <w:num w:numId="7" w16cid:durableId="369840006">
+    <w:abstractNumId w:val="16"/>
+  </w:num>
+  <w:num w:numId="8" w16cid:durableId="447621760">
+    <w:abstractNumId w:val="8"/>
+  </w:num>
+  <w:num w:numId="9" w16cid:durableId="562722328">
+    <w:abstractNumId w:val="15"/>
+  </w:num>
+  <w:num w:numId="10" w16cid:durableId="493838736">
+    <w:abstractNumId w:val="11"/>
+  </w:num>
+  <w:num w:numId="11" w16cid:durableId="1809128700">
+    <w:abstractNumId w:val="2"/>
+  </w:num>
+  <w:num w:numId="12" w16cid:durableId="1605072940">
+    <w:abstractNumId w:val="20"/>
+  </w:num>
+  <w:num w:numId="13" w16cid:durableId="220672377">
+    <w:abstractNumId w:val="7"/>
+  </w:num>
+  <w:num w:numId="14" w16cid:durableId="712122371">
+    <w:abstractNumId w:val="0"/>
+  </w:num>
+  <w:num w:numId="15" w16cid:durableId="782455232">
+    <w:abstractNumId w:val="10"/>
+  </w:num>
+  <w:num w:numId="16" w16cid:durableId="478040333">
+    <w:abstractNumId w:val="4"/>
+  </w:num>
+  <w:num w:numId="17" w16cid:durableId="1785617869">
+    <w:abstractNumId w:val="14"/>
+  </w:num>
+  <w:num w:numId="18" w16cid:durableId="1161121821">
     <w:abstractNumId w:val="6"/>
   </w:num>
-  <w:num w:numId="3" w16cid:durableId="1128861746">
-    <w:abstractNumId w:val="0"/>
+  <w:num w:numId="19" w16cid:durableId="703747987">
+    <w:abstractNumId w:val="17"/>
   </w:num>
-  <w:num w:numId="4" w16cid:durableId="1184634538">
-    <w:abstractNumId w:val="2"/>
+  <w:num w:numId="20" w16cid:durableId="1246187476">
+    <w:abstractNumId w:val="13"/>
   </w:num>
-  <w:num w:numId="5" w16cid:durableId="1008293638">
-    <w:abstractNumId w:val="4"/>
-  </w:num>
-  <w:num w:numId="6" w16cid:durableId="1813518688">
-    <w:abstractNumId w:val="3"/>
-  </w:num>
-  <w:num w:numId="7" w16cid:durableId="369840006">
-    <w:abstractNumId w:val="5"/>
+  <w:num w:numId="21" w16cid:durableId="1166625749">
+    <w:abstractNumId w:val="19"/>
   </w:num>
 </w:numbering>
 </file>
@@ -2862,6 +5523,50 @@
       <w:u w:val="single"/>
     </w:rPr>
   </w:style>
+  <w:style w:type="paragraph" w:styleId="Header">
+    <w:name w:val="header"/>
+    <w:basedOn w:val="Normal"/>
+    <w:link w:val="HeaderChar"/>
+    <w:uiPriority w:val="99"/>
+    <w:unhideWhenUsed/>
+    <w:rsid w:val="00666E1A"/>
+    <w:pPr>
+      <w:tabs>
+        <w:tab w:val="center" w:pos="4513"/>
+        <w:tab w:val="right" w:pos="9026"/>
+      </w:tabs>
+      <w:spacing w:after="0" w:line="240" w:lineRule="auto"/>
+    </w:pPr>
+  </w:style>
+  <w:style w:type="character" w:customStyle="1" w:styleId="HeaderChar">
+    <w:name w:val="Header Char"/>
+    <w:basedOn w:val="DefaultParagraphFont"/>
+    <w:link w:val="Header"/>
+    <w:uiPriority w:val="99"/>
+    <w:rsid w:val="00666E1A"/>
+  </w:style>
+  <w:style w:type="paragraph" w:styleId="Footer">
+    <w:name w:val="footer"/>
+    <w:basedOn w:val="Normal"/>
+    <w:link w:val="FooterChar"/>
+    <w:uiPriority w:val="99"/>
+    <w:unhideWhenUsed/>
+    <w:rsid w:val="00666E1A"/>
+    <w:pPr>
+      <w:tabs>
+        <w:tab w:val="center" w:pos="4513"/>
+        <w:tab w:val="right" w:pos="9026"/>
+      </w:tabs>
+      <w:spacing w:after="0" w:line="240" w:lineRule="auto"/>
+    </w:pPr>
+  </w:style>
+  <w:style w:type="character" w:customStyle="1" w:styleId="FooterChar">
+    <w:name w:val="Footer Char"/>
+    <w:basedOn w:val="DefaultParagraphFont"/>
+    <w:link w:val="Footer"/>
+    <w:uiPriority w:val="99"/>
+    <w:rsid w:val="00666E1A"/>
+  </w:style>
 </w:styles>
 </file>
 
@@ -3158,4 +5863,16 @@
     </a:ext>
   </a:extLst>
 </a:theme>
+</file>
+
+<file path=customXml/item1.xml><?xml version="1.0" encoding="utf-8"?>
+<b:Sources xmlns:b="http://schemas.openxmlformats.org/officeDocument/2006/bibliography" xmlns="http://schemas.openxmlformats.org/officeDocument/2006/bibliography" SelectedStyle="\APASixthEditionOfficeOnline.xsl" StyleName="APA" Version="6"/>
+</file>
+
+<file path=customXml/itemProps1.xml><?xml version="1.0" encoding="utf-8"?>
+<ds:datastoreItem xmlns:ds="http://schemas.openxmlformats.org/officeDocument/2006/customXml" ds:itemID="{F96EECD9-87BD-4B21-B896-1BE24DB9A816}">
+  <ds:schemaRefs>
+    <ds:schemaRef ds:uri="http://schemas.openxmlformats.org/officeDocument/2006/bibliography"/>
+  </ds:schemaRefs>
+</ds:datastoreItem>
 </file>
</xml_diff>